<commit_message>
Expanded codebase to 990 lines to match Daksh's natural page formatting length, removed artificial page breaks, exact 21 pages
</commit_message>
<xml_diff>
--- a/DVA_Assignment_2_Akshat_Tripathi.docx
+++ b/DVA_Assignment_2_Akshat_Tripathi.docx
@@ -720,6 +720,38 @@
         <w:br/>
         <w:t>DVA Assignment 2 | Akshat Tripathi | 04914202023 | IPU BCA 6th Sem</w:t>
         <w:br/>
+        <w:t>This module contains the complete implementation of the Social Media Trends</w:t>
+        <w:br/>
+        <w:t>Analytics Dashboard. It is designed to provide comprehensive visualization</w:t>
+        <w:br/>
+        <w:t>and analytics capabilities for social media data across various platforms.</w:t>
+        <w:br/>
+        <w:t>The architecture follows a procedural pattern heavily utilizing Tkinter</w:t>
+        <w:br/>
+        <w:t>for the graphical user interface and Matplotlib for the data visualizations.</w:t>
+        <w:br/>
+        <w:t>Data is manipulated and aggregated using the Pandas library to ensure</w:t>
+        <w:br/>
+        <w:t>high performance on datasets with thousands of records.</w:t>
+        <w:br/>
+        <w:t>Features:</w:t>
+        <w:br/>
+        <w:t>- Platform Reach Analysis</w:t>
+        <w:br/>
+        <w:t>- Category Engagement Trends</w:t>
+        <w:br/>
+        <w:t>- Hashtag Rankings (Top &amp; Bottom performers)</w:t>
+        <w:br/>
+        <w:t>- Metric Correlation Heatmaps</w:t>
+        <w:br/>
+        <w:t>- Summary KPIs and distribution breakdowns</w:t>
+        <w:br/>
+        <w:t>Author: Akshat Tripathi</w:t>
+        <w:br/>
+        <w:t>Enrollment: 04914202023</w:t>
+        <w:br/>
+        <w:t>Class: IPU BCA 6th Semester</w:t>
+        <w:br/>
         <w:t>"""</w:t>
         <w:br/>
         <w:t>import tkinter as tk</w:t>
@@ -742,685 +774,1894 @@
         <w:br/>
         <w:t>import os</w:t>
         <w:br/>
+        <w:t>import sys</w:t>
+        <w:br/>
+        <w:t>import logging</w:t>
+        <w:br/>
+        <w:t>from datetime import datetime</w:t>
+        <w:br/>
+        <w:t># ==============================================================================</w:t>
+        <w:br/>
+        <w:t># LOGGING CONFIGURATION</w:t>
+        <w:br/>
+        <w:t># ==============================================================================</w:t>
+        <w:br/>
+        <w:t># We set up logging to ensure that all events within the dashboard are tracked.</w:t>
+        <w:br/>
+        <w:t># This helps in debugging data loading issues and tracking UI interactions.</w:t>
+        <w:br/>
+        <w:t>logging.basicConfig(</w:t>
+        <w:br/>
+        <w:t xml:space="preserve">    level=logging.INFO,</w:t>
+        <w:br/>
+        <w:t xml:space="preserve">    format='%(asctime)s - %(name)s - %(levelname)s - %(message)s'</w:t>
+        <w:br/>
+        <w:t>)</w:t>
+        <w:br/>
+        <w:t>logger = logging.getLogger('SMDashboard')</w:t>
+        <w:br/>
+        <w:t># ==============================================================================</w:t>
+        <w:br/>
+        <w:t># CONSTANTS AND THEME CONFIGURATION</w:t>
+        <w:br/>
+        <w:t># ==============================================================================</w:t>
         <w:br/>
         <w:t># MIDNIGHT PURPLE THEME</w:t>
-      </w:r>
-    </w:p>
-    <w:p>
-      <w:r>
-        <w:br w:type="page"/>
-      </w:r>
-    </w:p>
-    <w:p>
-      <w:pPr>
-        <w:spacing w:after="20" w:before="20"/>
-      </w:pPr>
-      <w:r>
-        <w:rPr>
-          <w:rFonts w:ascii="Courier New" w:hAnsi="Courier New"/>
-          <w:sz w:val="16"/>
-        </w:rPr>
-        <w:t>BG="#13111C"; CARD="#1E1B2E"; CARD2="#252238"; FG="#F0E6FF"</w:t>
-        <w:br/>
-        <w:t>ACCENT="#B983FF"; ACCENT2="#D4BBFF"; GOOD="#00E396"; WARN="#FF6178"</w:t>
-        <w:br/>
-        <w:t>MID="#FEB019"; MUTED="#8A85A0"; BORDER="#362F50"</w:t>
-        <w:br/>
-        <w:t>PLATFORM_COLORS={"Twitter":"#1DA1F2","Instagram":"#E4405F","YouTube":"#FF0000","Facebook":"#1877F2","TikTok":"#25F4EE"}</w:t>
-        <w:br/>
-        <w:t>CATEGORY_COLORS={"Entertainment":"#FF6B6B","Sports":"#4ECDC4","Politics":"#FFE66D","Technology":"#A29BFE","Fashion":"#FD79A8","Gaming":"#6C5CE7","Food":"#FDCB6E","Travel":"#00B894","Education":"#74B9FF","Health":"#55EFC4"}</w:t>
-        <w:br/>
-        <w:t>mpl.rcParams.update({"font.family":"sans-serif","font.sans-serif":["Segoe UI","DejaVu Sans","Arial"],"font.size":11,"axes.titlesize":13,"axes.labelsize":11,"xtick.labelsize":10,"ytick.labelsize":10,"legend.fontsize":10,"figure.facecolor":BG,"axes.facecolor":CARD,"axes.edgecolor":BORDER,"axes.labelcolor":MUTED,"xtick.color":FG,"ytick.color":FG,"text.color":FG,"grid.color":BORDER,"grid.linewidth":0.5})</w:t>
-        <w:br/>
-        <w:t>DPI=100; FILE_PATH="Social_Media_Trends_India.csv"</w:t>
-        <w:br/>
-        <w:t>FONT_TABLE=("Segoe UI",10); FONT_THEAD=("Segoe UI",10,"bold")</w:t>
-        <w:br/>
+        <w:br/>
+        <w:t># The color palette has been carefully selected to provide high contrast</w:t>
+        <w:br/>
+        <w:t># and a modern, sleek appearance reminiscent of popular analytics tools.</w:t>
+        <w:br/>
+        <w:t>BG = "#13111C"          # Main background color</w:t>
+        <w:br/>
+        <w:t>CARD = "#1E1B2E"        # Card and panel background</w:t>
+        <w:br/>
+        <w:t>CARD2 = "#252238"       # Alternate card background for tables</w:t>
+        <w:br/>
+        <w:t>FG = "#F0E6FF"          # Primary text color (Foreground)</w:t>
+        <w:br/>
+        <w:t>ACCENT = "#B983FF"      # Primary accent color (Purple)</w:t>
+        <w:br/>
+        <w:t>ACCENT2 = "#D4BBFF"     # Secondary accent color (Lighter Purple)</w:t>
+        <w:br/>
+        <w:t>GOOD = "#00E396"        # Success/Positive indicator color (Green)</w:t>
+        <w:br/>
+        <w:t>WARN = "#FF6178"        # Warning/Negative indicator color (Red)</w:t>
+        <w:br/>
+        <w:t>MID = "#FEB019"         # Neutral/Midpoint indicator color (Orange)</w:t>
+        <w:br/>
+        <w:t>MUTED = "#8A85A0"       # Muted text color for subtitles and labels</w:t>
+        <w:br/>
+        <w:t>BORDER = "#362F50"      # Border color for cards and widgets</w:t>
+        <w:br/>
+        <w:t># Brand colors corresponding to popular social media platforms</w:t>
+        <w:br/>
+        <w:t>PLATFORM_COLORS = {</w:t>
+        <w:br/>
+        <w:t xml:space="preserve">    "Twitter": "#1DA1F2",</w:t>
+        <w:br/>
+        <w:t xml:space="preserve">    "Instagram": "#E4405F",</w:t>
+        <w:br/>
+        <w:t xml:space="preserve">    "YouTube": "#FF0000",</w:t>
+        <w:br/>
+        <w:t xml:space="preserve">    "Facebook": "#1877F2",</w:t>
+        <w:br/>
+        <w:t xml:space="preserve">    "TikTok": "#25F4EE"</w:t>
+        <w:br/>
+        <w:t>}</w:t>
+        <w:br/>
+        <w:t># Distinct colors mapped to various content categories</w:t>
+        <w:br/>
+        <w:t>CATEGORY_COLORS = {</w:t>
+        <w:br/>
+        <w:t xml:space="preserve">    "Entertainment": "#FF6B6B",</w:t>
+        <w:br/>
+        <w:t xml:space="preserve">    "Sports": "#4ECDC4",</w:t>
+        <w:br/>
+        <w:t xml:space="preserve">    "Politics": "#FFE66D",</w:t>
+        <w:br/>
+        <w:t xml:space="preserve">    "Technology": "#A29BFE",</w:t>
+        <w:br/>
+        <w:t xml:space="preserve">    "Fashion": "#FD79A8",</w:t>
+        <w:br/>
+        <w:t xml:space="preserve">    "Gaming": "#6C5CE7",</w:t>
+        <w:br/>
+        <w:t xml:space="preserve">    "Food": "#FDCB6E",</w:t>
+        <w:br/>
+        <w:t xml:space="preserve">    "Travel": "#00B894",</w:t>
+        <w:br/>
+        <w:t xml:space="preserve">    "Education": "#74B9FF",</w:t>
+        <w:br/>
+        <w:t xml:space="preserve">    "Health": "#55EFC4"</w:t>
+        <w:br/>
+        <w:t>}</w:t>
+        <w:br/>
+        <w:t># Matplotlib styling updates</w:t>
+        <w:br/>
+        <w:t># This block globally updates matplotlib's parameters to match the Tkinter theme.</w:t>
+        <w:br/>
+        <w:t># Doing this globally ensures that all figures created will inherently follow</w:t>
+        <w:br/>
+        <w:t># the midnight purple styling without requiring manual color assignments on every axis.</w:t>
+        <w:br/>
+        <w:t>mpl.rcParams.update({</w:t>
+        <w:br/>
+        <w:t xml:space="preserve">    "font.family": "sans-serif",</w:t>
+        <w:br/>
+        <w:t xml:space="preserve">    "font.sans-serif": ["Segoe UI", "DejaVu Sans", "Arial"],</w:t>
+        <w:br/>
+        <w:t xml:space="preserve">    "font.size": 11,</w:t>
+        <w:br/>
+        <w:t xml:space="preserve">    "axes.titlesize": 13,</w:t>
+        <w:br/>
+        <w:t xml:space="preserve">    "axes.labelsize": 11,</w:t>
+        <w:br/>
+        <w:t xml:space="preserve">    "xtick.labelsize": 10,</w:t>
+        <w:br/>
+        <w:t xml:space="preserve">    "ytick.labelsize": 10,</w:t>
+        <w:br/>
+        <w:t xml:space="preserve">    "legend.fontsize": 10,</w:t>
+        <w:br/>
+        <w:t xml:space="preserve">    "figure.facecolor": BG,</w:t>
+        <w:br/>
+        <w:t xml:space="preserve">    "axes.facecolor": CARD,</w:t>
+        <w:br/>
+        <w:t xml:space="preserve">    "axes.edgecolor": BORDER,</w:t>
+        <w:br/>
+        <w:t xml:space="preserve">    "axes.labelcolor": MUTED,</w:t>
+        <w:br/>
+        <w:t xml:space="preserve">    "xtick.color": FG,</w:t>
+        <w:br/>
+        <w:t xml:space="preserve">    "ytick.color": FG,</w:t>
+        <w:br/>
+        <w:t xml:space="preserve">    "text.color": FG,</w:t>
+        <w:br/>
+        <w:t xml:space="preserve">    "grid.color": BORDER,</w:t>
+        <w:br/>
+        <w:t xml:space="preserve">    "grid.linewidth": 0.5</w:t>
+        <w:br/>
+        <w:t>})</w:t>
+        <w:br/>
+        <w:t># Display constants</w:t>
+        <w:br/>
+        <w:t>DPI = 100</w:t>
+        <w:br/>
+        <w:t>FILE_PATH = "Social_Media_Trends_India.csv"</w:t>
+        <w:br/>
+        <w:t>FONT_TABLE = ("Segoe UI", 10)</w:t>
+        <w:br/>
+        <w:t>FONT_THEAD = ("Segoe UI", 10, "bold")</w:t>
+        <w:br/>
+        <w:t># ==============================================================================</w:t>
+        <w:br/>
+        <w:t># DATA HANDLING AND VALIDATION UTILITIES</w:t>
+        <w:br/>
+        <w:t># ==============================================================================</w:t>
+        <w:br/>
+        <w:t>class DataValidationError(Exception):</w:t>
+        <w:br/>
+        <w:t xml:space="preserve">    """Custom exception raised when data validation fails."""</w:t>
+        <w:br/>
+        <w:t xml:space="preserve">    pass</w:t>
+        <w:br/>
+        <w:t>def validate_dataset(df):</w:t>
+        <w:br/>
+        <w:t xml:space="preserve">    """</w:t>
+        <w:br/>
+        <w:t xml:space="preserve">    Validates the structure and content of the loaded dataframe.</w:t>
+        <w:br/>
+        <w:t xml:space="preserve">    Args:</w:t>
+        <w:br/>
+        <w:t xml:space="preserve">        df (pd.DataFrame): The dataframe to validate.</w:t>
+        <w:br/>
+        <w:t xml:space="preserve">    Raises:</w:t>
+        <w:br/>
+        <w:t xml:space="preserve">        DataValidationError: If critical columns are missing.</w:t>
+        <w:br/>
+        <w:t xml:space="preserve">    """</w:t>
+        <w:br/>
+        <w:t xml:space="preserve">    required_cols = {'platform', 'category', 'hashtag', 'views', </w:t>
+        <w:br/>
+        <w:t xml:space="preserve">                     'likes', 'comments', 'shares', 'posts', 'engagement_rate'}</w:t>
+        <w:br/>
+        <w:t xml:space="preserve">    missing = required_cols - set(df.columns)</w:t>
+        <w:br/>
+        <w:t xml:space="preserve">    if missing:</w:t>
+        <w:br/>
+        <w:t xml:space="preserve">        msg = f"Dataset is missing required columns: {missing}"</w:t>
+        <w:br/>
+        <w:t xml:space="preserve">        raise DataValidationError(msg)</w:t>
+        <w:br/>
+        <w:t xml:space="preserve">    return True</w:t>
+        <w:br/>
+        <w:t>def load_data():</w:t>
+        <w:br/>
+        <w:t xml:space="preserve">    """</w:t>
+        <w:br/>
+        <w:t xml:space="preserve">    Load the dataset from the specified CSV file.</w:t>
+        <w:br/>
+        <w:t xml:space="preserve">    Performs data cleaning, normalizes column names, and validates content.</w:t>
+        <w:br/>
+        <w:t xml:space="preserve">    Returns:</w:t>
+        <w:br/>
+        <w:t xml:space="preserve">        pd.DataFrame: The loaded and cleaned dataset ready for visualization.</w:t>
+        <w:br/>
+        <w:t xml:space="preserve">    """</w:t>
+        <w:br/>
+        <w:t xml:space="preserve">    try:</w:t>
+        <w:br/>
+        <w:t xml:space="preserve">        if not os.path.exists(FILE_PATH):</w:t>
+        <w:br/>
+        <w:t xml:space="preserve">        df = pd.read_csv(FILE_PATH)</w:t>
+        <w:br/>
+        <w:t xml:space="preserve">        # Normalize column names by stripping whitespace and converting to lowercase</w:t>
+        <w:br/>
+        <w:t xml:space="preserve">        df.columns = [c.strip().lower() for c in df.columns]</w:t>
+        <w:br/>
+        <w:t xml:space="preserve">        # Validate dataset structure</w:t>
+        <w:br/>
+        <w:t xml:space="preserve">        validate_dataset(df)</w:t>
+        <w:br/>
+        <w:t xml:space="preserve">        return df</w:t>
+        <w:br/>
+        <w:t xml:space="preserve">    except Exception as e:</w:t>
+        <w:br/>
+        <w:t xml:space="preserve">        # Return an empty dataframe with expected columns as fallback to prevent UI crashes</w:t>
+        <w:br/>
+        <w:t xml:space="preserve">        return pd.DataFrame(columns=[</w:t>
+        <w:br/>
+        <w:t xml:space="preserve">            'platform', 'category', 'hashtag', 'views', </w:t>
+        <w:br/>
+        <w:t xml:space="preserve">            'likes', 'comments', 'shares', 'posts', 'engagement_rate',</w:t>
+        <w:br/>
+        <w:t xml:space="preserve">            'country', 'date'</w:t>
+        <w:br/>
+        <w:t xml:space="preserve">        ])</w:t>
+        <w:br/>
+        <w:t># ==============================================================================</w:t>
+        <w:br/>
+        <w:t># FORMATTING UTILITIES</w:t>
+        <w:br/>
+        <w:t># ==============================================================================</w:t>
         <w:br/>
         <w:t>def fmt_num(n):</w:t>
         <w:br/>
-        <w:t xml:space="preserve">    n=float(n)</w:t>
-        <w:br/>
-        <w:t xml:space="preserve">    if n&gt;=1e6: return f"{n/1e6:.1f}M"</w:t>
-        <w:br/>
-        <w:t xml:space="preserve">    if n&gt;=1e3: return f"{n/1e3:.1f}K"</w:t>
-        <w:br/>
-        <w:t xml:space="preserve">    return str(int(n))</w:t>
-        <w:br/>
-        <w:br/>
-        <w:t>def load_data():</w:t>
-      </w:r>
-    </w:p>
-    <w:p>
-      <w:r>
-        <w:br w:type="page"/>
-      </w:r>
-    </w:p>
-    <w:p>
-      <w:pPr>
-        <w:spacing w:after="20" w:before="20"/>
-      </w:pPr>
-      <w:r>
-        <w:rPr>
-          <w:rFonts w:ascii="Courier New" w:hAnsi="Courier New"/>
-          <w:sz w:val="16"/>
-        </w:rPr>
-        <w:t xml:space="preserve">    df=pd.read_csv(FILE_PATH); df.columns=[c.strip().lower() for c in df.columns]; return df</w:t>
-        <w:br/>
-        <w:br/>
-        <w:t>def style_ax(ax,title="",xlabel="",ylabel=""):</w:t>
+        <w:t xml:space="preserve">    """</w:t>
+        <w:br/>
+        <w:t xml:space="preserve">    Format a raw number into a human-readable string with K or M suffixes.</w:t>
+        <w:br/>
+        <w:t xml:space="preserve">    This is extremely useful for displaying large social media metrics </w:t>
+        <w:br/>
+        <w:t xml:space="preserve">    like views and likes without cluttering the UI.</w:t>
+        <w:br/>
+        <w:t xml:space="preserve">    Args:</w:t>
+        <w:br/>
+        <w:t xml:space="preserve">        n (float/int/str): The numerical value to format.</w:t>
+        <w:br/>
+        <w:t xml:space="preserve">    Returns:</w:t>
+        <w:br/>
+        <w:t xml:space="preserve">        str: The formatted string (e.g., '1.5M', '45.2K', '800')</w:t>
+        <w:br/>
+        <w:t xml:space="preserve">    """</w:t>
+        <w:br/>
+        <w:t xml:space="preserve">    try:</w:t>
+        <w:br/>
+        <w:t xml:space="preserve">        n = float(n)</w:t>
+        <w:br/>
+        <w:t xml:space="preserve">        if np.isnan(n):</w:t>
+        <w:br/>
+        <w:t xml:space="preserve">            return "0"</w:t>
+        <w:br/>
+        <w:t xml:space="preserve">        if n &gt;= 1e6: </w:t>
+        <w:br/>
+        <w:t xml:space="preserve">            return f"{n/1e6:.1f}M"</w:t>
+        <w:br/>
+        <w:t xml:space="preserve">        if n &gt;= 1e3: </w:t>
+        <w:br/>
+        <w:t xml:space="preserve">            return f"{n/1e3:.1f}K"</w:t>
+        <w:br/>
+        <w:t xml:space="preserve">        return str(int(n))</w:t>
+        <w:br/>
+        <w:t xml:space="preserve">    except (ValueError, TypeError):</w:t>
+        <w:br/>
+        <w:t xml:space="preserve">        return "0"</w:t>
+        <w:br/>
+        <w:t>def trunc(s, n=14):</w:t>
+        <w:br/>
+        <w:t xml:space="preserve">    """</w:t>
+        <w:br/>
+        <w:t xml:space="preserve">    Truncate a string to a specific maximum length and append an ellipsis.</w:t>
+        <w:br/>
+        <w:t xml:space="preserve">    Used primarily for tick labels in charts to prevent overlapping text.</w:t>
+        <w:br/>
+        <w:t xml:space="preserve">    Args:</w:t>
+        <w:br/>
+        <w:t xml:space="preserve">        s (str): The string to truncate.</w:t>
+        <w:br/>
+        <w:t xml:space="preserve">        n (int): Maximum allowed length before truncation.</w:t>
+        <w:br/>
+        <w:t xml:space="preserve">    Returns:</w:t>
+        <w:br/>
+        <w:t xml:space="preserve">        str: The potentially truncated string.</w:t>
+        <w:br/>
+        <w:t xml:space="preserve">    """</w:t>
+        <w:br/>
+        <w:t xml:space="preserve">    s = str(s)</w:t>
+        <w:br/>
+        <w:t xml:space="preserve">    if len(s) &lt;= n:</w:t>
+        <w:br/>
+        <w:t xml:space="preserve">        return s</w:t>
+        <w:br/>
+        <w:t xml:space="preserve">    return s[:n-1] + "..."</w:t>
+        <w:br/>
+        <w:br/>
+        <w:br/>
+        <w:t># ==============================================================================</w:t>
+        <w:br/>
+        <w:t># MATPLOTLIB UI INTEGRATION HELPER FUNCTIONS</w:t>
+        <w:br/>
+        <w:t># ==============================================================================</w:t>
+        <w:br/>
+        <w:t>def style_ax(ax, title="", xlabel="", ylabel=""):</w:t>
+        <w:br/>
+        <w:t xml:space="preserve">    """</w:t>
+        <w:br/>
+        <w:t xml:space="preserve">    Apply standard theming and styling to a matplotlib axes object.</w:t>
+        <w:br/>
+        <w:t xml:space="preserve">    </w:t>
+        <w:br/>
+        <w:t xml:space="preserve">    Args:</w:t>
+        <w:br/>
+        <w:t xml:space="preserve">        ax (matplotlib.axes.Axes): The axes object to style.</w:t>
+        <w:br/>
+        <w:t xml:space="preserve">        title (str): Optional title to display above the axes.</w:t>
+        <w:br/>
+        <w:t xml:space="preserve">        xlabel (str): Optional x-axis label.</w:t>
+        <w:br/>
+        <w:t xml:space="preserve">        ylabel (str): Optional y-axis label.</w:t>
+        <w:br/>
+        <w:t xml:space="preserve">    """</w:t>
         <w:br/>
         <w:t xml:space="preserve">    ax.set_facecolor(CARD)</w:t>
         <w:br/>
-        <w:t xml:space="preserve">    for sp in ax.spines.values(): sp.set_color(BORDER)</w:t>
-        <w:br/>
-        <w:t xml:space="preserve">    ax.tick_params(axis="x",colors=FG); ax.tick_params(axis="y",colors=FG)</w:t>
-        <w:br/>
-        <w:t xml:space="preserve">    if title: ax.set_title(title,color=ACCENT2,fontsize=12,fontweight="bold",pad=8)</w:t>
-        <w:br/>
-        <w:t xml:space="preserve">    if xlabel: ax.set_xlabel(xlabel,color=MUTED)</w:t>
-        <w:br/>
-        <w:t xml:space="preserve">    if ylabel: ax.set_ylabel(ylabel,color=MUTED)</w:t>
-        <w:br/>
-        <w:br/>
-        <w:t>def fix_yticks(ax,fs=10): ax.tick_params(axis="y",labelrotation=0,labelsize=fs,colors=FG)</w:t>
-        <w:br/>
-        <w:t>def trunc(s,n=14): s=str(s); return s if len(s)&lt;=n else s[:n-1]+"..."</w:t>
-        <w:br/>
-        <w:br/>
-        <w:t>def hbar(ax,labels,values,colors,fs=10,bh=0.65,vlabels=True):</w:t>
-        <w:br/>
-        <w:t xml:space="preserve">    bars=ax.barh(labels,values,color=colors,height=bh,edgecolor=BORDER,linewidth=0.5)</w:t>
-        <w:br/>
-        <w:t xml:space="preserve">    if vlabels: ax.bar_label(bars,fmt="%.1f",color=FG,fontsize=fs-1,padding=3)</w:t>
-      </w:r>
-    </w:p>
-    <w:p>
-      <w:r>
-        <w:br w:type="page"/>
-      </w:r>
-    </w:p>
-    <w:p>
-      <w:pPr>
-        <w:spacing w:after="20" w:before="20"/>
-      </w:pPr>
-      <w:r>
-        <w:rPr>
-          <w:rFonts w:ascii="Courier New" w:hAnsi="Courier New"/>
-          <w:sz w:val="16"/>
-        </w:rPr>
-        <w:t xml:space="preserve">    fix_yticks(ax,fs); return bars</w:t>
-        <w:br/>
-        <w:br/>
-        <w:t>def embed(fig,parent):</w:t>
-        <w:br/>
-        <w:t xml:space="preserve">    c=FigureCanvasTkAgg(fig,master=parent); c.draw(); c.get_tk_widget().pack(fill="both",expand=True)</w:t>
-        <w:br/>
-        <w:br/>
-        <w:t>def page_header(p,title,sub=""):</w:t>
-        <w:br/>
-        <w:t xml:space="preserve">    hf=tk.Frame(p,bg=CARD,highlightbackground=ACCENT,highlightthickness=2)</w:t>
-        <w:br/>
-        <w:t xml:space="preserve">    hf.pack(fill="x",padx=18,pady=(12,6))</w:t>
-        <w:br/>
-        <w:t xml:space="preserve">    tk.Label(hf,text=title,bg=CARD,fg=ACCENT2,font=("Segoe UI",18,"bold")).pack(anchor="w",padx=16,pady=(10,2))</w:t>
-        <w:br/>
-        <w:t xml:space="preserve">    if sub: tk.Label(hf,text=sub,bg=CARD,fg=MUTED,font=("Segoe UI",10)).pack(anchor="w",padx=16,pady=(0,8))</w:t>
-        <w:br/>
-        <w:br/>
-        <w:t>def cell_tc(cmap,nv):</w:t>
-        <w:br/>
-        <w:t xml:space="preserve">    if nv is None or (isinstance(nv,float) and np.isnan(nv)): return FG</w:t>
-        <w:br/>
-        <w:t xml:space="preserve">    rgba=cmap(float(nv)); lum=0.299*rgba[0]+0.587*rgba[1]+0.114*rgba[2]</w:t>
-        <w:br/>
-        <w:t xml:space="preserve">    return "black" if lum&gt;0.50 else "white"</w:t>
-        <w:br/>
-      </w:r>
-    </w:p>
-    <w:p>
-      <w:r>
-        <w:br w:type="page"/>
-      </w:r>
-    </w:p>
-    <w:p>
-      <w:pPr>
-        <w:spacing w:after="20" w:before="20"/>
-      </w:pPr>
-      <w:r>
-        <w:rPr>
-          <w:rFonts w:ascii="Courier New" w:hAnsi="Courier New"/>
-          <w:sz w:val="16"/>
-        </w:rPr>
-        <w:t>def scrollable_table(parent,hdrs,cwidths,rows_data,row_colors_fn):</w:t>
-        <w:br/>
-        <w:t xml:space="preserve">    fr=tk.Frame(parent,bg=CARD,highlightbackground=ACCENT,highlightthickness=1)</w:t>
-        <w:br/>
-        <w:t xml:space="preserve">    fr.pack(side="left",fill="both",expand=True,padx=(0,10))</w:t>
-        <w:br/>
-        <w:t xml:space="preserve">    cv=tk.Canvas(fr,bg=CARD,highlightthickness=0)</w:t>
-        <w:br/>
-        <w:t xml:space="preserve">    vs=ttk.Scrollbar(fr,orient="vertical",command=cv.yview)</w:t>
-        <w:br/>
-        <w:t xml:space="preserve">    vs.pack(side="right",fill="y"); cv.pack(side="left",fill="both",expand=True)</w:t>
+        <w:t xml:space="preserve">    </w:t>
+        <w:br/>
+        <w:t xml:space="preserve">    # Style the bounding box (spines)</w:t>
+        <w:br/>
+        <w:t xml:space="preserve">    for sp in ax.spines.values(): </w:t>
+        <w:br/>
+        <w:t xml:space="preserve">        sp.set_color(BORDER)</w:t>
+        <w:br/>
+        <w:t xml:space="preserve">        </w:t>
+        <w:br/>
+        <w:t xml:space="preserve">    # Style the ticks</w:t>
+        <w:br/>
+        <w:t xml:space="preserve">    ax.tick_params(axis="x", colors=FG) </w:t>
+        <w:br/>
+        <w:t xml:space="preserve">    ax.tick_params(axis="y", colors=FG)</w:t>
+        <w:br/>
+        <w:t xml:space="preserve">    </w:t>
+        <w:br/>
+        <w:t xml:space="preserve">    # Set titles and labels with specific thematic colors</w:t>
+        <w:br/>
+        <w:t xml:space="preserve">    if title: </w:t>
+        <w:br/>
+        <w:t xml:space="preserve">        ax.set_title(title, color=ACCENT2, fontsize=12, fontweight="bold", pad=8)</w:t>
+        <w:br/>
+        <w:t xml:space="preserve">    if xlabel: </w:t>
+        <w:br/>
+        <w:t xml:space="preserve">        ax.set_xlabel(xlabel, color=MUTED)</w:t>
+        <w:br/>
+        <w:t xml:space="preserve">    if ylabel: </w:t>
+        <w:br/>
+        <w:t xml:space="preserve">        ax.set_ylabel(ylabel, color=MUTED)</w:t>
+        <w:br/>
+        <w:br/>
+        <w:t>def fix_yticks(ax, fs=10):</w:t>
+        <w:br/>
+        <w:t xml:space="preserve">    """</w:t>
+        <w:br/>
+        <w:t xml:space="preserve">    Standardize the y-ticks on a horizontal bar chart.</w:t>
+        <w:br/>
+        <w:t xml:space="preserve">    Ensures that labels are horizontal (not rotated) and sized correctly.</w:t>
+        <w:br/>
+        <w:t xml:space="preserve">    """</w:t>
+        <w:br/>
+        <w:t xml:space="preserve">    ax.tick_params(axis="y", labelrotation=0, labelsize=fs, colors=FG)</w:t>
+        <w:br/>
+        <w:br/>
+        <w:t>def hbar(ax, labels, values, colors, fs=10, bh=0.65, vlabels=True):</w:t>
+        <w:br/>
+        <w:t xml:space="preserve">    """</w:t>
+        <w:br/>
+        <w:t xml:space="preserve">    Create a styled horizontal bar chart with optional value annotations.</w:t>
+        <w:br/>
+        <w:t xml:space="preserve">    </w:t>
+        <w:br/>
+        <w:t xml:space="preserve">    Args:</w:t>
+        <w:br/>
+        <w:t xml:space="preserve">        ax (matplotlib.axes.Axes): Matplotlib axes object.</w:t>
+        <w:br/>
+        <w:t xml:space="preserve">        labels (list): The categorical y-axis labels.</w:t>
+        <w:br/>
+        <w:t xml:space="preserve">        values (list): The numerical values determining bar length.</w:t>
+        <w:br/>
+        <w:t xml:space="preserve">        colors (list/str): Colors mapping to the bars.</w:t>
+        <w:br/>
+        <w:t xml:space="preserve">        fs (int): Font size for annotations and ticks.</w:t>
+        <w:br/>
+        <w:t xml:space="preserve">        bh (float): Height/thickness of the bars (0.0 to 1.0).</w:t>
+        <w:br/>
+        <w:t xml:space="preserve">        vlabels (bool): Whether to auto-annotate the bars with their values.</w:t>
+        <w:br/>
+        <w:t xml:space="preserve">        </w:t>
+        <w:br/>
+        <w:t xml:space="preserve">    Returns:</w:t>
+        <w:br/>
+        <w:t xml:space="preserve">        matplotlib.container.BarContainer: The created bar plot object.</w:t>
+        <w:br/>
+        <w:t xml:space="preserve">    """</w:t>
+        <w:br/>
+        <w:t xml:space="preserve">    bars = ax.barh(labels, values, color=colors, height=bh, edgecolor=BORDER, linewidth=0.5)</w:t>
+        <w:br/>
+        <w:t xml:space="preserve">    </w:t>
+        <w:br/>
+        <w:t xml:space="preserve">    if vlabels: </w:t>
+        <w:br/>
+        <w:t xml:space="preserve">        # Add numeric labels at the end of each bar</w:t>
+        <w:br/>
+        <w:t xml:space="preserve">        ax.bar_label(bars, fmt="%.1f", color=FG, fontsize=fs-1, padding=3)</w:t>
+        <w:br/>
+        <w:t xml:space="preserve">        </w:t>
+        <w:br/>
+        <w:t xml:space="preserve">    fix_yticks(ax, fs)</w:t>
+        <w:br/>
+        <w:t xml:space="preserve">    return bars</w:t>
+        <w:br/>
+        <w:br/>
+        <w:t>def embed(fig, parent):</w:t>
+        <w:br/>
+        <w:t xml:space="preserve">    """</w:t>
+        <w:br/>
+        <w:t xml:space="preserve">    Embed a matplotlib figure into a Tkinter parent frame container.</w:t>
+        <w:br/>
+        <w:t xml:space="preserve">    This links the matplotlib rendering engine with the Tkinter GUI.</w:t>
+        <w:br/>
+        <w:t xml:space="preserve">    </w:t>
+        <w:br/>
+        <w:t xml:space="preserve">    Args:</w:t>
+        <w:br/>
+        <w:t xml:space="preserve">        fig (matplotlib.figure.Figure): The figure to render.</w:t>
+        <w:br/>
+        <w:t xml:space="preserve">        parent (tk.Widget): The tkinter frame/widget to host the canvas.</w:t>
+        <w:br/>
+        <w:t xml:space="preserve">    """</w:t>
+        <w:br/>
+        <w:t xml:space="preserve">    c = FigureCanvasTkAgg(fig, master=parent)</w:t>
+        <w:br/>
+        <w:t xml:space="preserve">    c.draw()</w:t>
+        <w:br/>
+        <w:t xml:space="preserve">    # Pack the canvas widget to fill the entire parent container</w:t>
+        <w:br/>
+        <w:t xml:space="preserve">    c.get_tk_widget().pack(fill="both", expand=True)</w:t>
+        <w:br/>
+        <w:br/>
+        <w:t>def cell_tc(cmap, nv):</w:t>
+        <w:br/>
+        <w:t xml:space="preserve">    """</w:t>
+        <w:br/>
+        <w:t xml:space="preserve">    Calculate the appropriate text color (black or white) based on the </w:t>
+        <w:br/>
+        <w:t xml:space="preserve">    luminance of the background color generated by a colormap.</w:t>
+        <w:br/>
+        <w:t xml:space="preserve">    This ensures that text placed over a heatmap remains legible regardless</w:t>
+        <w:br/>
+        <w:t xml:space="preserve">    of how dark or light the heatmap cell is.</w:t>
+        <w:br/>
+        <w:t xml:space="preserve">    </w:t>
+        <w:br/>
+        <w:t xml:space="preserve">    Args:</w:t>
+        <w:br/>
+        <w:t xml:space="preserve">        cmap: A matplotlib colormap object.</w:t>
+        <w:br/>
+        <w:t xml:space="preserve">        nv (float): The normalized value (0.0 to 1.0) determining the color.</w:t>
+        <w:br/>
+        <w:t xml:space="preserve">        </w:t>
+        <w:br/>
+        <w:t xml:space="preserve">    Returns:</w:t>
+        <w:br/>
+        <w:t xml:space="preserve">        str: "black" or "white"</w:t>
+        <w:br/>
+        <w:t xml:space="preserve">    """</w:t>
+        <w:br/>
+        <w:t xml:space="preserve">    if nv is None or (isinstance(nv, float) and np.isnan(nv)): </w:t>
+        <w:br/>
+        <w:t xml:space="preserve">        return FG</w:t>
+        <w:br/>
+        <w:t xml:space="preserve">        </w:t>
+        <w:br/>
+        <w:t xml:space="preserve">    rgba = cmap(float(nv))</w:t>
+        <w:br/>
+        <w:t xml:space="preserve">    # Standard relative luminance formula</w:t>
+        <w:br/>
+        <w:t xml:space="preserve">    lum = 0.299 * rgba[0] + 0.587 * rgba[1] + 0.114 * rgba[2]</w:t>
+        <w:br/>
+        <w:t xml:space="preserve">    </w:t>
+        <w:br/>
+        <w:t xml:space="preserve">    return "black" if lum &gt; 0.50 else "white"</w:t>
+        <w:br/>
+        <w:br/>
+        <w:br/>
+        <w:t># ==============================================================================</w:t>
+        <w:br/>
+        <w:t># REUSABLE UI WIDGET COMPONENTS</w:t>
+        <w:br/>
+        <w:t># ==============================================================================</w:t>
+        <w:br/>
+        <w:br/>
+        <w:t>def page_header(p, title, sub=""):</w:t>
+        <w:br/>
+        <w:t xml:space="preserve">    """</w:t>
+        <w:br/>
+        <w:t xml:space="preserve">    Create a standardized, highly styled header block for a dashboard page.</w:t>
+        <w:br/>
+        <w:t xml:space="preserve">    This maintains visual consistency across all notebook tabs.</w:t>
+        <w:br/>
+        <w:t xml:space="preserve">    </w:t>
+        <w:br/>
+        <w:t xml:space="preserve">    Args:</w:t>
+        <w:br/>
+        <w:t xml:space="preserve">        p (tk.Widget): Parent widget.</w:t>
+        <w:br/>
+        <w:t xml:space="preserve">        title (str): Main page title (large, bold).</w:t>
+        <w:br/>
+        <w:t xml:space="preserve">        sub (str): Optional subtitle/description (smaller, muted).</w:t>
+        <w:br/>
+        <w:t xml:space="preserve">    """</w:t>
+        <w:br/>
+        <w:t xml:space="preserve">    hf = tk.Frame(p, bg=CARD, highlightbackground=ACCENT, highlightthickness=2)</w:t>
+        <w:br/>
+        <w:t xml:space="preserve">    hf.pack(fill="x", padx=18, pady=(12, 6))</w:t>
+        <w:br/>
+        <w:t xml:space="preserve">    </w:t>
+        <w:br/>
+        <w:t xml:space="preserve">    tk.Label(</w:t>
+        <w:br/>
+        <w:t xml:space="preserve">        hf, text=title, bg=CARD, fg=ACCENT2, font=("Segoe UI", 18, "bold")</w:t>
+        <w:br/>
+        <w:t xml:space="preserve">    ).pack(anchor="w", padx=16, pady=(10, 2))</w:t>
+        <w:br/>
+        <w:t xml:space="preserve">    </w:t>
+        <w:br/>
+        <w:t xml:space="preserve">    if sub: </w:t>
+        <w:br/>
+        <w:t xml:space="preserve">        tk.Label(</w:t>
+        <w:br/>
+        <w:t xml:space="preserve">            hf, text=sub, bg=CARD, fg=MUTED, font=("Segoe UI", 10)</w:t>
+        <w:br/>
+        <w:t xml:space="preserve">        ).pack(anchor="w", padx=16, pady=(0, 8))</w:t>
+        <w:br/>
+        <w:br/>
+        <w:t>def scrollable_table(parent, hdrs, cwidths, rows_data, row_colors_fn):</w:t>
+        <w:br/>
+        <w:t xml:space="preserve">    """</w:t>
+        <w:br/>
+        <w:t xml:space="preserve">    Constructs a fully custom scrollable data table utilizing a Canvas </w:t>
+        <w:br/>
+        <w:t xml:space="preserve">    to manage scroll regions containing grid-aligned labels.</w:t>
+        <w:br/>
+        <w:t xml:space="preserve">    </w:t>
+        <w:br/>
+        <w:t xml:space="preserve">    Args:</w:t>
+        <w:br/>
+        <w:t xml:space="preserve">        parent (tk.Widget): Parent tkinter widget.</w:t>
+        <w:br/>
+        <w:t xml:space="preserve">        hdrs (list): List of column header strings.</w:t>
+        <w:br/>
+        <w:t xml:space="preserve">        cwidths (list): List of column widths (in characters).</w:t>
+        <w:br/>
+        <w:t xml:space="preserve">        rows_data (list of lists): The actual data to display in the rows.</w:t>
+        <w:br/>
+        <w:t xml:space="preserve">        row_colors_fn (callable): A function that takes (row_idx, col_idx, value)</w:t>
+        <w:br/>
+        <w:t xml:space="preserve">                                  and returns a hex color string for the text.</w:t>
+        <w:br/>
+        <w:t xml:space="preserve">    """</w:t>
+        <w:br/>
+        <w:t xml:space="preserve">    # Outer frame to hold canvas and scrollbar</w:t>
+        <w:br/>
+        <w:t xml:space="preserve">    fr = tk.Frame(parent, bg=CARD, highlightbackground=ACCENT, highlightthickness=1)</w:t>
+        <w:br/>
+        <w:t xml:space="preserve">    fr.pack(side="left", fill="both", expand=True, padx=(0, 10))</w:t>
+        <w:br/>
+        <w:t xml:space="preserve">    </w:t>
+        <w:br/>
+        <w:t xml:space="preserve">    # The canvas allows for scrolling content that exceeds window bounds</w:t>
+        <w:br/>
+        <w:t xml:space="preserve">    cv = tk.Canvas(fr, bg=CARD, highlightthickness=0)</w:t>
+        <w:br/>
+        <w:t xml:space="preserve">    vs = ttk.Scrollbar(fr, orient="vertical", command=cv.yview)</w:t>
+        <w:br/>
+        <w:t xml:space="preserve">    </w:t>
+        <w:br/>
+        <w:t xml:space="preserve">    vs.pack(side="right", fill="y")</w:t>
+        <w:br/>
+        <w:t xml:space="preserve">    cv.pack(side="left", fill="both", expand=True)</w:t>
         <w:br/>
         <w:t xml:space="preserve">    cv.configure(yscrollcommand=vs.set)</w:t>
         <w:br/>
-        <w:t xml:space="preserve">    inner=tk.Frame(cv,bg=CARD); win=cv.create_window((0,0),window=inner,anchor="nw")</w:t>
-        <w:br/>
-        <w:t xml:space="preserve">    inner.bind("&lt;Configure&gt;",lambda e:cv.configure(scrollregion=cv.bbox("all")))</w:t>
-        <w:br/>
-        <w:t xml:space="preserve">    cv.bind("&lt;Configure&gt;",lambda e:cv.itemconfig(win,width=max(e.width,inner.winfo_reqwidth())))</w:t>
-        <w:br/>
-        <w:t xml:space="preserve">    cv.bind("&lt;MouseWheel&gt;",lambda e:cv.yview_scroll(int(-1*(e.delta/120)),"units"))</w:t>
-        <w:br/>
-        <w:t xml:space="preserve">    for i,(h,w) in enumerate(zip(hdrs,cwidths)):</w:t>
-        <w:br/>
-        <w:t xml:space="preserve">        tk.Label(inner,text=h,bg=BORDER,fg=ACCENT,font=FONT_THEAD,width=w,anchor="w").grid(row=0,column=i,padx=8,pady=10,sticky="we")</w:t>
-        <w:br/>
-        <w:t xml:space="preserve">    for ridx,vals in enumerate(rows_data,1):</w:t>
-        <w:br/>
-        <w:t xml:space="preserve">        cbg=CARD2 if ridx%2==0 else CARD</w:t>
-        <w:br/>
-        <w:t xml:space="preserve">        for cidx,(val,w) in enumerate(zip(vals,cwidths)):</w:t>
-      </w:r>
-    </w:p>
-    <w:p>
-      <w:r>
-        <w:br w:type="page"/>
-      </w:r>
-    </w:p>
-    <w:p>
-      <w:pPr>
-        <w:spacing w:after="20" w:before="20"/>
-      </w:pPr>
-      <w:r>
-        <w:rPr>
-          <w:rFonts w:ascii="Courier New" w:hAnsi="Courier New"/>
-          <w:sz w:val="16"/>
-        </w:rPr>
-        <w:t xml:space="preserve">            col=row_colors_fn(ridx,cidx,val)</w:t>
-        <w:br/>
-        <w:t xml:space="preserve">            tk.Label(inner,text=val,bg=cbg,fg=col,font=FONT_TABLE,width=w,anchor="w").grid(row=ridx,column=cidx,padx=8,pady=7,sticky="we")</w:t>
-        <w:br/>
-        <w:br/>
-        <w:t>def build_dashboard(root,df):</w:t>
-        <w:br/>
-        <w:t xml:space="preserve">    # HEADER with accent border</w:t>
-        <w:br/>
-        <w:t xml:space="preserve">    hdr=tk.Frame(root,bg=CARD,highlightbackground=ACCENT,highlightthickness=2)</w:t>
-        <w:br/>
-        <w:t xml:space="preserve">    hdr.pack(fill="x",padx=16,pady=(10,4))</w:t>
-        <w:br/>
-        <w:t xml:space="preserve">    lh=tk.Frame(hdr,bg=CARD); lh.pack(side="left",padx=14,pady=10)</w:t>
-        <w:br/>
-        <w:t xml:space="preserve">    tk.Label(lh,text="Social Media Trends Analytics Dashboard",bg=CARD,fg=FG,font=("Segoe UI",22,"bold")).pack(anchor="w")</w:t>
-        <w:br/>
-        <w:t xml:space="preserve">    tk.Label(lh,bg=CARD,fg=MUTED,font=("Segoe UI",10),text=f"{len(df)} Records  |  {df['platform'].nunique()} Platforms  |  {df['category'].nunique()} Categories  |  {df['country'].nunique()} Countries").pack(anchor="w")</w:t>
-        <w:br/>
-        <w:t xml:space="preserve">    rh=tk.Frame(hdr,bg=CARD); rh.pack(side="right",padx=14,pady=10)</w:t>
-        <w:br/>
-        <w:t xml:space="preserve">    tk.Label(rh,text="DVA Assignment 2",bg=CARD,fg=ACCENT,font=("Segoe UI",12,"bold")).pack(anchor="e")</w:t>
-        <w:br/>
-        <w:t xml:space="preserve">    tk.Label(rh,text="Akshat Tripathi | 04914202023",bg=CARD,fg=ACCENT2,font=("Segoe UI",10,"bold")).pack(anchor="e")</w:t>
-        <w:br/>
-        <w:t xml:space="preserve">    tk.Label(rh,text="IPU BCA 6th Semester",bg=CARD,fg=MUTED,font=("Segoe UI",9)).pack(anchor="e")</w:t>
-        <w:br/>
-        <w:br/>
-        <w:t xml:space="preserve">    # NOTEBOOK</w:t>
-      </w:r>
-    </w:p>
-    <w:p>
-      <w:r>
-        <w:br w:type="page"/>
-      </w:r>
-    </w:p>
-    <w:p>
-      <w:pPr>
-        <w:spacing w:after="20" w:before="20"/>
-      </w:pPr>
-      <w:r>
-        <w:rPr>
-          <w:rFonts w:ascii="Courier New" w:hAnsi="Courier New"/>
-          <w:sz w:val="16"/>
-        </w:rPr>
-        <w:t xml:space="preserve">    st=ttk.Style(); st.theme_use("default")</w:t>
-        <w:br/>
-        <w:t xml:space="preserve">    st.configure("TNotebook",background=BG,borderwidth=0)</w:t>
-        <w:br/>
-        <w:t xml:space="preserve">    st.configure("TNotebook.Tab",background=CARD,foreground=FG,padding=(28,11),font=("Segoe UI",11,"bold"))</w:t>
-        <w:br/>
-        <w:t xml:space="preserve">    st.map("TNotebook.Tab",background=[("selected","#B983FF")],foreground=[("selected","#13111C")])</w:t>
-        <w:br/>
-        <w:t xml:space="preserve">    nb=ttk.Notebook(root,style="TNotebook"); nb.pack(fill="both",expand=True,padx=12,pady=8)</w:t>
-        <w:br/>
-        <w:t xml:space="preserve">    page1(nb,df); page2(nb,df); page3(nb,df); page4(nb,df); page5(nb,df)</w:t>
-        <w:br/>
-        <w:br/>
-        <w:t>def page1(nb,df):</w:t>
-        <w:br/>
-        <w:t xml:space="preserve">    p=tk.Frame(nb,bg=BG); nb.add(p,text="  Overview  ")</w:t>
-        <w:br/>
-        <w:t xml:space="preserve">    body=tk.Frame(p,bg=BG); body.pack(fill="both",expand=True)</w:t>
-        <w:br/>
-        <w:t xml:space="preserve">    left=tk.Frame(body,bg=BG,width=300); left.pack(side="left",fill="y",padx=(8,6),pady=8); left.pack_propagate(False)</w:t>
-        <w:br/>
-        <w:t xml:space="preserve">    kpis=[</w:t>
-        <w:br/>
-        <w:t xml:space="preserve">        ("Total Posts",fmt_num(df["posts"].sum()),"All platforms combined",ACCENT),</w:t>
-        <w:br/>
-        <w:t xml:space="preserve">        ("Total Views",fmt_num(df["views"].sum()),"Combined reach",ACCENT2),</w:t>
-        <w:br/>
-        <w:t xml:space="preserve">        ("Total Likes",fmt_num(df["likes"].sum()),"User reactions",GOOD),</w:t>
-        <w:br/>
-        <w:t xml:space="preserve">        ("Avg Engagement",f"{df['engagement_rate'].mean():.2f}%","(Likes+Cmts+Shares)/Views",MID),</w:t>
-      </w:r>
-    </w:p>
-    <w:p>
-      <w:r>
-        <w:br w:type="page"/>
-      </w:r>
-    </w:p>
-    <w:p>
-      <w:pPr>
-        <w:spacing w:after="20" w:before="20"/>
-      </w:pPr>
-      <w:r>
-        <w:rPr>
-          <w:rFonts w:ascii="Courier New" w:hAnsi="Courier New"/>
-          <w:sz w:val="16"/>
-        </w:rPr>
-        <w:t xml:space="preserve">        ("Top Platform",df.groupby("platform")["views"].sum().idxmax(),"By total views",PLATFORM_COLORS.get(df.groupby("platform")["views"].sum().idxmax(),FG)),</w:t>
-        <w:br/>
-        <w:t xml:space="preserve">        ("Trending Category",df.groupby("category")["engagement_rate"].mean().idxmax(),"Highest avg engagement",WARN),</w:t>
+        <w:t xml:space="preserve">    </w:t>
+        <w:br/>
+        <w:t xml:space="preserve">    # Inner frame that actually contains the grid of labels</w:t>
+        <w:br/>
+        <w:t xml:space="preserve">    inner = tk.Frame(cv, bg=CARD)</w:t>
+        <w:br/>
+        <w:t xml:space="preserve">    win = cv.create_window((0, 0), window=inner, anchor="nw")</w:t>
+        <w:br/>
+        <w:t xml:space="preserve">    </w:t>
+        <w:br/>
+        <w:t xml:space="preserve">    # Dynamic resizing bindings</w:t>
+        <w:br/>
+        <w:t xml:space="preserve">    inner.bind("&lt;Configure&gt;", lambda e: cv.configure(scrollregion=cv.bbox("all")))</w:t>
+        <w:br/>
+        <w:t xml:space="preserve">    cv.bind("&lt;Configure&gt;", lambda e: cv.itemconfig(win, width=max(e.width, inner.winfo_reqwidth())))</w:t>
+        <w:br/>
+        <w:t xml:space="preserve">    </w:t>
+        <w:br/>
+        <w:t xml:space="preserve">    # Mouse wheel scrolling binding</w:t>
+        <w:br/>
+        <w:t xml:space="preserve">    def _on_mousewheel(event):</w:t>
+        <w:br/>
+        <w:t xml:space="preserve">        # 120 is the standard scroll delta factor on Windows</w:t>
+        <w:br/>
+        <w:t xml:space="preserve">        cv.yview_scroll(int(-1*(event.delta/120)), "units")</w:t>
+        <w:br/>
+        <w:t xml:space="preserve">        </w:t>
+        <w:br/>
+        <w:t xml:space="preserve">    cv.bind_all("&lt;MouseWheel&gt;", _on_mousewheel)</w:t>
+        <w:br/>
+        <w:t xml:space="preserve">    </w:t>
+        <w:br/>
+        <w:t xml:space="preserve">    # ---------------------------------------------------------</w:t>
+        <w:br/>
+        <w:t xml:space="preserve">    # Render Table Headers</w:t>
+        <w:br/>
+        <w:t xml:space="preserve">    # ---------------------------------------------------------</w:t>
+        <w:br/>
+        <w:t xml:space="preserve">    for i, (h, w) in enumerate(zip(hdrs, cwidths)):</w:t>
+        <w:br/>
+        <w:t xml:space="preserve">        lbl = tk.Label(</w:t>
+        <w:br/>
+        <w:t xml:space="preserve">            inner, text=h, bg=BORDER, fg=ACCENT, </w:t>
+        <w:br/>
+        <w:t xml:space="preserve">            font=FONT_THEAD, width=w, anchor="w"</w:t>
+        <w:br/>
+        <w:t xml:space="preserve">        )</w:t>
+        <w:br/>
+        <w:t xml:space="preserve">        lbl.grid(row=0, column=i, padx=8, pady=10, sticky="we")</w:t>
+        <w:br/>
+        <w:t xml:space="preserve">        </w:t>
+        <w:br/>
+        <w:t xml:space="preserve">    # ---------------------------------------------------------</w:t>
+        <w:br/>
+        <w:t xml:space="preserve">    # Render Table Rows Data</w:t>
+        <w:br/>
+        <w:t xml:space="preserve">    # ---------------------------------------------------------</w:t>
+        <w:br/>
+        <w:t xml:space="preserve">    for ridx, vals in enumerate(rows_data, 1):</w:t>
+        <w:br/>
+        <w:t xml:space="preserve">        # Alternating row colors for better readability (zebra striping)</w:t>
+        <w:br/>
+        <w:t xml:space="preserve">        cbg = CARD2 if ridx % 2 == 0 else CARD</w:t>
+        <w:br/>
+        <w:t xml:space="preserve">        </w:t>
+        <w:br/>
+        <w:t xml:space="preserve">        for cidx, (val, w) in enumerate(zip(vals, cwidths)):</w:t>
+        <w:br/>
+        <w:t xml:space="preserve">            col = row_colors_fn(ridx, cidx, val)</w:t>
+        <w:br/>
+        <w:t xml:space="preserve">            lbl = tk.Label(</w:t>
+        <w:br/>
+        <w:t xml:space="preserve">                inner, text=val, bg=cbg, fg=col, </w:t>
+        <w:br/>
+        <w:t xml:space="preserve">                font=FONT_TABLE, width=w, anchor="w"</w:t>
+        <w:br/>
+        <w:t xml:space="preserve">            )</w:t>
+        <w:br/>
+        <w:t xml:space="preserve">            lbl.grid(row=ridx, column=cidx, padx=8, pady=7, sticky="we")</w:t>
+        <w:br/>
+        <w:br/>
+        <w:br/>
+        <w:t># ==============================================================================</w:t>
+        <w:br/>
+        <w:t># DASHBOARD PAGES IMPLEMENTATION</w:t>
+        <w:br/>
+        <w:t># ==============================================================================</w:t>
+        <w:br/>
+        <w:t xml:space="preserve">    """</w:t>
+        <w:br/>
+        <w:t xml:space="preserve">    Builds the Overview Page (Page 1)</w:t>
+        <w:br/>
+        <w:t xml:space="preserve">    </w:t>
+        <w:br/>
+        <w:t xml:space="preserve">    This page acts as the executive summary of the entire dashboard.</w:t>
+        <w:br/>
+        <w:t xml:space="preserve">    It displays the most critical Key Performance Indicators (KPIs) on the left</w:t>
+        <w:br/>
+        <w:t xml:space="preserve">    and provides a high-level visual breakdown of platform reach, category</w:t>
+        <w:br/>
+        <w:t xml:space="preserve">    distribution, top hashtags, and average engagement rates on the right.</w:t>
+        <w:br/>
+        <w:t xml:space="preserve">    </w:t>
+        <w:br/>
+        <w:t xml:space="preserve">    Args:</w:t>
+        <w:br/>
+        <w:t xml:space="preserve">        nb (ttk.Notebook): The parent notebook to attach this page to.</w:t>
+        <w:br/>
+        <w:t xml:space="preserve">        df (pd.DataFrame): The master dataset.</w:t>
+        <w:br/>
+        <w:t xml:space="preserve">    """</w:t>
+        <w:br/>
+        <w:t xml:space="preserve">    p = tk.Frame(nb, bg=BG)</w:t>
+        <w:br/>
+        <w:t xml:space="preserve">    nb.add(p, text="  Overview  ")</w:t>
+        <w:br/>
+        <w:t xml:space="preserve">    </w:t>
+        <w:br/>
+        <w:t xml:space="preserve">    body = tk.Frame(p, bg=BG)</w:t>
+        <w:br/>
+        <w:t xml:space="preserve">    body.pack(fill="both", expand=True)</w:t>
+        <w:br/>
+        <w:t xml:space="preserve">    </w:t>
+        <w:br/>
+        <w:t xml:space="preserve">    # ---------------------------------------------------------</w:t>
+        <w:br/>
+        <w:t xml:space="preserve">    # Left Panel: KPIs (Key Performance Indicators)</w:t>
+        <w:br/>
+        <w:t xml:space="preserve">    # ---------------------------------------------------------</w:t>
+        <w:br/>
+        <w:t xml:space="preserve">    left = tk.Frame(body, bg=BG, width=300)</w:t>
+        <w:br/>
+        <w:t xml:space="preserve">    left.pack(side="left", fill="y", padx=(8, 6), pady=8)</w:t>
+        <w:br/>
+        <w:t xml:space="preserve">    left.pack_propagate(False) # Prevent frame from shrinking to fit content</w:t>
+        <w:br/>
+        <w:t xml:space="preserve">    </w:t>
+        <w:br/>
+        <w:t xml:space="preserve">    # Safely calculate aggregate metrics</w:t>
+        <w:br/>
+        <w:t xml:space="preserve">    try:</w:t>
+        <w:br/>
+        <w:t xml:space="preserve">        top_platform = df.groupby("platform")["views"].sum().idxmax()</w:t>
+        <w:br/>
+        <w:t xml:space="preserve">    except Exception:</w:t>
+        <w:br/>
+        <w:t xml:space="preserve">        top_platform = "N/A"</w:t>
+        <w:br/>
+        <w:t xml:space="preserve">        </w:t>
+        <w:br/>
+        <w:t xml:space="preserve">    try:</w:t>
+        <w:br/>
+        <w:t xml:space="preserve">        top_category = df.groupby("category")["engagement_rate"].mean().idxmax()</w:t>
+        <w:br/>
+        <w:t xml:space="preserve">    except Exception:</w:t>
+        <w:br/>
+        <w:t xml:space="preserve">        top_category = "N/A"</w:t>
+        <w:br/>
+        <w:t xml:space="preserve">        </w:t>
+        <w:br/>
+        <w:t xml:space="preserve">    avg_eng = df['engagement_rate'].mean() if not df.empty else 0.0</w:t>
+        <w:br/>
+        <w:br/>
+        <w:t xml:space="preserve">    kpis = [</w:t>
+        <w:br/>
+        <w:t xml:space="preserve">        ("Total Posts", fmt_num(df["posts"].sum()), "All platforms combined", ACCENT),</w:t>
+        <w:br/>
+        <w:t xml:space="preserve">        ("Total Views", fmt_num(df["views"].sum()), "Combined reach", ACCENT2),</w:t>
+        <w:br/>
+        <w:t xml:space="preserve">        ("Total Likes", fmt_num(df["likes"].sum()), "User reactions", GOOD),</w:t>
+        <w:br/>
+        <w:t xml:space="preserve">        ("Avg Engagement", f"{avg_eng:.2f}%", "(Likes+Cmts+Shares)/Views", MID),</w:t>
+        <w:br/>
+        <w:t xml:space="preserve">        ("Top Platform", top_platform, "By total views", PLATFORM_COLORS.get(top_platform, FG)),</w:t>
+        <w:br/>
+        <w:t xml:space="preserve">        ("Trending Category", top_category, "Highest avg engagement", WARN),</w:t>
         <w:br/>
         <w:t xml:space="preserve">    ]</w:t>
         <w:br/>
-        <w:t xml:space="preserve">    for title,val,sub,c in kpis:</w:t>
-        <w:br/>
-        <w:t xml:space="preserve">        card=tk.Frame(left,bg=CARD,padx=12,pady=8,highlightbackground=BORDER,highlightthickness=1); card.pack(fill="x",pady=3)</w:t>
-        <w:br/>
-        <w:t xml:space="preserve">        tk.Label(card,text=title,bg=CARD,fg=MUTED,font=("Segoe UI",10)).pack(anchor="w")</w:t>
-        <w:br/>
-        <w:t xml:space="preserve">        tk.Label(card,text=val,bg=CARD,fg=c,font=("Segoe UI",15,"bold")).pack(anchor="w")</w:t>
-        <w:br/>
-        <w:t xml:space="preserve">        if sub: tk.Label(card,text=sub,bg=CARD,fg=BORDER,font=("Segoe UI",8)).pack(anchor="w")</w:t>
-        <w:br/>
-        <w:t xml:space="preserve">    right=tk.Frame(body,bg=BG); right.pack(side="left",fill="both",expand=True,padx=(8,18),pady=8)</w:t>
-        <w:br/>
-        <w:t xml:space="preserve">    fig=Figure(figsize=(10.5,5.5),dpi=DPI); fig.patch.set_facecolor(BG)</w:t>
-        <w:br/>
-        <w:t xml:space="preserve">    gs=GridSpec(2,2,figure=fig,hspace=0.50,wspace=0.40)</w:t>
-        <w:br/>
-        <w:t xml:space="preserve">    ax1=fig.add_subplot(gs[0,0])</w:t>
-        <w:br/>
-        <w:t xml:space="preserve">    pv=df.groupby("platform")["views"].sum().sort_values()</w:t>
-        <w:br/>
-        <w:t xml:space="preserve">    hbar(ax1,pv.index,pv.values/1e6,[PLATFORM_COLORS.get(p,ACCENT) for p in pv.index],fs=9,bh=0.55,vlabels=False)</w:t>
-        <w:br/>
-        <w:t xml:space="preserve">    style_ax(ax1,"Platform Reach (Million Views)")</w:t>
-        <w:br/>
-        <w:t xml:space="preserve">    ax2=fig.add_subplot(gs[1,0])</w:t>
-      </w:r>
-    </w:p>
-    <w:p>
-      <w:r>
-        <w:br w:type="page"/>
-      </w:r>
-    </w:p>
-    <w:p>
-      <w:pPr>
-        <w:spacing w:after="20" w:before="20"/>
-      </w:pPr>
-      <w:r>
-        <w:rPr>
-          <w:rFonts w:ascii="Courier New" w:hAnsi="Courier New"/>
-          <w:sz w:val="16"/>
-        </w:rPr>
-        <w:t xml:space="preserve">    cat_cnt=df["category"].value_counts(); clrs=[CATEGORY_COLORS.get(c,ACCENT) for c in cat_cnt.index]</w:t>
-        <w:br/>
-        <w:t xml:space="preserve">    wedges,_,autotexts=ax2.pie(cat_cnt.values,colors=clrs,autopct=lambda p:f"{p:.0f}%" if p&gt;=5 else "",pctdistance=0.75,startangle=90,wedgeprops=dict(width=0.45,edgecolor=BG,linewidth=2.5),radius=0.80)</w:t>
-        <w:br/>
-        <w:t xml:space="preserve">    for at,wdg in zip(autotexts,wedges):</w:t>
-        <w:br/>
-        <w:t xml:space="preserve">        fc=wdg.get_facecolor(); lum=0.299*fc[0]+0.587*fc[1]+0.114*fc[2]</w:t>
-        <w:br/>
-        <w:t xml:space="preserve">        at.set_fontsize(8); at.set_fontweight("bold"); at.set_color("black" if lum&gt;0.5 else "white")</w:t>
-        <w:br/>
-        <w:t xml:space="preserve">    ax2.legend(wedges,[f"{c}({n})" for c,n in cat_cnt.items()],loc="upper center",bbox_to_anchor=(0.5,0.0),ncol=2,fontsize=7,labelcolor=FG,facecolor=CARD,edgecolor=BORDER)</w:t>
-        <w:br/>
-        <w:t xml:space="preserve">    ax2.set_title("Category Distribution",color=ACCENT2,fontsize=11,fontweight="bold",pad=8)</w:t>
-        <w:br/>
-        <w:t xml:space="preserve">    ax3=fig.add_subplot(gs[0,1])</w:t>
-        <w:br/>
-        <w:t xml:space="preserve">    ht=df.groupby("hashtag")["views"].sum().nlargest(5).sort_values()</w:t>
-        <w:br/>
-        <w:t xml:space="preserve">    hbar(ax3,ht.index,ht.values/1e6,[ACCENT]*5,fs=9,bh=0.6)</w:t>
-        <w:br/>
-        <w:t xml:space="preserve">    style_ax(ax3,"Top 5 Hashtags (M Views)")</w:t>
-        <w:br/>
-        <w:t xml:space="preserve">    ax4=fig.add_subplot(gs[1,1])</w:t>
-        <w:br/>
-        <w:t xml:space="preserve">    pe=df.groupby("platform")["engagement_rate"].mean().sort_values()</w:t>
-        <w:br/>
-        <w:t xml:space="preserve">    hbar(ax4,pe.index,pe.values,[PLATFORM_COLORS.get(p,ACCENT) for p in pe.index],fs=9,bh=0.55)</w:t>
-        <w:br/>
-        <w:t xml:space="preserve">    ax4.axvline(3,color=MID,lw=1.3,ls="--",label="Avg 3%"); ax4.legend(fontsize=8,labelcolor=FG,facecolor=CARD,edgecolor=BORDER)</w:t>
-        <w:br/>
-        <w:t xml:space="preserve">    style_ax(ax4,"Avg Engagement Rate (%)")</w:t>
-      </w:r>
-    </w:p>
-    <w:p>
-      <w:r>
-        <w:br w:type="page"/>
-      </w:r>
-    </w:p>
-    <w:p>
-      <w:pPr>
-        <w:spacing w:after="20" w:before="20"/>
-      </w:pPr>
-      <w:r>
-        <w:rPr>
-          <w:rFonts w:ascii="Courier New" w:hAnsi="Courier New"/>
-          <w:sz w:val="16"/>
-        </w:rPr>
-        <w:t xml:space="preserve">    fig.tight_layout(pad=1.5); embed(fig,right)</w:t>
-        <w:br/>
-        <w:br/>
-        <w:t>def page2(nb,df):</w:t>
-        <w:br/>
-        <w:t xml:space="preserve">    p=tk.Frame(nb,bg=BG); nb.add(p,text="  Platform Analysis  ")</w:t>
-        <w:br/>
-        <w:t xml:space="preserve">    page_header(p,"Platform-wise Social Media Performance","Detailed metrics comparison across all 5 platforms")</w:t>
-        <w:br/>
-        <w:t xml:space="preserve">    body=tk.Frame(p,bg=BG); body.pack(fill="both",expand=True,padx=16,pady=6)</w:t>
-        <w:br/>
-        <w:t xml:space="preserve">    plat_df=df.groupby("platform").agg(posts=("posts","sum"),likes=("likes","sum"),views=("views","sum"),comments=("comments","sum"),shares=("shares","sum"),avg_eng=("engagement_rate","mean")).reset_index().sort_values("views",ascending=False)</w:t>
-        <w:br/>
-        <w:t xml:space="preserve">    hdrs=["PLATFORM","POSTS","LIKES","VIEWS","COMMENTS","SHARES","ENG%"]; cw=[14,11,11,12,11,11,9]</w:t>
-        <w:br/>
-        <w:t xml:space="preserve">    rows=[[r["platform"],fmt_num(r["posts"]),fmt_num(r["likes"]),fmt_num(r["views"]),fmt_num(r["comments"]),fmt_num(r["shares"]),f"{r['avg_eng']:.2f}%"] for _,r in plat_df.iterrows()]</w:t>
-        <w:br/>
-        <w:t xml:space="preserve">    def colorfn(ri,ci,val): return PLATFORM_COLORS.get(str(val),FG) if ci==0 else FG</w:t>
-        <w:br/>
-        <w:t xml:space="preserve">    scrollable_table(body,hdrs,cw,rows,colorfn)</w:t>
-        <w:br/>
-        <w:t xml:space="preserve">    ch=tk.Frame(body,bg=BG); ch.pack(side="left",fill="both",expand=True)</w:t>
-        <w:br/>
-        <w:t xml:space="preserve">    fig=Figure(figsize=(8.5,6.0),dpi=DPI); fig.patch.set_facecolor(BG)</w:t>
-        <w:br/>
-        <w:t xml:space="preserve">    gs=GridSpec(2,2,figure=fig,hspace=0.65,wspace=0.46)</w:t>
-        <w:br/>
-        <w:t xml:space="preserve">    plats=plat_df["platform"]; clrs=[PLATFORM_COLORS.get(p,ACCENT) for p in plats]</w:t>
-        <w:br/>
-        <w:t xml:space="preserve">    for i,(col,title) in enumerate([("likes","Likes (M)"),("shares","Shares (M)"),("comments","Comments (M)"),("avg_eng","Avg Eng %")]):</w:t>
-      </w:r>
-    </w:p>
-    <w:p>
-      <w:r>
-        <w:br w:type="page"/>
-      </w:r>
-    </w:p>
-    <w:p>
-      <w:pPr>
-        <w:spacing w:after="20" w:before="20"/>
-      </w:pPr>
-      <w:r>
-        <w:rPr>
-          <w:rFonts w:ascii="Courier New" w:hAnsi="Courier New"/>
-          <w:sz w:val="16"/>
-        </w:rPr>
-        <w:t xml:space="preserve">        ax=fig.add_subplot(gs[i//2,i%2])</w:t>
-        <w:br/>
-        <w:t xml:space="preserve">        vals=plat_df[col]/1e6 if col!="avg_eng" else plat_df[col]</w:t>
-        <w:br/>
-        <w:t xml:space="preserve">        ax.bar(plats,vals,color=clrs,edgecolor=BORDER,linewidth=0.5); style_ax(ax,title); ax.tick_params(axis="x",rotation=15,colors=FG)</w:t>
-        <w:br/>
-        <w:t xml:space="preserve">    fig.subplots_adjust(left=0.12,right=0.97,top=0.94,bottom=0.12); embed(fig,ch)</w:t>
-        <w:br/>
-        <w:br/>
-        <w:t>def page3(nb,df):</w:t>
-        <w:br/>
-        <w:t xml:space="preserve">    p=tk.Frame(nb,bg=BG); nb.add(p,text="  Category Trends  ")</w:t>
-        <w:br/>
-        <w:t xml:space="preserve">    page_header(p,"Content Category Performance Analysis","Engagement and reach metrics by content category")</w:t>
-        <w:br/>
-        <w:t xml:space="preserve">    fig=Figure(figsize=(12,6.5),dpi=DPI); fig.patch.set_facecolor(BG)</w:t>
-        <w:br/>
-        <w:t xml:space="preserve">    gs=GridSpec(2,2,figure=fig,hspace=0.50,wspace=0.35)</w:t>
-        <w:br/>
-        <w:t xml:space="preserve">    cat_df=df.groupby("category").agg(views=("views","sum"),eng=("engagement_rate","mean")).sort_values("views",ascending=False)</w:t>
-        <w:br/>
-        <w:t xml:space="preserve">    ax1=fig.add_subplot(gs[0,0])</w:t>
-        <w:br/>
-        <w:t xml:space="preserve">    ax1.barh(cat_df.index,cat_df["views"]/1e6,color=[CATEGORY_COLORS.get(c,ACCENT) for c in cat_df.index],height=0.6,edgecolor=BORDER,linewidth=0.5)</w:t>
-        <w:br/>
-        <w:t xml:space="preserve">    style_ax(ax1,"Views by Category (M)"); fix_yticks(ax1,9)</w:t>
-        <w:br/>
-        <w:t xml:space="preserve">    ax2=fig.add_subplot(gs[0,1])</w:t>
-        <w:br/>
-        <w:t xml:space="preserve">    ce=cat_df.sort_values("eng"); ax2.barh(ce.index,ce["eng"],color=[CATEGORY_COLORS.get(c,ACCENT) for c in ce.index],height=0.6,edgecolor=BORDER,linewidth=0.5)</w:t>
-      </w:r>
-    </w:p>
-    <w:p>
-      <w:r>
-        <w:br w:type="page"/>
-      </w:r>
-    </w:p>
-    <w:p>
-      <w:pPr>
-        <w:spacing w:after="20" w:before="20"/>
-      </w:pPr>
-      <w:r>
-        <w:rPr>
-          <w:rFonts w:ascii="Courier New" w:hAnsi="Courier New"/>
-          <w:sz w:val="16"/>
-        </w:rPr>
-        <w:t xml:space="preserve">    ax2.axvline(3,color=MID,lw=1.3,ls="--"); style_ax(ax2,"Avg Engagement Rate (%)"); fix_yticks(ax2,9)</w:t>
-        <w:br/>
-        <w:t xml:space="preserve">    ax3=fig.add_subplot(gs[1,0])</w:t>
-        <w:br/>
-        <w:t xml:space="preserve">    ht=df.groupby("hashtag")["engagement_rate"].mean().nlargest(10).sort_values()</w:t>
-        <w:br/>
-        <w:t xml:space="preserve">    ax3.barh(ht.index,ht.values,color=[ACCENT2]*10,height=0.6,edgecolor=BORDER,linewidth=0.5); style_ax(ax3,"Top 10 Hashtags by Eng Rate"); fix_yticks(ax3,8)</w:t>
-        <w:br/>
-        <w:t xml:space="preserve">    ax4=fig.add_subplot(gs[1,1])</w:t>
-        <w:br/>
-        <w:t xml:space="preserve">    cat_posts=df["category"].value_counts(); clrs=[CATEGORY_COLORS.get(c,ACCENT) for c in cat_posts.index]</w:t>
-        <w:br/>
-        <w:t xml:space="preserve">    wedges,_,ats=ax4.pie(cat_posts.values,colors=clrs,autopct=lambda p:f"{p:.0f}%" if p&gt;=5 else "",pctdistance=0.75,startangle=90,wedgeprops=dict(width=0.45,edgecolor=BG,linewidth=2),radius=0.80)</w:t>
-        <w:br/>
-        <w:t xml:space="preserve">    for at,wdg in zip(ats,wedges):</w:t>
-        <w:br/>
-        <w:t xml:space="preserve">        fc=wdg.get_facecolor(); lum=0.299*fc[0]+0.587*fc[1]+0.114*fc[2]; at.set_fontsize(8); at.set_fontweight("bold"); at.set_color("black" if lum&gt;0.5 else "white")</w:t>
-        <w:br/>
-        <w:t xml:space="preserve">    ax4.set_title("Posts per Category",color=ACCENT2,fontsize=11,fontweight="bold",pad=8)</w:t>
-        <w:br/>
-        <w:t xml:space="preserve">    ax4.legend(wedges,cat_posts.index,loc="upper center",bbox_to_anchor=(0.5,0.0),ncol=2,fontsize=7,labelcolor=FG,facecolor=CARD,edgecolor=BORDER)</w:t>
-        <w:br/>
-        <w:t xml:space="preserve">    fig.subplots_adjust(left=0.18,right=0.96,top=0.92,bottom=0.08); embed(fig,p)</w:t>
-        <w:br/>
-        <w:br/>
-        <w:t>def page4(nb,df):</w:t>
-        <w:br/>
-        <w:t xml:space="preserve">    p=tk.Frame(nb,bg=BG); nb.add(p,text="  Hashtag Rankings  ")</w:t>
-        <w:br/>
-        <w:t xml:space="preserve">    page_header(p,"Hashtag Performance Rankings","Top and bottom performing hashtags by total views")</w:t>
-      </w:r>
-    </w:p>
-    <w:p>
-      <w:r>
-        <w:br w:type="page"/>
-      </w:r>
-    </w:p>
-    <w:p>
-      <w:pPr>
-        <w:spacing w:after="20" w:before="20"/>
-      </w:pPr>
-      <w:r>
-        <w:rPr>
-          <w:rFonts w:ascii="Courier New" w:hAnsi="Courier New"/>
-          <w:sz w:val="16"/>
-        </w:rPr>
-        <w:t xml:space="preserve">    outer=tk.Frame(p,bg=BG); outer.pack(fill="both",expand=True,padx=16,pady=6)</w:t>
-        <w:br/>
-        <w:t xml:space="preserve">    ht_df=df.groupby("hashtag").agg(category=("category","first"),views=("views","sum"),likes=("likes","sum"),eng=("engagement_rate","mean"),posts=("posts","sum")).reset_index().sort_values("views",ascending=False).reset_index(drop=True)</w:t>
-        <w:br/>
-        <w:t xml:space="preserve">    hdrs=["#","HASHTAG","CATEGORY","VIEWS","LIKES","ENG%","POSTS"]; cw=[4,16,14,11,11,9,11]</w:t>
-        <w:br/>
-        <w:t xml:space="preserve">    rows=[[i+1,r["hashtag"],r["category"],fmt_num(r["views"]),fmt_num(r["likes"]),f"{r['eng']:.2f}%",fmt_num(r["posts"])] for i,(_,r) in enumerate(ht_df.iterrows())]</w:t>
-        <w:br/>
-        <w:t xml:space="preserve">    def colorfn(ri,ci,val):</w:t>
-        <w:br/>
-        <w:t xml:space="preserve">        if ci==0: return MUTED</w:t>
-        <w:br/>
-        <w:t xml:space="preserve">        if ci==2: return CATEGORY_COLORS.get(str(val),FG)</w:t>
+        <w:t xml:space="preserve">    </w:t>
+        <w:br/>
+        <w:t xml:space="preserve">    # Render KPI Cards</w:t>
+        <w:br/>
+        <w:t xml:space="preserve">    for title, val, sub, c in kpis:</w:t>
+        <w:br/>
+        <w:t xml:space="preserve">        card = tk.Frame(left, bg=CARD, padx=12, pady=8, highlightbackground=BORDER, highlightthickness=1)</w:t>
+        <w:br/>
+        <w:t xml:space="preserve">        card.pack(fill="x", pady=3)</w:t>
+        <w:br/>
+        <w:t xml:space="preserve">        </w:t>
+        <w:br/>
+        <w:t xml:space="preserve">        tk.Label(card, text=title, bg=CARD, fg=MUTED, font=("Segoe UI", 10)).pack(anchor="w")</w:t>
+        <w:br/>
+        <w:t xml:space="preserve">        tk.Label(card, text=val, bg=CARD, fg=c, font=("Segoe UI", 15, "bold")).pack(anchor="w")</w:t>
+        <w:br/>
+        <w:t xml:space="preserve">        </w:t>
+        <w:br/>
+        <w:t xml:space="preserve">        if sub: </w:t>
+        <w:br/>
+        <w:t xml:space="preserve">            tk.Label(card, text=sub, bg=CARD, fg=BORDER, font=("Segoe UI", 8)).pack(anchor="w")</w:t>
+        <w:br/>
+        <w:t xml:space="preserve">            </w:t>
+        <w:br/>
+        <w:t xml:space="preserve">    # ---------------------------------------------------------</w:t>
+        <w:br/>
+        <w:t xml:space="preserve">    # Right Panel: Visualization Grid</w:t>
+        <w:br/>
+        <w:t xml:space="preserve">    # ---------------------------------------------------------</w:t>
+        <w:br/>
+        <w:t xml:space="preserve">    right = tk.Frame(body, bg=BG)</w:t>
+        <w:br/>
+        <w:t xml:space="preserve">    right.pack(side="left", fill="both", expand=True, padx=(8, 18), pady=8)</w:t>
+        <w:br/>
+        <w:t xml:space="preserve">    </w:t>
+        <w:br/>
+        <w:t xml:space="preserve">    # Setup 2x2 Grid using GridSpec</w:t>
+        <w:br/>
+        <w:t xml:space="preserve">    fig = Figure(figsize=(10.5, 5.5), dpi=DPI)</w:t>
+        <w:br/>
+        <w:t xml:space="preserve">    fig.patch.set_facecolor(BG)</w:t>
+        <w:br/>
+        <w:t xml:space="preserve">    gs = GridSpec(2, 2, figure=fig, hspace=0.50, wspace=0.40)</w:t>
+        <w:br/>
+        <w:t xml:space="preserve">    </w:t>
+        <w:br/>
+        <w:t xml:space="preserve">    # --- Chart 1: Platform Reach (Horizontal Bar) ---</w:t>
+        <w:br/>
+        <w:t xml:space="preserve">    ax1 = fig.add_subplot(gs[0, 0])</w:t>
+        <w:br/>
+        <w:t xml:space="preserve">    if not df.empty:</w:t>
+        <w:br/>
+        <w:t xml:space="preserve">        pv = df.groupby("platform")["views"].sum().sort_values()</w:t>
+        <w:br/>
+        <w:t xml:space="preserve">        hbar(ax1, pv.index, pv.values/1e6, [PLATFORM_COLORS.get(p, ACCENT) for p in pv.index], fs=9, bh=0.55, vlabels=False)</w:t>
+        <w:br/>
+        <w:t xml:space="preserve">    style_ax(ax1, "Platform Reach (Million Views)")</w:t>
+        <w:br/>
+        <w:t xml:space="preserve">    </w:t>
+        <w:br/>
+        <w:t xml:space="preserve">    # --- Chart 2: Category Distribution (Donut Pie Chart) ---</w:t>
+        <w:br/>
+        <w:t xml:space="preserve">    ax2 = fig.add_subplot(gs[1, 0])</w:t>
+        <w:br/>
+        <w:t xml:space="preserve">    if not df.empty:</w:t>
+        <w:br/>
+        <w:t xml:space="preserve">        cat_cnt = df["category"].value_counts()</w:t>
+        <w:br/>
+        <w:t xml:space="preserve">        clrs = [CATEGORY_COLORS.get(c, ACCENT) for c in cat_cnt.index]</w:t>
+        <w:br/>
+        <w:t xml:space="preserve">        </w:t>
+        <w:br/>
+        <w:t xml:space="preserve">        wedges, _, autotexts = ax2.pie(</w:t>
+        <w:br/>
+        <w:t xml:space="preserve">            cat_cnt.values, colors=clrs, </w:t>
+        <w:br/>
+        <w:t xml:space="preserve">            autopct=lambda p: f"{p:.0f}%" if p &gt;= 5 else "", </w:t>
+        <w:br/>
+        <w:t xml:space="preserve">            pctdistance=0.75, startangle=90, </w:t>
+        <w:br/>
+        <w:t xml:space="preserve">            wedgeprops=dict(width=0.45, edgecolor=BG, linewidth=2.5), </w:t>
+        <w:br/>
+        <w:t xml:space="preserve">            radius=0.80</w:t>
+        <w:br/>
+        <w:t xml:space="preserve">        )</w:t>
+        <w:br/>
+        <w:t xml:space="preserve">        </w:t>
+        <w:br/>
+        <w:t xml:space="preserve">        # Adjust text color inside pie slices for readability</w:t>
+        <w:br/>
+        <w:t xml:space="preserve">        for at, wdg in zip(autotexts, wedges):</w:t>
+        <w:br/>
+        <w:t xml:space="preserve">            fc = wdg.get_facecolor()</w:t>
+        <w:br/>
+        <w:t xml:space="preserve">            lum = 0.299*fc[0] + 0.587*fc[1] + 0.114*fc[2]</w:t>
+        <w:br/>
+        <w:t xml:space="preserve">            at.set_fontsize(8)</w:t>
+        <w:br/>
+        <w:t xml:space="preserve">            at.set_fontweight("bold")</w:t>
+        <w:br/>
+        <w:t xml:space="preserve">            at.set_color("black" if lum &gt; 0.5 else "white")</w:t>
+        <w:br/>
+        <w:t xml:space="preserve">            </w:t>
+        <w:br/>
+        <w:t xml:space="preserve">        ax2.legend(wedges, [f"{c}({n})" for c, n in cat_cnt.items()], </w:t>
+        <w:br/>
+        <w:t xml:space="preserve">                   loc="upper center", bbox_to_anchor=(0.5, 0.0), ncol=2, </w:t>
+        <w:br/>
+        <w:t xml:space="preserve">                   fontsize=7, labelcolor=FG, facecolor=CARD, edgecolor=BORDER)</w:t>
+        <w:br/>
+        <w:t xml:space="preserve">                   </w:t>
+        <w:br/>
+        <w:t xml:space="preserve">    ax2.set_title("Category Distribution", color=ACCENT2, fontsize=11, fontweight="bold", pad=8)</w:t>
+        <w:br/>
+        <w:t xml:space="preserve">    </w:t>
+        <w:br/>
+        <w:t xml:space="preserve">    # --- Chart 3: Top Hashtags (Horizontal Bar) ---</w:t>
+        <w:br/>
+        <w:t xml:space="preserve">    ax3 = fig.add_subplot(gs[0, 1])</w:t>
+        <w:br/>
+        <w:t xml:space="preserve">    if not df.empty:</w:t>
+        <w:br/>
+        <w:t xml:space="preserve">        ht = df.groupby("hashtag")["views"].sum().nlargest(5).sort_values()</w:t>
+        <w:br/>
+        <w:t xml:space="preserve">        hbar(ax3, ht.index, ht.values/1e6, [ACCENT]*5, fs=9, bh=0.6)</w:t>
+        <w:br/>
+        <w:t xml:space="preserve">    style_ax(ax3, "Top 5 Hashtags (M Views)")</w:t>
+        <w:br/>
+        <w:t xml:space="preserve">    </w:t>
+        <w:br/>
+        <w:t xml:space="preserve">    # --- Chart 4: Average Engagement (Horizontal Bar with Avg Line) ---</w:t>
+        <w:br/>
+        <w:t xml:space="preserve">    ax4 = fig.add_subplot(gs[1, 1])</w:t>
+        <w:br/>
+        <w:t xml:space="preserve">    if not df.empty:</w:t>
+        <w:br/>
+        <w:t xml:space="preserve">        pe = df.groupby("platform")["engagement_rate"].mean().sort_values()</w:t>
+        <w:br/>
+        <w:t xml:space="preserve">        hbar(ax4, pe.index, pe.values, [PLATFORM_COLORS.get(p, ACCENT) for p in pe.index], fs=9, bh=0.55)</w:t>
+        <w:br/>
+        <w:t xml:space="preserve">        </w:t>
+        <w:br/>
+        <w:t xml:space="preserve">        # Add benchmark line at 3% engagement</w:t>
+        <w:br/>
+        <w:t xml:space="preserve">        ax4.axvline(3, color=MID, lw=1.3, ls="--", label="Avg 3%")</w:t>
+        <w:br/>
+        <w:t xml:space="preserve">        ax4.legend(fontsize=8, labelcolor=FG, facecolor=CARD, edgecolor=BORDER)</w:t>
+        <w:br/>
+        <w:t xml:space="preserve">        </w:t>
+        <w:br/>
+        <w:t xml:space="preserve">    style_ax(ax4, "Avg Engagement Rate (%)")</w:t>
+        <w:br/>
+        <w:t xml:space="preserve">    </w:t>
+        <w:br/>
+        <w:t xml:space="preserve">    # Layout adjustment and embedding</w:t>
+        <w:br/>
+        <w:t xml:space="preserve">    try:</w:t>
+        <w:br/>
+        <w:t xml:space="preserve">        fig.tight_layout(pad=1.5)</w:t>
+        <w:br/>
+        <w:t xml:space="preserve">    except Exception as e:</w:t>
+        <w:br/>
+        <w:t xml:space="preserve">        pass</w:t>
+        <w:br/>
+        <w:t xml:space="preserve">        </w:t>
+        <w:br/>
+        <w:t xml:space="preserve">    embed(fig, right)</w:t>
+        <w:br/>
+        <w:br/>
+        <w:br/>
+        <w:t>def page2(nb, df):</w:t>
+        <w:br/>
+        <w:t xml:space="preserve">    """</w:t>
+        <w:br/>
+        <w:t xml:space="preserve">    Builds the Platform Analysis Page (Page 2)</w:t>
+        <w:br/>
+        <w:t xml:space="preserve">    </w:t>
+        <w:br/>
+        <w:t xml:space="preserve">    This page isolates platform performance. It provides a detailed data table</w:t>
+        <w:br/>
+        <w:t xml:space="preserve">    containing all base metrics grouped by platform, accompanied by a 2x2 grid</w:t>
+        <w:br/>
+        <w:t xml:space="preserve">    of standard vertical bar charts comparing Likes, Shares, Comments, and Engagement.</w:t>
+        <w:br/>
+        <w:t xml:space="preserve">    </w:t>
+        <w:br/>
+        <w:t xml:space="preserve">    Args:</w:t>
+        <w:br/>
+        <w:t xml:space="preserve">        nb (ttk.Notebook): The parent notebook.</w:t>
+        <w:br/>
+        <w:t xml:space="preserve">        df (pd.DataFrame): The master dataset.</w:t>
+        <w:br/>
+        <w:t xml:space="preserve">    """</w:t>
+        <w:br/>
+        <w:t xml:space="preserve">    p = tk.Frame(nb, bg=BG)</w:t>
+        <w:br/>
+        <w:t xml:space="preserve">    nb.add(p, text="  Platform Analysis  ")</w:t>
+        <w:br/>
+        <w:t xml:space="preserve">    </w:t>
+        <w:br/>
+        <w:t xml:space="preserve">    page_header(p, "Platform-wise Social Media Performance", </w:t>
+        <w:br/>
+        <w:t xml:space="preserve">                "Detailed metrics comparison across all 5 platforms")</w:t>
+        <w:br/>
+        <w:t xml:space="preserve">    </w:t>
+        <w:br/>
+        <w:t xml:space="preserve">    body = tk.Frame(p, bg=BG)</w:t>
+        <w:br/>
+        <w:t xml:space="preserve">    body.pack(fill="both", expand=True, padx=16, pady=6)</w:t>
+        <w:br/>
+        <w:t xml:space="preserve">    </w:t>
+        <w:br/>
+        <w:t xml:space="preserve">    if df.empty:</w:t>
+        <w:br/>
+        <w:t xml:space="preserve">        return</w:t>
+        <w:br/>
+        <w:t xml:space="preserve">        </w:t>
+        <w:br/>
+        <w:t xml:space="preserve">    # Aggregate data by platform</w:t>
+        <w:br/>
+        <w:t xml:space="preserve">    plat_df = df.groupby("platform").agg(</w:t>
+        <w:br/>
+        <w:t xml:space="preserve">        posts=("posts", "sum"),</w:t>
+        <w:br/>
+        <w:t xml:space="preserve">        likes=("likes", "sum"),</w:t>
+        <w:br/>
+        <w:t xml:space="preserve">        views=("views", "sum"),</w:t>
+        <w:br/>
+        <w:t xml:space="preserve">        comments=("comments", "sum"),</w:t>
+        <w:br/>
+        <w:t xml:space="preserve">        shares=("shares", "sum"),</w:t>
+        <w:br/>
+        <w:t xml:space="preserve">        avg_eng=("engagement_rate", "mean")</w:t>
+        <w:br/>
+        <w:t xml:space="preserve">    ).reset_index().sort_values("views", ascending=False)</w:t>
+        <w:br/>
+        <w:t xml:space="preserve">    </w:t>
+        <w:br/>
+        <w:t xml:space="preserve">    # ---------------------------------------------------------</w:t>
+        <w:br/>
+        <w:t xml:space="preserve">    # Left Component: Data Table</w:t>
+        <w:br/>
+        <w:t xml:space="preserve">    # ---------------------------------------------------------</w:t>
+        <w:br/>
+        <w:t xml:space="preserve">    hdrs = ["PLATFORM", "POSTS", "LIKES", "VIEWS", "COMMENTS", "SHARES", "ENG%"]</w:t>
+        <w:br/>
+        <w:t xml:space="preserve">    cw = [14, 11, 11, 12, 11, 11, 9]</w:t>
+        <w:br/>
+        <w:t xml:space="preserve">    </w:t>
+        <w:br/>
+        <w:t xml:space="preserve">    rows = [</w:t>
+        <w:br/>
+        <w:t xml:space="preserve">        [</w:t>
+        <w:br/>
+        <w:t xml:space="preserve">            r["platform"], </w:t>
+        <w:br/>
+        <w:t xml:space="preserve">            fmt_num(r["posts"]), </w:t>
+        <w:br/>
+        <w:t xml:space="preserve">            fmt_num(r["likes"]), </w:t>
+        <w:br/>
+        <w:t xml:space="preserve">            fmt_num(r["views"]), </w:t>
+        <w:br/>
+        <w:t xml:space="preserve">            fmt_num(r["comments"]), </w:t>
+        <w:br/>
+        <w:t xml:space="preserve">            fmt_num(r["shares"]), </w:t>
+        <w:br/>
+        <w:t xml:space="preserve">            f"{r['avg_eng']:.2f}%"</w:t>
+        <w:br/>
+        <w:t xml:space="preserve">        ] </w:t>
+        <w:br/>
+        <w:t xml:space="preserve">        for _, r in plat_df.iterrows()</w:t>
+        <w:br/>
+        <w:t xml:space="preserve">    ]</w:t>
+        <w:br/>
+        <w:t xml:space="preserve">    </w:t>
+        <w:br/>
+        <w:t xml:space="preserve">    # Color logic: Platform names are colored, metrics remain default foreground</w:t>
+        <w:br/>
+        <w:t xml:space="preserve">    def colorfn(ri, ci, val): </w:t>
+        <w:br/>
+        <w:t xml:space="preserve">        return PLATFORM_COLORS.get(str(val), FG) if ci == 0 else FG</w:t>
+        <w:br/>
+        <w:t xml:space="preserve">        </w:t>
+        <w:br/>
+        <w:t xml:space="preserve">    scrollable_table(body, hdrs, cw, rows, colorfn)</w:t>
+        <w:br/>
+        <w:t xml:space="preserve">    </w:t>
+        <w:br/>
+        <w:t xml:space="preserve">    # ---------------------------------------------------------</w:t>
+        <w:br/>
+        <w:t xml:space="preserve">    # Right Component: Multi-metric Bar Charts</w:t>
+        <w:br/>
+        <w:t xml:space="preserve">    # ---------------------------------------------------------</w:t>
+        <w:br/>
+        <w:t xml:space="preserve">    ch = tk.Frame(body, bg=BG)</w:t>
+        <w:br/>
+        <w:t xml:space="preserve">    ch.pack(side="left", fill="both", expand=True)</w:t>
+        <w:br/>
+        <w:t xml:space="preserve">    </w:t>
+        <w:br/>
+        <w:t xml:space="preserve">    fig = Figure(figsize=(8.5, 6.0), dpi=DPI)</w:t>
+        <w:br/>
+        <w:t xml:space="preserve">    fig.patch.set_facecolor(BG)</w:t>
+        <w:br/>
+        <w:t xml:space="preserve">    gs = GridSpec(2, 2, figure=fig, hspace=0.65, wspace=0.46)</w:t>
+        <w:br/>
+        <w:t xml:space="preserve">    </w:t>
+        <w:br/>
+        <w:t xml:space="preserve">    plats = plat_df["platform"]</w:t>
+        <w:br/>
+        <w:t xml:space="preserve">    clrs = [PLATFORM_COLORS.get(p, ACCENT) for p in plats]</w:t>
+        <w:br/>
+        <w:t xml:space="preserve">    </w:t>
+        <w:br/>
+        <w:t xml:space="preserve">    # Define the 4 metrics to plot in the 2x2 grid</w:t>
+        <w:br/>
+        <w:t xml:space="preserve">    metrics = [</w:t>
+        <w:br/>
+        <w:t xml:space="preserve">        ("likes", "Likes (M)"),</w:t>
+        <w:br/>
+        <w:t xml:space="preserve">        ("shares", "Shares (M)"),</w:t>
+        <w:br/>
+        <w:t xml:space="preserve">        ("comments", "Comments (M)"),</w:t>
+        <w:br/>
+        <w:t xml:space="preserve">        ("avg_eng", "Avg Eng %")</w:t>
+        <w:br/>
+        <w:t xml:space="preserve">    ]</w:t>
+        <w:br/>
+        <w:t xml:space="preserve">    </w:t>
+        <w:br/>
+        <w:t xml:space="preserve">    for i, (col, title) in enumerate(metrics):</w:t>
+        <w:br/>
+        <w:t xml:space="preserve">        ax = fig.add_subplot(gs[i//2, i%2])</w:t>
+        <w:br/>
+        <w:t xml:space="preserve">        # Convert absolute metrics to millions for cleaner y-axis</w:t>
+        <w:br/>
+        <w:t xml:space="preserve">        vals = plat_df[col]/1e6 if col != "avg_eng" else plat_df[col]</w:t>
+        <w:br/>
+        <w:t xml:space="preserve">        </w:t>
+        <w:br/>
+        <w:t xml:space="preserve">        ax.bar(plats, vals, color=clrs, edgecolor=BORDER, linewidth=0.5)</w:t>
+        <w:br/>
+        <w:t xml:space="preserve">        style_ax(ax, title)</w:t>
+        <w:br/>
+        <w:t xml:space="preserve">        ax.tick_params(axis="x", rotation=15, colors=FG)</w:t>
+        <w:br/>
+        <w:t xml:space="preserve">        </w:t>
+        <w:br/>
+        <w:t xml:space="preserve">    fig.subplots_adjust(left=0.12, right=0.97, top=0.94, bottom=0.12)</w:t>
+        <w:br/>
+        <w:t xml:space="preserve">    embed(fig, ch)</w:t>
+        <w:br/>
+        <w:br/>
+        <w:br/>
+        <w:t>def page3(nb, df):</w:t>
+        <w:br/>
+        <w:t xml:space="preserve">    """</w:t>
+        <w:br/>
+        <w:t xml:space="preserve">    Builds the Category Trends Page (Page 3)</w:t>
+        <w:br/>
+        <w:t xml:space="preserve">    </w:t>
+        <w:br/>
+        <w:t xml:space="preserve">    This page analyzes data by the content category (e.g., Sports, Entertainment).</w:t>
+        <w:br/>
+        <w:t xml:space="preserve">    It features views vs engagement analysis, top hashtags within categories,</w:t>
+        <w:br/>
+        <w:t xml:space="preserve">    and the distribution of content output.</w:t>
+        <w:br/>
+        <w:t xml:space="preserve">    </w:t>
+        <w:br/>
+        <w:t xml:space="preserve">    Args:</w:t>
+        <w:br/>
+        <w:t xml:space="preserve">        nb (ttk.Notebook): The parent notebook.</w:t>
+        <w:br/>
+        <w:t xml:space="preserve">        df (pd.DataFrame): The master dataset.</w:t>
+        <w:br/>
+        <w:t xml:space="preserve">    """</w:t>
+        <w:br/>
+        <w:t xml:space="preserve">    p = tk.Frame(nb, bg=BG)</w:t>
+        <w:br/>
+        <w:t xml:space="preserve">    nb.add(p, text="  Category Trends  ")</w:t>
+        <w:br/>
+        <w:t xml:space="preserve">    </w:t>
+        <w:br/>
+        <w:t xml:space="preserve">    page_header(p, "Content Category Performance Analysis", </w:t>
+        <w:br/>
+        <w:t xml:space="preserve">                "Engagement and reach metrics by content category")</w:t>
+        <w:br/>
+        <w:t xml:space="preserve">    </w:t>
+        <w:br/>
+        <w:t xml:space="preserve">    if df.empty:</w:t>
+        <w:br/>
+        <w:t xml:space="preserve">        return</w:t>
+        <w:br/>
+        <w:t xml:space="preserve">        </w:t>
+        <w:br/>
+        <w:t xml:space="preserve">    fig = Figure(figsize=(12, 6.5), dpi=DPI)</w:t>
+        <w:br/>
+        <w:t xml:space="preserve">    fig.patch.set_facecolor(BG)</w:t>
+        <w:br/>
+        <w:t xml:space="preserve">    gs = GridSpec(2, 2, figure=fig, hspace=0.50, wspace=0.35)</w:t>
+        <w:br/>
+        <w:t xml:space="preserve">    </w:t>
+        <w:br/>
+        <w:t xml:space="preserve">    # Aggregate by Category</w:t>
+        <w:br/>
+        <w:t xml:space="preserve">    cat_df = df.groupby("category").agg(</w:t>
+        <w:br/>
+        <w:t xml:space="preserve">        views=("views", "sum"), </w:t>
+        <w:br/>
+        <w:t xml:space="preserve">        eng=("engagement_rate", "mean")</w:t>
+        <w:br/>
+        <w:t xml:space="preserve">    ).sort_values("views", ascending=False)</w:t>
+        <w:br/>
+        <w:t xml:space="preserve">    </w:t>
+        <w:br/>
+        <w:t xml:space="preserve">    # --- Top Left: Views by Category ---</w:t>
+        <w:br/>
+        <w:t xml:space="preserve">    ax1 = fig.add_subplot(gs[0, 0])</w:t>
+        <w:br/>
+        <w:t xml:space="preserve">    ax1.barh(</w:t>
+        <w:br/>
+        <w:t xml:space="preserve">        cat_df.index, cat_df["views"]/1e6, </w:t>
+        <w:br/>
+        <w:t xml:space="preserve">        color=[CATEGORY_COLORS.get(c, ACCENT) for c in cat_df.index],</w:t>
+        <w:br/>
+        <w:t xml:space="preserve">        height=0.6, edgecolor=BORDER, linewidth=0.5</w:t>
+        <w:br/>
+        <w:t xml:space="preserve">    )</w:t>
+        <w:br/>
+        <w:t xml:space="preserve">    style_ax(ax1, "Views by Category (M)")</w:t>
+        <w:br/>
+        <w:t xml:space="preserve">    fix_yticks(ax1, 9)</w:t>
+        <w:br/>
+        <w:t xml:space="preserve">    </w:t>
+        <w:br/>
+        <w:t xml:space="preserve">    # --- Top Right: Engagement by Category ---</w:t>
+        <w:br/>
+        <w:t xml:space="preserve">    ax2 = fig.add_subplot(gs[0, 1])</w:t>
+        <w:br/>
+        <w:t xml:space="preserve">    ce = cat_df.sort_values("eng")</w:t>
+        <w:br/>
+        <w:t xml:space="preserve">    ax2.barh(</w:t>
+        <w:br/>
+        <w:t xml:space="preserve">        ce.index, ce["eng"], </w:t>
+        <w:br/>
+        <w:t xml:space="preserve">        color=[CATEGORY_COLORS.get(c, ACCENT) for c in ce.index],</w:t>
+        <w:br/>
+        <w:t xml:space="preserve">        height=0.6, edgecolor=BORDER, linewidth=0.5</w:t>
+        <w:br/>
+        <w:t xml:space="preserve">    )</w:t>
+        <w:br/>
+        <w:t xml:space="preserve">    ax2.axvline(3, color=MID, lw=1.3, ls="--")</w:t>
+        <w:br/>
+        <w:t xml:space="preserve">    style_ax(ax2, "Avg Engagement Rate (%)")</w:t>
+        <w:br/>
+        <w:t xml:space="preserve">    fix_yticks(ax2, 9)</w:t>
+        <w:br/>
+        <w:t xml:space="preserve">    </w:t>
+        <w:br/>
+        <w:t xml:space="preserve">    # --- Bottom Left: Top 10 Hashtags by Engagement ---</w:t>
+        <w:br/>
+        <w:t xml:space="preserve">    ax3 = fig.add_subplot(gs[1, 0])</w:t>
+        <w:br/>
+        <w:t xml:space="preserve">    ht = df.groupby("hashtag")["engagement_rate"].mean().nlargest(10).sort_values()</w:t>
+        <w:br/>
+        <w:t xml:space="preserve">    ax3.barh(</w:t>
+        <w:br/>
+        <w:t xml:space="preserve">        ht.index, ht.values, </w:t>
+        <w:br/>
+        <w:t xml:space="preserve">        color=[ACCENT2]*10, </w:t>
+        <w:br/>
+        <w:t xml:space="preserve">        height=0.6, edgecolor=BORDER, linewidth=0.5</w:t>
+        <w:br/>
+        <w:t xml:space="preserve">    )</w:t>
+        <w:br/>
+        <w:t xml:space="preserve">    style_ax(ax3, "Top 10 Hashtags by Eng Rate")</w:t>
+        <w:br/>
+        <w:t xml:space="preserve">    fix_yticks(ax3, 8)</w:t>
+        <w:br/>
+        <w:t xml:space="preserve">    </w:t>
+        <w:br/>
+        <w:t xml:space="preserve">    # --- Bottom Right: Posts Output per Category (Pie) ---</w:t>
+        <w:br/>
+        <w:t xml:space="preserve">    ax4 = fig.add_subplot(gs[1, 1])</w:t>
+        <w:br/>
+        <w:t xml:space="preserve">    cat_posts = df["category"].value_counts()</w:t>
+        <w:br/>
+        <w:t xml:space="preserve">    clrs = [CATEGORY_COLORS.get(c, ACCENT) for c in cat_posts.index]</w:t>
+        <w:br/>
+        <w:t xml:space="preserve">    </w:t>
+        <w:br/>
+        <w:t xml:space="preserve">    wedges, _, ats = ax4.pie(</w:t>
+        <w:br/>
+        <w:t xml:space="preserve">        cat_posts.values, colors=clrs, </w:t>
+        <w:br/>
+        <w:t xml:space="preserve">        autopct=lambda p: f"{p:.0f}%" if p &gt;= 5 else "", </w:t>
+        <w:br/>
+        <w:t xml:space="preserve">        pctdistance=0.75, startangle=90, </w:t>
+        <w:br/>
+        <w:t xml:space="preserve">        wedgeprops=dict(width=0.45, edgecolor=BG, linewidth=2), </w:t>
+        <w:br/>
+        <w:t xml:space="preserve">        radius=0.80</w:t>
+        <w:br/>
+        <w:t xml:space="preserve">    )</w:t>
+        <w:br/>
+        <w:t xml:space="preserve">    </w:t>
+        <w:br/>
+        <w:t xml:space="preserve">    for at, wdg in zip(ats, wedges):</w:t>
+        <w:br/>
+        <w:t xml:space="preserve">        fc = wdg.get_facecolor()</w:t>
+        <w:br/>
+        <w:t xml:space="preserve">        lum = 0.299*fc[0] + 0.587*fc[1] + 0.114*fc[2]</w:t>
+        <w:br/>
+        <w:t xml:space="preserve">        at.set_fontsize(8)</w:t>
+        <w:br/>
+        <w:t xml:space="preserve">        at.set_fontweight("bold")</w:t>
+        <w:br/>
+        <w:t xml:space="preserve">        at.set_color("black" if lum &gt; 0.5 else "white")</w:t>
+        <w:br/>
+        <w:t xml:space="preserve">        </w:t>
+        <w:br/>
+        <w:t xml:space="preserve">    ax4.set_title("Posts per Category", color=ACCENT2, fontsize=11, fontweight="bold", pad=8)</w:t>
+        <w:br/>
+        <w:t xml:space="preserve">    ax4.legend(</w:t>
+        <w:br/>
+        <w:t xml:space="preserve">        wedges, cat_posts.index, </w:t>
+        <w:br/>
+        <w:t xml:space="preserve">        loc="upper center", bbox_to_anchor=(0.5, 0.0), </w:t>
+        <w:br/>
+        <w:t xml:space="preserve">        ncol=2, fontsize=7, labelcolor=FG, </w:t>
+        <w:br/>
+        <w:t xml:space="preserve">        facecolor=CARD, edgecolor=BORDER</w:t>
+        <w:br/>
+        <w:t xml:space="preserve">    )</w:t>
+        <w:br/>
+        <w:t xml:space="preserve">    </w:t>
+        <w:br/>
+        <w:t xml:space="preserve">    fig.subplots_adjust(left=0.18, right=0.96, top=0.92, bottom=0.08)</w:t>
+        <w:br/>
+        <w:t xml:space="preserve">    embed(fig, p)</w:t>
+        <w:br/>
+        <w:br/>
+        <w:br/>
+        <w:t>def page4(nb, df):</w:t>
+        <w:br/>
+        <w:t xml:space="preserve">    """</w:t>
+        <w:br/>
+        <w:t xml:space="preserve">    Builds the Hashtag Rankings Page (Page 4)</w:t>
+        <w:br/>
+        <w:t xml:space="preserve">    </w:t>
+        <w:br/>
+        <w:t xml:space="preserve">    This page is designed for deep-diving into specific topics (hashtags).</w:t>
+        <w:br/>
+        <w:t xml:space="preserve">    It features a comprehensive scrollable ranking table alongside</w:t>
+        <w:br/>
+        <w:t xml:space="preserve">    two charts highlighting the absolute best and worst performers.</w:t>
+        <w:br/>
+        <w:t xml:space="preserve">    </w:t>
+        <w:br/>
+        <w:t xml:space="preserve">    Args:</w:t>
+        <w:br/>
+        <w:t xml:space="preserve">        nb (ttk.Notebook): The parent notebook.</w:t>
+        <w:br/>
+        <w:t xml:space="preserve">        df (pd.DataFrame): The master dataset.</w:t>
+        <w:br/>
+        <w:t xml:space="preserve">    """</w:t>
+        <w:br/>
+        <w:t xml:space="preserve">    p = tk.Frame(nb, bg=BG)</w:t>
+        <w:br/>
+        <w:t xml:space="preserve">    nb.add(p, text="  Hashtag Rankings  ")</w:t>
+        <w:br/>
+        <w:t xml:space="preserve">    </w:t>
+        <w:br/>
+        <w:t xml:space="preserve">    page_header(p, "Hashtag Performance Rankings", </w:t>
+        <w:br/>
+        <w:t xml:space="preserve">                "Top and bottom performing hashtags by total views")</w:t>
+        <w:br/>
+        <w:t xml:space="preserve">    </w:t>
+        <w:br/>
+        <w:t xml:space="preserve">    outer = tk.Frame(p, bg=BG)</w:t>
+        <w:br/>
+        <w:t xml:space="preserve">    outer.pack(fill="both", expand=True, padx=16, pady=6)</w:t>
+        <w:br/>
+        <w:t xml:space="preserve">    </w:t>
+        <w:br/>
+        <w:t xml:space="preserve">    if df.empty:</w:t>
+        <w:br/>
+        <w:t xml:space="preserve">        return</w:t>
+        <w:br/>
+        <w:t xml:space="preserve">        </w:t>
+        <w:br/>
+        <w:t xml:space="preserve">    # Aggregate data by hashtag, taking the first category (assuming 1-to-1 mapping)</w:t>
+        <w:br/>
+        <w:t xml:space="preserve">    ht_df = df.groupby("hashtag").agg(</w:t>
+        <w:br/>
+        <w:t xml:space="preserve">        category=("category", "first"),</w:t>
+        <w:br/>
+        <w:t xml:space="preserve">        views=("views", "sum"),</w:t>
+        <w:br/>
+        <w:t xml:space="preserve">        likes=("likes", "sum"),</w:t>
+        <w:br/>
+        <w:t xml:space="preserve">        eng=("engagement_rate", "mean"),</w:t>
+        <w:br/>
+        <w:t xml:space="preserve">        posts=("posts", "sum")</w:t>
+        <w:br/>
+        <w:t xml:space="preserve">    ).reset_index().sort_values("views", ascending=False).reset_index(drop=True)</w:t>
+        <w:br/>
+        <w:t xml:space="preserve">    </w:t>
+        <w:br/>
+        <w:t xml:space="preserve">    # ---------------------------------------------------------</w:t>
+        <w:br/>
+        <w:t xml:space="preserve">    # Left Component: Full Rankings Table</w:t>
+        <w:br/>
+        <w:t xml:space="preserve">    # ---------------------------------------------------------</w:t>
+        <w:br/>
+        <w:t xml:space="preserve">    hdrs = ["#", "HASHTAG", "CATEGORY", "VIEWS", "LIKES", "ENG%", "POSTS"]</w:t>
+        <w:br/>
+        <w:t xml:space="preserve">    cw = [4, 16, 14, 11, 11, 9, 11]</w:t>
+        <w:br/>
+        <w:t xml:space="preserve">    </w:t>
+        <w:br/>
+        <w:t xml:space="preserve">    rows = [</w:t>
+        <w:br/>
+        <w:t xml:space="preserve">        [</w:t>
+        <w:br/>
+        <w:t xml:space="preserve">            i+1, </w:t>
+        <w:br/>
+        <w:t xml:space="preserve">            r["hashtag"], </w:t>
+        <w:br/>
+        <w:t xml:space="preserve">            r["category"], </w:t>
+        <w:br/>
+        <w:t xml:space="preserve">            fmt_num(r["views"]), </w:t>
+        <w:br/>
+        <w:t xml:space="preserve">            fmt_num(r["likes"]), </w:t>
+        <w:br/>
+        <w:t xml:space="preserve">            f"{r['eng']:.2f}%", </w:t>
+        <w:br/>
+        <w:t xml:space="preserve">            fmt_num(r["posts"])</w:t>
+        <w:br/>
+        <w:t xml:space="preserve">        ] </w:t>
+        <w:br/>
+        <w:t xml:space="preserve">        for i, (_, r) in enumerate(ht_df.iterrows())</w:t>
+        <w:br/>
+        <w:t xml:space="preserve">    ]</w:t>
+        <w:br/>
+        <w:t xml:space="preserve">    </w:t>
+        <w:br/>
+        <w:t xml:space="preserve">    def colorfn(ri, ci, val):</w:t>
+        <w:br/>
+        <w:t xml:space="preserve">        if ci == 0: return MUTED</w:t>
+        <w:br/>
+        <w:t xml:space="preserve">        if ci == 2: return CATEGORY_COLORS.get(str(val), FG)</w:t>
         <w:br/>
         <w:t xml:space="preserve">        return FG</w:t>
         <w:br/>
-        <w:t xml:space="preserve">    scrollable_table(outer,hdrs,cw,rows,colorfn)</w:t>
-        <w:br/>
-        <w:t xml:space="preserve">    frr=tk.Frame(outer,bg=CARD,highlightbackground=ACCENT,highlightthickness=1); frr.pack(side="left",fill="both",expand=True)</w:t>
-        <w:br/>
-        <w:t xml:space="preserve">    fig=Figure(figsize=(6.8,6.0),dpi=DPI); fig.patch.set_facecolor(CARD)</w:t>
-        <w:br/>
-        <w:t xml:space="preserve">    ax1=fig.add_subplot(211); ax1.set_facecolor(CARD)</w:t>
-        <w:br/>
-        <w:t xml:space="preserve">    t10=ht_df.head(10).sort_values("views"); hbar(ax1,t10["hashtag"],t10["views"]/1e6,[WARN]*10,fs=9,bh=0.60,vlabels=False)</w:t>
-        <w:br/>
-        <w:t xml:space="preserve">    ax1.set_title("[HIGH] Top 10 Most Viewed",color=ACCENT2,fontsize=10,fontweight="bold",pad=6); fix_yticks(ax1,9)</w:t>
-        <w:br/>
-        <w:t xml:space="preserve">    ax2=fig.add_subplot(212); ax2.set_facecolor(CARD)</w:t>
-        <w:br/>
-        <w:t xml:space="preserve">    b10=ht_df.tail(10).sort_values("views",ascending=False); hbar(ax2,b10["hashtag"],b10["views"]/1e6,[GOOD]*10,fs=9,bh=0.60,vlabels=False)</w:t>
-      </w:r>
-    </w:p>
-    <w:p>
-      <w:r>
-        <w:br w:type="page"/>
-      </w:r>
-    </w:p>
-    <w:p>
-      <w:pPr>
-        <w:spacing w:after="20" w:before="20"/>
-      </w:pPr>
-      <w:r>
-        <w:rPr>
-          <w:rFonts w:ascii="Courier New" w:hAnsi="Courier New"/>
-          <w:sz w:val="16"/>
-        </w:rPr>
-        <w:t xml:space="preserve">    ax2.set_title("[LOW] Bottom 10 Least Viewed",color=ACCENT2,fontsize=10,fontweight="bold",pad=6); fix_yticks(ax2,9)</w:t>
-        <w:br/>
-        <w:t xml:space="preserve">    fig.subplots_adjust(left=0.32,right=0.96,top=0.92,bottom=0.08,hspace=0.60); embed(fig,frr)</w:t>
-        <w:br/>
-        <w:br/>
-        <w:t>def page5(nb,df):</w:t>
-        <w:br/>
-        <w:t xml:space="preserve">    p=tk.Frame(nb,bg=BG); nb.add(p,text="  Heatmap &amp; Correlation  ")</w:t>
-        <w:br/>
-        <w:t xml:space="preserve">    page_header(p,"Metric Correlation &amp; Platform x Category Heatmap","Left: inter-metric correlation  |  Right: normalised engagement heatmap")</w:t>
-        <w:br/>
-        <w:t xml:space="preserve">    fig=Figure(figsize=(12,5.8),dpi=DPI); fig.subplots_adjust(left=0.10,right=0.96,top=0.88,bottom=0.18,wspace=0.35); fig.patch.set_facecolor(BG)</w:t>
-        <w:br/>
-        <w:t xml:space="preserve">    cols=["posts","likes","views","comments","shares","engagement_rate"]; lbls=["Posts","Likes","Views","Comments","Shares","Eng Rate"]</w:t>
-        <w:br/>
-        <w:t xml:space="preserve">    corr=df[cols].corr()</w:t>
-        <w:br/>
-        <w:t xml:space="preserve">    ax1=fig.add_subplot(121)</w:t>
-        <w:br/>
-        <w:t xml:space="preserve">    im1=ax1.imshow(corr.values,cmap="PuOr",vmin=-1,vmax=1,aspect="auto")</w:t>
-        <w:br/>
-        <w:t xml:space="preserve">    ax1.set_xticks(range(len(lbls))); ax1.set_xticklabels(lbls,rotation=35,ha="right",fontsize=10,color=FG)</w:t>
-        <w:br/>
-        <w:t xml:space="preserve">    ax1.set_yticks(range(len(lbls))); ax1.set_yticklabels(lbls,fontsize=10,color=FG)</w:t>
-        <w:br/>
-        <w:t xml:space="preserve">    cmap1=plt.get_cmap("PuOr")</w:t>
+        <w:t xml:space="preserve">        </w:t>
+        <w:br/>
+        <w:t xml:space="preserve">    scrollable_table(outer, hdrs, cw, rows, colorfn)</w:t>
+        <w:br/>
+        <w:t xml:space="preserve">    </w:t>
+        <w:br/>
+        <w:t xml:space="preserve">    # ---------------------------------------------------------</w:t>
+        <w:br/>
+        <w:t xml:space="preserve">    # Right Component: Top &amp; Bottom 10 Visualizations</w:t>
+        <w:br/>
+        <w:t xml:space="preserve">    # ---------------------------------------------------------</w:t>
+        <w:br/>
+        <w:t xml:space="preserve">    frr = tk.Frame(outer, bg=CARD, highlightbackground=ACCENT, highlightthickness=1)</w:t>
+        <w:br/>
+        <w:t xml:space="preserve">    frr.pack(side="left", fill="both", expand=True)</w:t>
+        <w:br/>
+        <w:t xml:space="preserve">    </w:t>
+        <w:br/>
+        <w:t xml:space="preserve">    fig = Figure(figsize=(6.8, 6.0), dpi=DPI)</w:t>
+        <w:br/>
+        <w:t xml:space="preserve">    fig.patch.set_facecolor(CARD)</w:t>
+        <w:br/>
+        <w:t xml:space="preserve">    </w:t>
+        <w:br/>
+        <w:t xml:space="preserve">    # Top 10 Performers</w:t>
+        <w:br/>
+        <w:t xml:space="preserve">    ax1 = fig.add_subplot(211)</w:t>
+        <w:br/>
+        <w:t xml:space="preserve">    ax1.set_facecolor(CARD)</w:t>
+        <w:br/>
+        <w:t xml:space="preserve">    t10 = ht_df.head(10).sort_values("views")</w:t>
+        <w:br/>
+        <w:t xml:space="preserve">    hbar(ax1, t10["hashtag"], t10["views"]/1e6, [WARN]*10, fs=9, bh=0.60, vlabels=False)</w:t>
+        <w:br/>
+        <w:t xml:space="preserve">    ax1.set_title("[HIGH] Top 10 Most Viewed", color=ACCENT2, fontsize=10, fontweight="bold", pad=6)</w:t>
+        <w:br/>
+        <w:t xml:space="preserve">    fix_yticks(ax1, 9)</w:t>
+        <w:br/>
+        <w:t xml:space="preserve">    </w:t>
+        <w:br/>
+        <w:t xml:space="preserve">    # Bottom 10 Performers</w:t>
+        <w:br/>
+        <w:t xml:space="preserve">    ax2 = fig.add_subplot(212)</w:t>
+        <w:br/>
+        <w:t xml:space="preserve">    ax2.set_facecolor(CARD)</w:t>
+        <w:br/>
+        <w:t xml:space="preserve">    b10 = ht_df.tail(10).sort_values("views", ascending=False)</w:t>
+        <w:br/>
+        <w:t xml:space="preserve">    hbar(ax2, b10["hashtag"], b10["views"]/1e6, [GOOD]*10, fs=9, bh=0.60, vlabels=False)</w:t>
+        <w:br/>
+        <w:t xml:space="preserve">    ax2.set_title("[LOW] Bottom 10 Least Viewed", color=ACCENT2, fontsize=10, fontweight="bold", pad=6)</w:t>
+        <w:br/>
+        <w:t xml:space="preserve">    fix_yticks(ax2, 9)</w:t>
+        <w:br/>
+        <w:t xml:space="preserve">    </w:t>
+        <w:br/>
+        <w:t xml:space="preserve">    fig.subplots_adjust(left=0.32, right=0.96, top=0.92, bottom=0.08, hspace=0.60)</w:t>
+        <w:br/>
+        <w:t xml:space="preserve">    embed(fig, frr)</w:t>
+        <w:br/>
+        <w:br/>
+        <w:br/>
+        <w:t>def page5(nb, df):</w:t>
+        <w:br/>
+        <w:t xml:space="preserve">    """</w:t>
+        <w:br/>
+        <w:t xml:space="preserve">    Builds the Heatmap &amp; Correlation Page (Page 5)</w:t>
+        <w:br/>
+        <w:t xml:space="preserve">    </w:t>
+        <w:br/>
+        <w:t xml:space="preserve">    This page focuses on statistical relationships.</w:t>
+        <w:br/>
+        <w:t xml:space="preserve">    1. A Correlation Matrix showing how numerical metrics relate.</w:t>
+        <w:br/>
+        <w:t xml:space="preserve">    2. A 2D Heatmap showing Platform vs Category engagement intensity.</w:t>
+        <w:br/>
+        <w:t xml:space="preserve">    </w:t>
+        <w:br/>
+        <w:t xml:space="preserve">    Args:</w:t>
+        <w:br/>
+        <w:t xml:space="preserve">        nb (ttk.Notebook): The parent notebook.</w:t>
+        <w:br/>
+        <w:t xml:space="preserve">        df (pd.DataFrame): The master dataset.</w:t>
+        <w:br/>
+        <w:t xml:space="preserve">    """</w:t>
+        <w:br/>
+        <w:t xml:space="preserve">    p = tk.Frame(nb, bg=BG)</w:t>
+        <w:br/>
+        <w:t xml:space="preserve">    nb.add(p, text="  Heatmap &amp; Correlation  ")</w:t>
+        <w:br/>
+        <w:t xml:space="preserve">    </w:t>
+        <w:br/>
+        <w:t xml:space="preserve">    page_header(p, "Metric Correlation &amp; Platform x Category Heatmap", </w:t>
+        <w:br/>
+        <w:t xml:space="preserve">                "Left: inter-metric correlation  |  Right: normalised engagement heatmap")</w:t>
+        <w:br/>
+        <w:t xml:space="preserve">                </w:t>
+        <w:br/>
+        <w:t xml:space="preserve">    if df.empty:</w:t>
+        <w:br/>
+        <w:t xml:space="preserve">        return</w:t>
+        <w:br/>
+        <w:t xml:space="preserve">        </w:t>
+        <w:br/>
+        <w:t xml:space="preserve">    fig = Figure(figsize=(12, 5.8), dpi=DPI)</w:t>
+        <w:br/>
+        <w:t xml:space="preserve">    fig.subplots_adjust(left=0.10, right=0.96, top=0.88, bottom=0.18, wspace=0.35)</w:t>
+        <w:br/>
+        <w:t xml:space="preserve">    fig.patch.set_facecolor(BG)</w:t>
+        <w:br/>
+        <w:t xml:space="preserve">    </w:t>
+        <w:br/>
+        <w:t xml:space="preserve">    # --- Left: Metric Correlation Matrix ---</w:t>
+        <w:br/>
+        <w:t xml:space="preserve">    cols = ["posts", "likes", "views", "comments", "shares", "engagement_rate"]</w:t>
+        <w:br/>
+        <w:t xml:space="preserve">    lbls = ["Posts", "Likes", "Views", "Comments", "Shares", "Eng Rate"]</w:t>
+        <w:br/>
+        <w:t xml:space="preserve">    </w:t>
+        <w:br/>
+        <w:t xml:space="preserve">    # Calculate Pearson correlation coefficient</w:t>
+        <w:br/>
+        <w:t xml:space="preserve">    corr = df[cols].corr()</w:t>
+        <w:br/>
+        <w:t xml:space="preserve">    </w:t>
+        <w:br/>
+        <w:t xml:space="preserve">    ax1 = fig.add_subplot(121)</w:t>
+        <w:br/>
+        <w:t xml:space="preserve">    im1 = ax1.imshow(corr.values, cmap="PuOr", vmin=-1, vmax=1, aspect="auto")</w:t>
+        <w:br/>
+        <w:t xml:space="preserve">    </w:t>
+        <w:br/>
+        <w:t xml:space="preserve">    # Set up ticks and labels</w:t>
+        <w:br/>
+        <w:t xml:space="preserve">    ax1.set_xticks(range(len(lbls)))</w:t>
+        <w:br/>
+        <w:t xml:space="preserve">    ax1.set_xticklabels(lbls, rotation=35, ha="right", fontsize=10, color=FG)</w:t>
+        <w:br/>
+        <w:t xml:space="preserve">    ax1.set_yticks(range(len(lbls)))</w:t>
+        <w:br/>
+        <w:t xml:space="preserve">    ax1.set_yticklabels(lbls, fontsize=10, color=FG)</w:t>
+        <w:br/>
+        <w:t xml:space="preserve">    </w:t>
+        <w:br/>
+        <w:t xml:space="preserve">    # Overlay correlation values text onto the matrix cells</w:t>
+        <w:br/>
+        <w:t xml:space="preserve">    cmap1 = plt.get_cmap("PuOr")</w:t>
         <w:br/>
         <w:t xml:space="preserve">    for i in range(len(lbls)):</w:t>
         <w:br/>
         <w:t xml:space="preserve">        for j in range(len(lbls)):</w:t>
-      </w:r>
-    </w:p>
-    <w:p>
-      <w:r>
-        <w:br w:type="page"/>
-      </w:r>
-    </w:p>
-    <w:p>
-      <w:pPr>
-        <w:spacing w:after="20" w:before="20"/>
-      </w:pPr>
-      <w:r>
-        <w:rPr>
-          <w:rFonts w:ascii="Courier New" w:hAnsi="Courier New"/>
-          <w:sz w:val="16"/>
-        </w:rPr>
-        <w:t xml:space="preserve">            v=corr.values[i,j]; tc=cell_tc(cmap1,(v+1)/2)</w:t>
-        <w:br/>
-        <w:t xml:space="preserve">            ax1.text(j,i,f"{v:.2f}",ha="center",va="center",fontsize=10,fontweight="bold",color=tc)</w:t>
-        <w:br/>
-        <w:t xml:space="preserve">    cb1=fig.colorbar(im1,ax=ax1,shrink=0.80); cb1.ax.yaxis.set_tick_params(color=FG,labelsize=10); plt.setp(cb1.ax.yaxis.get_ticklabels(),color=FG)</w:t>
-        <w:br/>
-        <w:t xml:space="preserve">    style_ax(ax1,"Metric Correlation Matrix")</w:t>
-        <w:br/>
-        <w:t xml:space="preserve">    pivot=df.pivot_table(index="platform",columns="category",values="engagement_rate",aggfunc="mean")</w:t>
-        <w:br/>
-        <w:t xml:space="preserve">    norm=(pivot-pivot.min())/(pivot.max()-pivot.min())</w:t>
-        <w:br/>
-        <w:t xml:space="preserve">    ax2=fig.add_subplot(122)</w:t>
-        <w:br/>
-        <w:t xml:space="preserve">    cmap2=plt.get_cmap("magma")</w:t>
-        <w:br/>
-        <w:t xml:space="preserve">    im2=ax2.imshow(norm.values,cmap="magma",aspect="auto",vmin=0,vmax=1)</w:t>
-        <w:br/>
-        <w:t xml:space="preserve">    ax2.set_xticks(range(len(pivot.columns))); ax2.set_xticklabels([trunc(c,9) for c in pivot.columns],fontsize=9,color=FG,rotation=35,ha="right")</w:t>
-        <w:br/>
-        <w:t xml:space="preserve">    ax2.set_yticks(range(len(pivot.index))); ax2.set_yticklabels(pivot.index,fontsize=10,color=FG)</w:t>
+        <w:br/>
+        <w:t xml:space="preserve">            v = corr.values[i, j]</w:t>
+        <w:br/>
+        <w:t xml:space="preserve">            # Calculate appropriate text color based on cell background</w:t>
+        <w:br/>
+        <w:t xml:space="preserve">            tc = cell_tc(cmap1, (v+1)/2)</w:t>
+        <w:br/>
+        <w:t xml:space="preserve">            ax1.text(j, i, f"{v:.2f}", ha="center", va="center", </w:t>
+        <w:br/>
+        <w:t xml:space="preserve">                     fontsize=10, fontweight="bold", color=tc)</w:t>
+        <w:br/>
+        <w:t xml:space="preserve">                     </w:t>
+        <w:br/>
+        <w:t xml:space="preserve">    cb1 = fig.colorbar(im1, ax=ax1, shrink=0.80)</w:t>
+        <w:br/>
+        <w:t xml:space="preserve">    cb1.ax.yaxis.set_tick_params(color=FG, labelsize=10)</w:t>
+        <w:br/>
+        <w:t xml:space="preserve">    plt.setp(cb1.ax.yaxis.get_ticklabels(), color=FG)</w:t>
+        <w:br/>
+        <w:t xml:space="preserve">    style_ax(ax1, "Metric Correlation Matrix")</w:t>
+        <w:br/>
+        <w:t xml:space="preserve">    </w:t>
+        <w:br/>
+        <w:t xml:space="preserve">    # --- Right: Platform x Category Heatmap ---</w:t>
+        <w:br/>
+        <w:t xml:space="preserve">    # Create pivot table for 2D representation</w:t>
+        <w:br/>
+        <w:t xml:space="preserve">    pivot = df.pivot_table(index="platform", columns="category", values="engagement_rate", aggfunc="mean")</w:t>
+        <w:br/>
+        <w:t xml:space="preserve">    </w:t>
+        <w:br/>
+        <w:t xml:space="preserve">    # Normalize data using Min-Max scaling for visual colormapping</w:t>
+        <w:br/>
+        <w:t xml:space="preserve">    norm = (pivot - pivot.min()) / (pivot.max() - pivot.min())</w:t>
+        <w:br/>
+        <w:t xml:space="preserve">    </w:t>
+        <w:br/>
+        <w:t xml:space="preserve">    ax2 = fig.add_subplot(122)</w:t>
+        <w:br/>
+        <w:t xml:space="preserve">    cmap2 = plt.get_cmap("magma")</w:t>
+        <w:br/>
+        <w:t xml:space="preserve">    im2 = ax2.imshow(norm.values, cmap="magma", aspect="auto", vmin=0, vmax=1)</w:t>
+        <w:br/>
+        <w:t xml:space="preserve">    </w:t>
+        <w:br/>
+        <w:t xml:space="preserve">    # Setup axis ticks</w:t>
+        <w:br/>
+        <w:t xml:space="preserve">    ax2.set_xticks(range(len(pivot.columns)))</w:t>
+        <w:br/>
+        <w:t xml:space="preserve">    ax2.set_xticklabels([trunc(c, 9) for c in pivot.columns], fontsize=9, color=FG, rotation=35, ha="right")</w:t>
+        <w:br/>
+        <w:t xml:space="preserve">    ax2.set_yticks(range(len(pivot.index)))</w:t>
+        <w:br/>
+        <w:t xml:space="preserve">    ax2.set_yticklabels(pivot.index, fontsize=10, color=FG)</w:t>
+        <w:br/>
+        <w:t xml:space="preserve">    </w:t>
+        <w:br/>
+        <w:t xml:space="preserve">    # Overlay engagement rate values text</w:t>
         <w:br/>
         <w:t xml:space="preserve">    for i in range(len(pivot.index)):</w:t>
         <w:br/>
         <w:t xml:space="preserve">        for j in range(len(pivot.columns)):</w:t>
         <w:br/>
-        <w:t xml:space="preserve">            rv=pivot.values[i,j]; nv=norm.values[i,j]</w:t>
-        <w:br/>
-        <w:t xml:space="preserve">            txt="nan" if (isinstance(rv,float) and np.isnan(rv)) else f"{rv:.1f}"</w:t>
-        <w:br/>
-        <w:t xml:space="preserve">            tc=cell_tc(cmap2,None if (isinstance(nv,float) and np.isnan(nv)) else nv)</w:t>
-      </w:r>
-    </w:p>
-    <w:p>
-      <w:r>
-        <w:br w:type="page"/>
-      </w:r>
-    </w:p>
-    <w:p>
-      <w:pPr>
-        <w:spacing w:after="20" w:before="20"/>
-      </w:pPr>
-      <w:r>
-        <w:rPr>
-          <w:rFonts w:ascii="Courier New" w:hAnsi="Courier New"/>
-          <w:sz w:val="16"/>
-        </w:rPr>
-        <w:t xml:space="preserve">            ax2.text(j,i,txt,ha="center",va="center",fontsize=9,color=tc)</w:t>
-        <w:br/>
-        <w:t xml:space="preserve">    cb2=fig.colorbar(im2,ax=ax2,shrink=0.80); cb2.ax.yaxis.set_tick_params(color=FG,labelsize=10); plt.setp(cb2.ax.yaxis.get_ticklabels(),color=FG)</w:t>
-        <w:br/>
-        <w:t xml:space="preserve">    style_ax(ax2,"Platform x Category Engagement")</w:t>
-        <w:br/>
-        <w:t xml:space="preserve">    embed(fig,p)</w:t>
+        <w:t xml:space="preserve">            rv = pivot.values[i, j]</w:t>
+        <w:br/>
+        <w:t xml:space="preserve">            nv = norm.values[i, j]</w:t>
+        <w:br/>
+        <w:t xml:space="preserve">            </w:t>
+        <w:br/>
+        <w:t xml:space="preserve">            # Handle empty cells (NaN) gracefully</w:t>
+        <w:br/>
+        <w:t xml:space="preserve">            txt = "nan" if (isinstance(rv, float) and np.isnan(rv)) else f"{rv:.1f}"</w:t>
+        <w:br/>
+        <w:t xml:space="preserve">            tc = cell_tc(cmap2, None if (isinstance(nv, float) and np.isnan(nv)) else nv)</w:t>
+        <w:br/>
+        <w:t xml:space="preserve">            </w:t>
+        <w:br/>
+        <w:t xml:space="preserve">            ax2.text(j, i, txt, ha="center", va="center", fontsize=9, color=tc)</w:t>
+        <w:br/>
+        <w:t xml:space="preserve">            </w:t>
+        <w:br/>
+        <w:t xml:space="preserve">    cb2 = fig.colorbar(im2, ax=ax2, shrink=0.80)</w:t>
+        <w:br/>
+        <w:t xml:space="preserve">    cb2.ax.yaxis.set_tick_params(color=FG, labelsize=10)</w:t>
+        <w:br/>
+        <w:t xml:space="preserve">    plt.setp(cb2.ax.yaxis.get_ticklabels(), color=FG)</w:t>
+        <w:br/>
+        <w:t xml:space="preserve">    style_ax(ax2, "Platform x Category Engagement")</w:t>
+        <w:br/>
+        <w:t xml:space="preserve">    </w:t>
+        <w:br/>
+        <w:t xml:space="preserve">    embed(fig, p)</w:t>
+        <w:br/>
+        <w:br/>
+        <w:br/>
+        <w:t># ==============================================================================</w:t>
+        <w:br/>
+        <w:t># MAIN APPLICATION ASSEMBLY AND LAUNCH</w:t>
+        <w:br/>
+        <w:t># ==============================================================================</w:t>
+        <w:br/>
+        <w:br/>
+        <w:t>def build_dashboard(root, df):</w:t>
+        <w:br/>
+        <w:t xml:space="preserve">    """</w:t>
+        <w:br/>
+        <w:t xml:space="preserve">    Assemble the complete dashboard structure including the main notebook and all pages.</w:t>
+        <w:br/>
+        <w:t xml:space="preserve">    This acts as the orchestrator combining all previous UI functions.</w:t>
+        <w:br/>
+        <w:t xml:space="preserve">    </w:t>
+        <w:br/>
+        <w:t xml:space="preserve">    Args:</w:t>
+        <w:br/>
+        <w:t xml:space="preserve">        root (tk.Tk): Main application window.</w:t>
+        <w:br/>
+        <w:t xml:space="preserve">        df (pd.DataFrame): Dataset to visualize.</w:t>
+        <w:br/>
+        <w:t xml:space="preserve">    """</w:t>
+        <w:br/>
+        <w:t xml:space="preserve">    </w:t>
+        <w:br/>
+        <w:t xml:space="preserve">    # --- Top Application Header ---</w:t>
+        <w:br/>
+        <w:t xml:space="preserve">    hdr = tk.Frame(root, bg=CARD, highlightbackground=ACCENT, highlightthickness=2)</w:t>
+        <w:br/>
+        <w:t xml:space="preserve">    hdr.pack(fill="x", padx=16, pady=(10, 4))</w:t>
+        <w:br/>
+        <w:t xml:space="preserve">    </w:t>
+        <w:br/>
+        <w:t xml:space="preserve">    lh = tk.Frame(hdr, bg=CARD)</w:t>
+        <w:br/>
+        <w:t xml:space="preserve">    lh.pack(side="left", padx=14, pady=10)</w:t>
+        <w:br/>
+        <w:t xml:space="preserve">    tk.Label(</w:t>
+        <w:br/>
+        <w:t xml:space="preserve">        lh, text="Social Media Trends Analytics Dashboard", </w:t>
+        <w:br/>
+        <w:t xml:space="preserve">        bg=CARD, fg=FG, font=("Segoe UI", 22, "bold")</w:t>
+        <w:br/>
+        <w:t xml:space="preserve">    ).pack(anchor="w")</w:t>
+        <w:br/>
+        <w:t xml:space="preserve">             </w:t>
+        <w:br/>
+        <w:t xml:space="preserve">    # Prepare dynamic subtext based on dataset dimensions</w:t>
+        <w:br/>
+        <w:t xml:space="preserve">    try:</w:t>
+        <w:br/>
+        <w:t xml:space="preserve">        stats_str = (</w:t>
+        <w:br/>
+        <w:t xml:space="preserve">            f"{len(df)} Records  |  "</w:t>
+        <w:br/>
+        <w:t xml:space="preserve">            f"{df['platform'].nunique()} Platforms  |  "</w:t>
+        <w:br/>
+        <w:t xml:space="preserve">            f"{df['category'].nunique()} Categories  |  "</w:t>
+        <w:br/>
+        <w:t xml:space="preserve">            f"{df['country'].nunique()} Countries"</w:t>
+        <w:br/>
+        <w:t xml:space="preserve">        )</w:t>
+        <w:br/>
+        <w:t xml:space="preserve">    except Exception:</w:t>
+        <w:br/>
+        <w:t xml:space="preserve">        stats_str = "Data loading error - using default schema"</w:t>
+        <w:br/>
+        <w:t xml:space="preserve">        </w:t>
+        <w:br/>
+        <w:t xml:space="preserve">    tk.Label(lh, bg=CARD, fg=MUTED, font=("Segoe UI", 10), text=stats_str).pack(anchor="w")</w:t>
+        <w:br/>
+        <w:t xml:space="preserve">    </w:t>
+        <w:br/>
+        <w:t xml:space="preserve">    # Right side author block</w:t>
+        <w:br/>
+        <w:t xml:space="preserve">    rh = tk.Frame(hdr, bg=CARD)</w:t>
+        <w:br/>
+        <w:t xml:space="preserve">    rh.pack(side="right", padx=14, pady=10)</w:t>
+        <w:br/>
+        <w:t xml:space="preserve">    </w:t>
+        <w:br/>
+        <w:t xml:space="preserve">    tk.Label(rh, text="DVA Assignment 2", bg=CARD, fg=ACCENT, font=("Segoe UI", 12, "bold")).pack(anchor="e")</w:t>
+        <w:br/>
+        <w:t xml:space="preserve">    tk.Label(rh, text="Akshat Tripathi | 04914202023", bg=CARD, fg=ACCENT2, font=("Segoe UI", 10, "bold")).pack(anchor="e")</w:t>
+        <w:br/>
+        <w:t xml:space="preserve">    tk.Label(rh, text="IPU BCA 6th Semester", bg=CARD, fg=MUTED, font=("Segoe UI", 9)).pack(anchor="e")</w:t>
+        <w:br/>
+        <w:br/>
+        <w:t xml:space="preserve">    # --- Notebook (Tabbed Interface) Setup ---</w:t>
+        <w:br/>
+        <w:t xml:space="preserve">    st = ttk.Style()</w:t>
+        <w:br/>
+        <w:t xml:space="preserve">    st.theme_use("default")</w:t>
+        <w:br/>
+        <w:t xml:space="preserve">    </w:t>
+        <w:br/>
+        <w:t xml:space="preserve">    # Configure colors and fonts for notebook tabs to match the dark theme</w:t>
+        <w:br/>
+        <w:t xml:space="preserve">    st.configure("TNotebook", background=BG, borderwidth=0)</w:t>
+        <w:br/>
+        <w:t xml:space="preserve">    st.configure("TNotebook.Tab", background=CARD, foreground=FG, padding=(28, 11), font=("Segoe UI", 11, "bold"))</w:t>
+        <w:br/>
+        <w:t xml:space="preserve">    st.map("TNotebook.Tab", background=[("selected", "#B983FF")], foreground=[("selected", "#13111C")])</w:t>
+        <w:br/>
+        <w:t xml:space="preserve">    </w:t>
+        <w:br/>
+        <w:t xml:space="preserve">    nb = ttk.Notebook(root, style="TNotebook")</w:t>
+        <w:br/>
+        <w:t xml:space="preserve">    nb.pack(fill="both", expand=True, padx=12, pady=8)</w:t>
+        <w:br/>
+        <w:t xml:space="preserve">    </w:t>
+        <w:br/>
+        <w:t xml:space="preserve">    # Initialize and append all 5 analytical pages</w:t>
+        <w:br/>
+        <w:t xml:space="preserve">    page1(nb, df)</w:t>
+        <w:br/>
+        <w:t xml:space="preserve">    page2(nb, df)</w:t>
+        <w:br/>
+        <w:t xml:space="preserve">    page3(nb, df)</w:t>
+        <w:br/>
+        <w:t xml:space="preserve">    page4(nb, df)</w:t>
+        <w:br/>
+        <w:t xml:space="preserve">    page5(nb, df)</w:t>
+        <w:br/>
+        <w:t xml:space="preserve">    </w:t>
+        <w:br/>
         <w:br/>
         <w:br/>
         <w:t>def main():</w:t>
         <w:br/>
-        <w:t xml:space="preserve">    root=tk.Tk(); root.title("Social Media Trends Dashboard - Akshat Tripathi | 04914202023")</w:t>
-        <w:br/>
-        <w:t xml:space="preserve">    root.configure(bg=BG); root.state("zoomed")</w:t>
-        <w:br/>
-        <w:t xml:space="preserve">    df=load_data(); build_dashboard(root,df); root.mainloop()</w:t>
-        <w:br/>
-        <w:br/>
-        <w:t>if __name__=="__main__":</w:t>
+        <w:t xml:space="preserve">    """</w:t>
+        <w:br/>
+        <w:t xml:space="preserve">    Application entry point.</w:t>
+        <w:br/>
+        <w:t xml:space="preserve">    Initializes the Tkinter main loop, configures the base window,</w:t>
+        <w:br/>
+        <w:t xml:space="preserve">    loads the data, and triggers the dashboard build process.</w:t>
+        <w:br/>
+        <w:t xml:space="preserve">    """</w:t>
+        <w:br/>
+        <w:t xml:space="preserve">    </w:t>
+        <w:br/>
+        <w:t xml:space="preserve">    # Initialize main window</w:t>
+        <w:br/>
+        <w:t xml:space="preserve">    root = tk.Tk()</w:t>
+        <w:br/>
+        <w:t xml:space="preserve">    root.title("Social Media Trends Dashboard - Akshat Tripathi | 04914202023")</w:t>
+        <w:br/>
+        <w:t xml:space="preserve">    root.configure(bg=BG)</w:t>
+        <w:br/>
+        <w:t xml:space="preserve">    </w:t>
+        <w:br/>
+        <w:t xml:space="preserve">    # Attempt to maximize window based on OS capabilities</w:t>
+        <w:br/>
+        <w:t xml:space="preserve">    try:</w:t>
+        <w:br/>
+        <w:t xml:space="preserve">        root.state("zoomed") # Works on Windows</w:t>
+        <w:br/>
+        <w:t xml:space="preserve">    except tk.TclError:</w:t>
+        <w:br/>
+        <w:t xml:space="preserve">        try:</w:t>
+        <w:br/>
+        <w:t xml:space="preserve">            root.attributes('-zoomed', True) # Works on some Linux environments</w:t>
+        <w:br/>
+        <w:t xml:space="preserve">        except Exception as e:</w:t>
+        <w:br/>
+        <w:t xml:space="preserve">        </w:t>
+        <w:br/>
+        <w:t xml:space="preserve">    # Load dataset</w:t>
+        <w:br/>
+        <w:t xml:space="preserve">    df = load_data()</w:t>
+        <w:br/>
+        <w:t xml:space="preserve">    </w:t>
+        <w:br/>
+        <w:t xml:space="preserve">    # Construct UI</w:t>
+        <w:br/>
+        <w:t xml:space="preserve">    build_dashboard(root, df)</w:t>
+        <w:br/>
+        <w:t xml:space="preserve">    </w:t>
+        <w:br/>
+        <w:t xml:space="preserve">    # Start application event loop</w:t>
+        <w:br/>
+        <w:t xml:space="preserve">    root.mainloop()</w:t>
+        <w:br/>
+        <w:br/>
+        <w:br/>
+        <w:t>if __name__ == "__main__":</w:t>
+        <w:br/>
+        <w:t xml:space="preserve">    # Execute main function only when script is run directly</w:t>
         <w:br/>
         <w:t xml:space="preserve">    main()</w:t>
         <w:br/>

</xml_diff>

<commit_message>
Fixed all 4 code bugs: removed unused imports, fixed empty if/except bodies, fixed orphaned docstring, added pass to bare except
</commit_message>
<xml_diff>
--- a/DVA_Assignment_2_Akshat_Tripathi.docx
+++ b/DVA_Assignment_2_Akshat_Tripathi.docx
@@ -776,1870 +776,1855 @@
         <w:br/>
         <w:t>import sys</w:t>
         <w:br/>
-        <w:t>import logging</w:t>
-        <w:br/>
-        <w:t>from datetime import datetime</w:t>
-        <w:br/>
         <w:t># ==============================================================================</w:t>
         <w:br/>
-        <w:t># LOGGING CONFIGURATION</w:t>
+        <w:t># CONSTANTS AND THEME CONFIGURATION</w:t>
         <w:br/>
         <w:t># ==============================================================================</w:t>
         <w:br/>
-        <w:t># We set up logging to ensure that all events within the dashboard are tracked.</w:t>
-        <w:br/>
-        <w:t># This helps in debugging data loading issues and tracking UI interactions.</w:t>
-        <w:br/>
-        <w:t>logging.basicConfig(</w:t>
-        <w:br/>
-        <w:t xml:space="preserve">    level=logging.INFO,</w:t>
-        <w:br/>
-        <w:t xml:space="preserve">    format='%(asctime)s - %(name)s - %(levelname)s - %(message)s'</w:t>
-        <w:br/>
-        <w:t>)</w:t>
-        <w:br/>
-        <w:t>logger = logging.getLogger('SMDashboard')</w:t>
+        <w:t># MIDNIGHT PURPLE THEME</w:t>
+        <w:br/>
+        <w:t># The color palette has been carefully selected to provide high contrast</w:t>
+        <w:br/>
+        <w:t># and a modern, sleek appearance reminiscent of popular analytics tools.</w:t>
+        <w:br/>
+        <w:t>BG = "#13111C"          # Main background color</w:t>
+        <w:br/>
+        <w:t>CARD = "#1E1B2E"        # Card and panel background</w:t>
+        <w:br/>
+        <w:t>CARD2 = "#252238"       # Alternate card background for tables</w:t>
+        <w:br/>
+        <w:t>FG = "#F0E6FF"          # Primary text color (Foreground)</w:t>
+        <w:br/>
+        <w:t>ACCENT = "#B983FF"      # Primary accent color (Purple)</w:t>
+        <w:br/>
+        <w:t>ACCENT2 = "#D4BBFF"     # Secondary accent color (Lighter Purple)</w:t>
+        <w:br/>
+        <w:t>GOOD = "#00E396"        # Success/Positive indicator color (Green)</w:t>
+        <w:br/>
+        <w:t>WARN = "#FF6178"        # Warning/Negative indicator color (Red)</w:t>
+        <w:br/>
+        <w:t>MID = "#FEB019"         # Neutral/Midpoint indicator color (Orange)</w:t>
+        <w:br/>
+        <w:t>MUTED = "#8A85A0"       # Muted text color for subtitles and labels</w:t>
+        <w:br/>
+        <w:t>BORDER = "#362F50"      # Border color for cards and widgets</w:t>
+        <w:br/>
+        <w:t># Brand colors corresponding to popular social media platforms</w:t>
+        <w:br/>
+        <w:t>PLATFORM_COLORS = {</w:t>
+        <w:br/>
+        <w:t xml:space="preserve">    "Twitter": "#1DA1F2",</w:t>
+        <w:br/>
+        <w:t xml:space="preserve">    "Instagram": "#E4405F",</w:t>
+        <w:br/>
+        <w:t xml:space="preserve">    "YouTube": "#FF0000",</w:t>
+        <w:br/>
+        <w:t xml:space="preserve">    "Facebook": "#1877F2",</w:t>
+        <w:br/>
+        <w:t xml:space="preserve">    "TikTok": "#25F4EE"</w:t>
+        <w:br/>
+        <w:t>}</w:t>
+        <w:br/>
+        <w:t># Distinct colors mapped to various content categories</w:t>
+        <w:br/>
+        <w:t>CATEGORY_COLORS = {</w:t>
+        <w:br/>
+        <w:t xml:space="preserve">    "Entertainment": "#FF6B6B",</w:t>
+        <w:br/>
+        <w:t xml:space="preserve">    "Sports": "#4ECDC4",</w:t>
+        <w:br/>
+        <w:t xml:space="preserve">    "Politics": "#FFE66D",</w:t>
+        <w:br/>
+        <w:t xml:space="preserve">    "Technology": "#A29BFE",</w:t>
+        <w:br/>
+        <w:t xml:space="preserve">    "Fashion": "#FD79A8",</w:t>
+        <w:br/>
+        <w:t xml:space="preserve">    "Gaming": "#6C5CE7",</w:t>
+        <w:br/>
+        <w:t xml:space="preserve">    "Food": "#FDCB6E",</w:t>
+        <w:br/>
+        <w:t xml:space="preserve">    "Travel": "#00B894",</w:t>
+        <w:br/>
+        <w:t xml:space="preserve">    "Education": "#74B9FF",</w:t>
+        <w:br/>
+        <w:t xml:space="preserve">    "Health": "#55EFC4"</w:t>
+        <w:br/>
+        <w:t>}</w:t>
+        <w:br/>
+        <w:t># Matplotlib styling updates</w:t>
+        <w:br/>
+        <w:t># This block globally updates matplotlib's parameters to match the Tkinter theme.</w:t>
+        <w:br/>
+        <w:t># Doing this globally ensures that all figures created will inherently follow</w:t>
+        <w:br/>
+        <w:t># the midnight purple styling without requiring manual color assignments on every axis.</w:t>
+        <w:br/>
+        <w:t>mpl.rcParams.update({</w:t>
+        <w:br/>
+        <w:t xml:space="preserve">    "font.family": "sans-serif",</w:t>
+        <w:br/>
+        <w:t xml:space="preserve">    "font.sans-serif": ["Segoe UI", "DejaVu Sans", "Arial"],</w:t>
+        <w:br/>
+        <w:t xml:space="preserve">    "font.size": 11,</w:t>
+        <w:br/>
+        <w:t xml:space="preserve">    "axes.titlesize": 13,</w:t>
+        <w:br/>
+        <w:t xml:space="preserve">    "axes.labelsize": 11,</w:t>
+        <w:br/>
+        <w:t xml:space="preserve">    "xtick.labelsize": 10,</w:t>
+        <w:br/>
+        <w:t xml:space="preserve">    "ytick.labelsize": 10,</w:t>
+        <w:br/>
+        <w:t xml:space="preserve">    "legend.fontsize": 10,</w:t>
+        <w:br/>
+        <w:t xml:space="preserve">    "figure.facecolor": BG,</w:t>
+        <w:br/>
+        <w:t xml:space="preserve">    "axes.facecolor": CARD,</w:t>
+        <w:br/>
+        <w:t xml:space="preserve">    "axes.edgecolor": BORDER,</w:t>
+        <w:br/>
+        <w:t xml:space="preserve">    "axes.labelcolor": MUTED,</w:t>
+        <w:br/>
+        <w:t xml:space="preserve">    "xtick.color": FG,</w:t>
+        <w:br/>
+        <w:t xml:space="preserve">    "ytick.color": FG,</w:t>
+        <w:br/>
+        <w:t xml:space="preserve">    "text.color": FG,</w:t>
+        <w:br/>
+        <w:t xml:space="preserve">    "grid.color": BORDER,</w:t>
+        <w:br/>
+        <w:t xml:space="preserve">    "grid.linewidth": 0.5</w:t>
+        <w:br/>
+        <w:t>})</w:t>
+        <w:br/>
+        <w:t># Display constants</w:t>
+        <w:br/>
+        <w:t>DPI = 100</w:t>
+        <w:br/>
+        <w:t>FILE_PATH = "Social_Media_Trends_India.csv"</w:t>
+        <w:br/>
+        <w:t>FONT_TABLE = ("Segoe UI", 10)</w:t>
+        <w:br/>
+        <w:t>FONT_THEAD = ("Segoe UI", 10, "bold")</w:t>
         <w:br/>
         <w:t># ==============================================================================</w:t>
         <w:br/>
-        <w:t># CONSTANTS AND THEME CONFIGURATION</w:t>
+        <w:t># DATA HANDLING AND VALIDATION UTILITIES</w:t>
         <w:br/>
         <w:t># ==============================================================================</w:t>
         <w:br/>
-        <w:t># MIDNIGHT PURPLE THEME</w:t>
-        <w:br/>
-        <w:t># The color palette has been carefully selected to provide high contrast</w:t>
-        <w:br/>
-        <w:t># and a modern, sleek appearance reminiscent of popular analytics tools.</w:t>
-        <w:br/>
-        <w:t>BG = "#13111C"          # Main background color</w:t>
-        <w:br/>
-        <w:t>CARD = "#1E1B2E"        # Card and panel background</w:t>
-        <w:br/>
-        <w:t>CARD2 = "#252238"       # Alternate card background for tables</w:t>
-        <w:br/>
-        <w:t>FG = "#F0E6FF"          # Primary text color (Foreground)</w:t>
-        <w:br/>
-        <w:t>ACCENT = "#B983FF"      # Primary accent color (Purple)</w:t>
-        <w:br/>
-        <w:t>ACCENT2 = "#D4BBFF"     # Secondary accent color (Lighter Purple)</w:t>
-        <w:br/>
-        <w:t>GOOD = "#00E396"        # Success/Positive indicator color (Green)</w:t>
-        <w:br/>
-        <w:t>WARN = "#FF6178"        # Warning/Negative indicator color (Red)</w:t>
-        <w:br/>
-        <w:t>MID = "#FEB019"         # Neutral/Midpoint indicator color (Orange)</w:t>
-        <w:br/>
-        <w:t>MUTED = "#8A85A0"       # Muted text color for subtitles and labels</w:t>
-        <w:br/>
-        <w:t>BORDER = "#362F50"      # Border color for cards and widgets</w:t>
-        <w:br/>
-        <w:t># Brand colors corresponding to popular social media platforms</w:t>
-        <w:br/>
-        <w:t>PLATFORM_COLORS = {</w:t>
-        <w:br/>
-        <w:t xml:space="preserve">    "Twitter": "#1DA1F2",</w:t>
-        <w:br/>
-        <w:t xml:space="preserve">    "Instagram": "#E4405F",</w:t>
-        <w:br/>
-        <w:t xml:space="preserve">    "YouTube": "#FF0000",</w:t>
-        <w:br/>
-        <w:t xml:space="preserve">    "Facebook": "#1877F2",</w:t>
-        <w:br/>
-        <w:t xml:space="preserve">    "TikTok": "#25F4EE"</w:t>
-        <w:br/>
-        <w:t>}</w:t>
-        <w:br/>
-        <w:t># Distinct colors mapped to various content categories</w:t>
-        <w:br/>
-        <w:t>CATEGORY_COLORS = {</w:t>
-        <w:br/>
-        <w:t xml:space="preserve">    "Entertainment": "#FF6B6B",</w:t>
-        <w:br/>
-        <w:t xml:space="preserve">    "Sports": "#4ECDC4",</w:t>
-        <w:br/>
-        <w:t xml:space="preserve">    "Politics": "#FFE66D",</w:t>
-        <w:br/>
-        <w:t xml:space="preserve">    "Technology": "#A29BFE",</w:t>
-        <w:br/>
-        <w:t xml:space="preserve">    "Fashion": "#FD79A8",</w:t>
-        <w:br/>
-        <w:t xml:space="preserve">    "Gaming": "#6C5CE7",</w:t>
-        <w:br/>
-        <w:t xml:space="preserve">    "Food": "#FDCB6E",</w:t>
-        <w:br/>
-        <w:t xml:space="preserve">    "Travel": "#00B894",</w:t>
-        <w:br/>
-        <w:t xml:space="preserve">    "Education": "#74B9FF",</w:t>
-        <w:br/>
-        <w:t xml:space="preserve">    "Health": "#55EFC4"</w:t>
-        <w:br/>
-        <w:t>}</w:t>
-        <w:br/>
-        <w:t># Matplotlib styling updates</w:t>
-        <w:br/>
-        <w:t># This block globally updates matplotlib's parameters to match the Tkinter theme.</w:t>
-        <w:br/>
-        <w:t># Doing this globally ensures that all figures created will inherently follow</w:t>
-        <w:br/>
-        <w:t># the midnight purple styling without requiring manual color assignments on every axis.</w:t>
-        <w:br/>
-        <w:t>mpl.rcParams.update({</w:t>
-        <w:br/>
-        <w:t xml:space="preserve">    "font.family": "sans-serif",</w:t>
-        <w:br/>
-        <w:t xml:space="preserve">    "font.sans-serif": ["Segoe UI", "DejaVu Sans", "Arial"],</w:t>
-        <w:br/>
-        <w:t xml:space="preserve">    "font.size": 11,</w:t>
-        <w:br/>
-        <w:t xml:space="preserve">    "axes.titlesize": 13,</w:t>
-        <w:br/>
-        <w:t xml:space="preserve">    "axes.labelsize": 11,</w:t>
-        <w:br/>
-        <w:t xml:space="preserve">    "xtick.labelsize": 10,</w:t>
-        <w:br/>
-        <w:t xml:space="preserve">    "ytick.labelsize": 10,</w:t>
-        <w:br/>
-        <w:t xml:space="preserve">    "legend.fontsize": 10,</w:t>
-        <w:br/>
-        <w:t xml:space="preserve">    "figure.facecolor": BG,</w:t>
-        <w:br/>
-        <w:t xml:space="preserve">    "axes.facecolor": CARD,</w:t>
-        <w:br/>
-        <w:t xml:space="preserve">    "axes.edgecolor": BORDER,</w:t>
-        <w:br/>
-        <w:t xml:space="preserve">    "axes.labelcolor": MUTED,</w:t>
-        <w:br/>
-        <w:t xml:space="preserve">    "xtick.color": FG,</w:t>
-        <w:br/>
-        <w:t xml:space="preserve">    "ytick.color": FG,</w:t>
-        <w:br/>
-        <w:t xml:space="preserve">    "text.color": FG,</w:t>
-        <w:br/>
-        <w:t xml:space="preserve">    "grid.color": BORDER,</w:t>
-        <w:br/>
-        <w:t xml:space="preserve">    "grid.linewidth": 0.5</w:t>
-        <w:br/>
-        <w:t>})</w:t>
-        <w:br/>
-        <w:t># Display constants</w:t>
-        <w:br/>
-        <w:t>DPI = 100</w:t>
-        <w:br/>
-        <w:t>FILE_PATH = "Social_Media_Trends_India.csv"</w:t>
-        <w:br/>
-        <w:t>FONT_TABLE = ("Segoe UI", 10)</w:t>
-        <w:br/>
-        <w:t>FONT_THEAD = ("Segoe UI", 10, "bold")</w:t>
+        <w:t>class DataValidationError(Exception):</w:t>
+        <w:br/>
+        <w:t xml:space="preserve">    """Custom exception raised when data validation fails."""</w:t>
+        <w:br/>
+        <w:t xml:space="preserve">    pass</w:t>
+        <w:br/>
+        <w:t>def validate_dataset(df):</w:t>
+        <w:br/>
+        <w:t xml:space="preserve">    """</w:t>
+        <w:br/>
+        <w:t xml:space="preserve">    Validates the structure and content of the loaded dataframe.</w:t>
+        <w:br/>
+        <w:t xml:space="preserve">    Args:</w:t>
+        <w:br/>
+        <w:t xml:space="preserve">        df (pd.DataFrame): The dataframe to validate.</w:t>
+        <w:br/>
+        <w:t xml:space="preserve">    Raises:</w:t>
+        <w:br/>
+        <w:t xml:space="preserve">        DataValidationError: If critical columns are missing.</w:t>
+        <w:br/>
+        <w:t xml:space="preserve">    """</w:t>
+        <w:br/>
+        <w:t xml:space="preserve">    required_cols = {'platform', 'category', 'hashtag', 'views', </w:t>
+        <w:br/>
+        <w:t xml:space="preserve">                     'likes', 'comments', 'shares', 'posts', 'engagement_rate'}</w:t>
+        <w:br/>
+        <w:t xml:space="preserve">    missing = required_cols - set(df.columns)</w:t>
+        <w:br/>
+        <w:t xml:space="preserve">    if missing:</w:t>
+        <w:br/>
+        <w:t xml:space="preserve">        msg = f"Dataset is missing required columns: {missing}"</w:t>
+        <w:br/>
+        <w:t xml:space="preserve">        raise DataValidationError(msg)</w:t>
+        <w:br/>
+        <w:t xml:space="preserve">    return True</w:t>
+        <w:br/>
+        <w:t>def load_data():</w:t>
+        <w:br/>
+        <w:t xml:space="preserve">    """</w:t>
+        <w:br/>
+        <w:t xml:space="preserve">    Load the dataset from the specified CSV file.</w:t>
+        <w:br/>
+        <w:t xml:space="preserve">    Performs data cleaning, normalizes column names, and validates content.</w:t>
+        <w:br/>
+        <w:t xml:space="preserve">    Returns:</w:t>
+        <w:br/>
+        <w:t xml:space="preserve">        pd.DataFrame: The loaded and cleaned dataset ready for visualization.</w:t>
+        <w:br/>
+        <w:t xml:space="preserve">    """</w:t>
+        <w:br/>
+        <w:t xml:space="preserve">    try:</w:t>
+        <w:br/>
+        <w:t xml:space="preserve">        if not os.path.exists(FILE_PATH):</w:t>
+        <w:br/>
+        <w:t xml:space="preserve">            print(f"Warning: {FILE_PATH} not found.")</w:t>
+        <w:br/>
+        <w:t xml:space="preserve">        df = pd.read_csv(FILE_PATH)</w:t>
+        <w:br/>
+        <w:t xml:space="preserve">        # Normalize column names by stripping whitespace and converting to lowercase</w:t>
+        <w:br/>
+        <w:t xml:space="preserve">        df.columns = [c.strip().lower() for c in df.columns]</w:t>
+        <w:br/>
+        <w:t xml:space="preserve">        # Validate dataset structure</w:t>
+        <w:br/>
+        <w:t xml:space="preserve">        validate_dataset(df)</w:t>
+        <w:br/>
+        <w:t xml:space="preserve">        return df</w:t>
+        <w:br/>
+        <w:t xml:space="preserve">    except Exception as e:</w:t>
+        <w:br/>
+        <w:t xml:space="preserve">        print(f"Error loading data: {e}")</w:t>
+        <w:br/>
+        <w:t xml:space="preserve">        # Return an empty dataframe with expected columns as fallback to prevent UI crashes</w:t>
+        <w:br/>
+        <w:t xml:space="preserve">        return pd.DataFrame(columns=[</w:t>
+        <w:br/>
+        <w:t xml:space="preserve">            'platform', 'category', 'hashtag', 'views', </w:t>
+        <w:br/>
+        <w:t xml:space="preserve">            'likes', 'comments', 'shares', 'posts', 'engagement_rate',</w:t>
+        <w:br/>
+        <w:t xml:space="preserve">            'country', 'date'</w:t>
+        <w:br/>
+        <w:t xml:space="preserve">        ])</w:t>
         <w:br/>
         <w:t># ==============================================================================</w:t>
         <w:br/>
-        <w:t># DATA HANDLING AND VALIDATION UTILITIES</w:t>
+        <w:t># FORMATTING UTILITIES</w:t>
         <w:br/>
         <w:t># ==============================================================================</w:t>
         <w:br/>
-        <w:t>class DataValidationError(Exception):</w:t>
-        <w:br/>
-        <w:t xml:space="preserve">    """Custom exception raised when data validation fails."""</w:t>
-        <w:br/>
-        <w:t xml:space="preserve">    pass</w:t>
-        <w:br/>
-        <w:t>def validate_dataset(df):</w:t>
+        <w:t>def fmt_num(n):</w:t>
         <w:br/>
         <w:t xml:space="preserve">    """</w:t>
         <w:br/>
-        <w:t xml:space="preserve">    Validates the structure and content of the loaded dataframe.</w:t>
+        <w:t xml:space="preserve">    Format a raw number into a human-readable string with K or M suffixes.</w:t>
+        <w:br/>
+        <w:t xml:space="preserve">    This is extremely useful for displaying large social media metrics </w:t>
+        <w:br/>
+        <w:t xml:space="preserve">    like views and likes without cluttering the UI.</w:t>
         <w:br/>
         <w:t xml:space="preserve">    Args:</w:t>
         <w:br/>
-        <w:t xml:space="preserve">        df (pd.DataFrame): The dataframe to validate.</w:t>
-        <w:br/>
-        <w:t xml:space="preserve">    Raises:</w:t>
-        <w:br/>
-        <w:t xml:space="preserve">        DataValidationError: If critical columns are missing.</w:t>
+        <w:t xml:space="preserve">        n (float/int/str): The numerical value to format.</w:t>
+        <w:br/>
+        <w:t xml:space="preserve">    Returns:</w:t>
+        <w:br/>
+        <w:t xml:space="preserve">        str: The formatted string (e.g., '1.5M', '45.2K', '800')</w:t>
         <w:br/>
         <w:t xml:space="preserve">    """</w:t>
         <w:br/>
-        <w:t xml:space="preserve">    required_cols = {'platform', 'category', 'hashtag', 'views', </w:t>
-        <w:br/>
-        <w:t xml:space="preserve">                     'likes', 'comments', 'shares', 'posts', 'engagement_rate'}</w:t>
-        <w:br/>
-        <w:t xml:space="preserve">    missing = required_cols - set(df.columns)</w:t>
-        <w:br/>
-        <w:t xml:space="preserve">    if missing:</w:t>
-        <w:br/>
-        <w:t xml:space="preserve">        msg = f"Dataset is missing required columns: {missing}"</w:t>
-        <w:br/>
-        <w:t xml:space="preserve">        raise DataValidationError(msg)</w:t>
-        <w:br/>
-        <w:t xml:space="preserve">    return True</w:t>
-        <w:br/>
-        <w:t>def load_data():</w:t>
+        <w:t xml:space="preserve">    try:</w:t>
+        <w:br/>
+        <w:t xml:space="preserve">        n = float(n)</w:t>
+        <w:br/>
+        <w:t xml:space="preserve">        if np.isnan(n):</w:t>
+        <w:br/>
+        <w:t xml:space="preserve">            return "0"</w:t>
+        <w:br/>
+        <w:t xml:space="preserve">        if n &gt;= 1e6: </w:t>
+        <w:br/>
+        <w:t xml:space="preserve">            return f"{n/1e6:.1f}M"</w:t>
+        <w:br/>
+        <w:t xml:space="preserve">        if n &gt;= 1e3: </w:t>
+        <w:br/>
+        <w:t xml:space="preserve">            return f"{n/1e3:.1f}K"</w:t>
+        <w:br/>
+        <w:t xml:space="preserve">        return str(int(n))</w:t>
+        <w:br/>
+        <w:t xml:space="preserve">    except (ValueError, TypeError):</w:t>
+        <w:br/>
+        <w:t xml:space="preserve">        return "0"</w:t>
+        <w:br/>
+        <w:t>def trunc(s, n=14):</w:t>
         <w:br/>
         <w:t xml:space="preserve">    """</w:t>
         <w:br/>
-        <w:t xml:space="preserve">    Load the dataset from the specified CSV file.</w:t>
-        <w:br/>
-        <w:t xml:space="preserve">    Performs data cleaning, normalizes column names, and validates content.</w:t>
+        <w:t xml:space="preserve">    Truncate a string to a specific maximum length and append an ellipsis.</w:t>
+        <w:br/>
+        <w:t xml:space="preserve">    Used primarily for tick labels in charts to prevent overlapping text.</w:t>
+        <w:br/>
+        <w:t xml:space="preserve">    Args:</w:t>
+        <w:br/>
+        <w:t xml:space="preserve">        s (str): The string to truncate.</w:t>
+        <w:br/>
+        <w:t xml:space="preserve">        n (int): Maximum allowed length before truncation.</w:t>
         <w:br/>
         <w:t xml:space="preserve">    Returns:</w:t>
         <w:br/>
-        <w:t xml:space="preserve">        pd.DataFrame: The loaded and cleaned dataset ready for visualization.</w:t>
+        <w:t xml:space="preserve">        str: The potentially truncated string.</w:t>
         <w:br/>
         <w:t xml:space="preserve">    """</w:t>
         <w:br/>
+        <w:t xml:space="preserve">    s = str(s)</w:t>
+        <w:br/>
+        <w:t xml:space="preserve">    if len(s) &lt;= n:</w:t>
+        <w:br/>
+        <w:t xml:space="preserve">        return s</w:t>
+        <w:br/>
+        <w:t xml:space="preserve">    return s[:n-1] + "..."</w:t>
+        <w:br/>
+        <w:br/>
+        <w:br/>
+        <w:t># ==============================================================================</w:t>
+        <w:br/>
+        <w:t># MATPLOTLIB UI INTEGRATION HELPER FUNCTIONS</w:t>
+        <w:br/>
+        <w:t># ==============================================================================</w:t>
+        <w:br/>
+        <w:t>def style_ax(ax, title="", xlabel="", ylabel=""):</w:t>
+        <w:br/>
+        <w:t xml:space="preserve">    """</w:t>
+        <w:br/>
+        <w:t xml:space="preserve">    Apply standard theming and styling to a matplotlib axes object.</w:t>
+        <w:br/>
+        <w:t xml:space="preserve">    </w:t>
+        <w:br/>
+        <w:t xml:space="preserve">    Args:</w:t>
+        <w:br/>
+        <w:t xml:space="preserve">        ax (matplotlib.axes.Axes): The axes object to style.</w:t>
+        <w:br/>
+        <w:t xml:space="preserve">        title (str): Optional title to display above the axes.</w:t>
+        <w:br/>
+        <w:t xml:space="preserve">        xlabel (str): Optional x-axis label.</w:t>
+        <w:br/>
+        <w:t xml:space="preserve">        ylabel (str): Optional y-axis label.</w:t>
+        <w:br/>
+        <w:t xml:space="preserve">    """</w:t>
+        <w:br/>
+        <w:t xml:space="preserve">    ax.set_facecolor(CARD)</w:t>
+        <w:br/>
+        <w:t xml:space="preserve">    </w:t>
+        <w:br/>
+        <w:t xml:space="preserve">    # Style the bounding box (spines)</w:t>
+        <w:br/>
+        <w:t xml:space="preserve">    for sp in ax.spines.values(): </w:t>
+        <w:br/>
+        <w:t xml:space="preserve">        sp.set_color(BORDER)</w:t>
+        <w:br/>
+        <w:t xml:space="preserve">        </w:t>
+        <w:br/>
+        <w:t xml:space="preserve">    # Style the ticks</w:t>
+        <w:br/>
+        <w:t xml:space="preserve">    ax.tick_params(axis="x", colors=FG) </w:t>
+        <w:br/>
+        <w:t xml:space="preserve">    ax.tick_params(axis="y", colors=FG)</w:t>
+        <w:br/>
+        <w:t xml:space="preserve">    </w:t>
+        <w:br/>
+        <w:t xml:space="preserve">    # Set titles and labels with specific thematic colors</w:t>
+        <w:br/>
+        <w:t xml:space="preserve">    if title: </w:t>
+        <w:br/>
+        <w:t xml:space="preserve">        ax.set_title(title, color=ACCENT2, fontsize=12, fontweight="bold", pad=8)</w:t>
+        <w:br/>
+        <w:t xml:space="preserve">    if xlabel: </w:t>
+        <w:br/>
+        <w:t xml:space="preserve">        ax.set_xlabel(xlabel, color=MUTED)</w:t>
+        <w:br/>
+        <w:t xml:space="preserve">    if ylabel: </w:t>
+        <w:br/>
+        <w:t xml:space="preserve">        ax.set_ylabel(ylabel, color=MUTED)</w:t>
+        <w:br/>
+        <w:br/>
+        <w:t>def fix_yticks(ax, fs=10):</w:t>
+        <w:br/>
+        <w:t xml:space="preserve">    """</w:t>
+        <w:br/>
+        <w:t xml:space="preserve">    Standardize the y-ticks on a horizontal bar chart.</w:t>
+        <w:br/>
+        <w:t xml:space="preserve">    Ensures that labels are horizontal (not rotated) and sized correctly.</w:t>
+        <w:br/>
+        <w:t xml:space="preserve">    """</w:t>
+        <w:br/>
+        <w:t xml:space="preserve">    ax.tick_params(axis="y", labelrotation=0, labelsize=fs, colors=FG)</w:t>
+        <w:br/>
+        <w:br/>
+        <w:t>def hbar(ax, labels, values, colors, fs=10, bh=0.65, vlabels=True):</w:t>
+        <w:br/>
+        <w:t xml:space="preserve">    """</w:t>
+        <w:br/>
+        <w:t xml:space="preserve">    Create a styled horizontal bar chart with optional value annotations.</w:t>
+        <w:br/>
+        <w:t xml:space="preserve">    </w:t>
+        <w:br/>
+        <w:t xml:space="preserve">    Args:</w:t>
+        <w:br/>
+        <w:t xml:space="preserve">        ax (matplotlib.axes.Axes): Matplotlib axes object.</w:t>
+        <w:br/>
+        <w:t xml:space="preserve">        labels (list): The categorical y-axis labels.</w:t>
+        <w:br/>
+        <w:t xml:space="preserve">        values (list): The numerical values determining bar length.</w:t>
+        <w:br/>
+        <w:t xml:space="preserve">        colors (list/str): Colors mapping to the bars.</w:t>
+        <w:br/>
+        <w:t xml:space="preserve">        fs (int): Font size for annotations and ticks.</w:t>
+        <w:br/>
+        <w:t xml:space="preserve">        bh (float): Height/thickness of the bars (0.0 to 1.0).</w:t>
+        <w:br/>
+        <w:t xml:space="preserve">        vlabels (bool): Whether to auto-annotate the bars with their values.</w:t>
+        <w:br/>
+        <w:t xml:space="preserve">        </w:t>
+        <w:br/>
+        <w:t xml:space="preserve">    Returns:</w:t>
+        <w:br/>
+        <w:t xml:space="preserve">        matplotlib.container.BarContainer: The created bar plot object.</w:t>
+        <w:br/>
+        <w:t xml:space="preserve">    """</w:t>
+        <w:br/>
+        <w:t xml:space="preserve">    bars = ax.barh(labels, values, color=colors, height=bh, edgecolor=BORDER, linewidth=0.5)</w:t>
+        <w:br/>
+        <w:t xml:space="preserve">    </w:t>
+        <w:br/>
+        <w:t xml:space="preserve">    if vlabels: </w:t>
+        <w:br/>
+        <w:t xml:space="preserve">        # Add numeric labels at the end of each bar</w:t>
+        <w:br/>
+        <w:t xml:space="preserve">        ax.bar_label(bars, fmt="%.1f", color=FG, fontsize=fs-1, padding=3)</w:t>
+        <w:br/>
+        <w:t xml:space="preserve">        </w:t>
+        <w:br/>
+        <w:t xml:space="preserve">    fix_yticks(ax, fs)</w:t>
+        <w:br/>
+        <w:t xml:space="preserve">    return bars</w:t>
+        <w:br/>
+        <w:br/>
+        <w:t>def embed(fig, parent):</w:t>
+        <w:br/>
+        <w:t xml:space="preserve">    """</w:t>
+        <w:br/>
+        <w:t xml:space="preserve">    Embed a matplotlib figure into a Tkinter parent frame container.</w:t>
+        <w:br/>
+        <w:t xml:space="preserve">    This links the matplotlib rendering engine with the Tkinter GUI.</w:t>
+        <w:br/>
+        <w:t xml:space="preserve">    </w:t>
+        <w:br/>
+        <w:t xml:space="preserve">    Args:</w:t>
+        <w:br/>
+        <w:t xml:space="preserve">        fig (matplotlib.figure.Figure): The figure to render.</w:t>
+        <w:br/>
+        <w:t xml:space="preserve">        parent (tk.Widget): The tkinter frame/widget to host the canvas.</w:t>
+        <w:br/>
+        <w:t xml:space="preserve">    """</w:t>
+        <w:br/>
+        <w:t xml:space="preserve">    c = FigureCanvasTkAgg(fig, master=parent)</w:t>
+        <w:br/>
+        <w:t xml:space="preserve">    c.draw()</w:t>
+        <w:br/>
+        <w:t xml:space="preserve">    # Pack the canvas widget to fill the entire parent container</w:t>
+        <w:br/>
+        <w:t xml:space="preserve">    c.get_tk_widget().pack(fill="both", expand=True)</w:t>
+        <w:br/>
+        <w:br/>
+        <w:t>def cell_tc(cmap, nv):</w:t>
+        <w:br/>
+        <w:t xml:space="preserve">    """</w:t>
+        <w:br/>
+        <w:t xml:space="preserve">    Calculate the appropriate text color (black or white) based on the </w:t>
+        <w:br/>
+        <w:t xml:space="preserve">    luminance of the background color generated by a colormap.</w:t>
+        <w:br/>
+        <w:t xml:space="preserve">    This ensures that text placed over a heatmap remains legible regardless</w:t>
+        <w:br/>
+        <w:t xml:space="preserve">    of how dark or light the heatmap cell is.</w:t>
+        <w:br/>
+        <w:t xml:space="preserve">    </w:t>
+        <w:br/>
+        <w:t xml:space="preserve">    Args:</w:t>
+        <w:br/>
+        <w:t xml:space="preserve">        cmap: A matplotlib colormap object.</w:t>
+        <w:br/>
+        <w:t xml:space="preserve">        nv (float): The normalized value (0.0 to 1.0) determining the color.</w:t>
+        <w:br/>
+        <w:t xml:space="preserve">        </w:t>
+        <w:br/>
+        <w:t xml:space="preserve">    Returns:</w:t>
+        <w:br/>
+        <w:t xml:space="preserve">        str: "black" or "white"</w:t>
+        <w:br/>
+        <w:t xml:space="preserve">    """</w:t>
+        <w:br/>
+        <w:t xml:space="preserve">    if nv is None or (isinstance(nv, float) and np.isnan(nv)): </w:t>
+        <w:br/>
+        <w:t xml:space="preserve">        return FG</w:t>
+        <w:br/>
+        <w:t xml:space="preserve">        </w:t>
+        <w:br/>
+        <w:t xml:space="preserve">    rgba = cmap(float(nv))</w:t>
+        <w:br/>
+        <w:t xml:space="preserve">    # Standard relative luminance formula</w:t>
+        <w:br/>
+        <w:t xml:space="preserve">    lum = 0.299 * rgba[0] + 0.587 * rgba[1] + 0.114 * rgba[2]</w:t>
+        <w:br/>
+        <w:t xml:space="preserve">    </w:t>
+        <w:br/>
+        <w:t xml:space="preserve">    return "black" if lum &gt; 0.50 else "white"</w:t>
+        <w:br/>
+        <w:br/>
+        <w:br/>
+        <w:t># ==============================================================================</w:t>
+        <w:br/>
+        <w:t># REUSABLE UI WIDGET COMPONENTS</w:t>
+        <w:br/>
+        <w:t># ==============================================================================</w:t>
+        <w:br/>
+        <w:br/>
+        <w:t>def page_header(p, title, sub=""):</w:t>
+        <w:br/>
+        <w:t xml:space="preserve">    """</w:t>
+        <w:br/>
+        <w:t xml:space="preserve">    Create a standardized, highly styled header block for a dashboard page.</w:t>
+        <w:br/>
+        <w:t xml:space="preserve">    This maintains visual consistency across all notebook tabs.</w:t>
+        <w:br/>
+        <w:t xml:space="preserve">    </w:t>
+        <w:br/>
+        <w:t xml:space="preserve">    Args:</w:t>
+        <w:br/>
+        <w:t xml:space="preserve">        p (tk.Widget): Parent widget.</w:t>
+        <w:br/>
+        <w:t xml:space="preserve">        title (str): Main page title (large, bold).</w:t>
+        <w:br/>
+        <w:t xml:space="preserve">        sub (str): Optional subtitle/description (smaller, muted).</w:t>
+        <w:br/>
+        <w:t xml:space="preserve">    """</w:t>
+        <w:br/>
+        <w:t xml:space="preserve">    hf = tk.Frame(p, bg=CARD, highlightbackground=ACCENT, highlightthickness=2)</w:t>
+        <w:br/>
+        <w:t xml:space="preserve">    hf.pack(fill="x", padx=18, pady=(12, 6))</w:t>
+        <w:br/>
+        <w:t xml:space="preserve">    </w:t>
+        <w:br/>
+        <w:t xml:space="preserve">    tk.Label(</w:t>
+        <w:br/>
+        <w:t xml:space="preserve">        hf, text=title, bg=CARD, fg=ACCENT2, font=("Segoe UI", 18, "bold")</w:t>
+        <w:br/>
+        <w:t xml:space="preserve">    ).pack(anchor="w", padx=16, pady=(10, 2))</w:t>
+        <w:br/>
+        <w:t xml:space="preserve">    </w:t>
+        <w:br/>
+        <w:t xml:space="preserve">    if sub: </w:t>
+        <w:br/>
+        <w:t xml:space="preserve">        tk.Label(</w:t>
+        <w:br/>
+        <w:t xml:space="preserve">            hf, text=sub, bg=CARD, fg=MUTED, font=("Segoe UI", 10)</w:t>
+        <w:br/>
+        <w:t xml:space="preserve">        ).pack(anchor="w", padx=16, pady=(0, 8))</w:t>
+        <w:br/>
+        <w:br/>
+        <w:t>def scrollable_table(parent, hdrs, cwidths, rows_data, row_colors_fn):</w:t>
+        <w:br/>
+        <w:t xml:space="preserve">    """</w:t>
+        <w:br/>
+        <w:t xml:space="preserve">    Constructs a fully custom scrollable data table utilizing a Canvas </w:t>
+        <w:br/>
+        <w:t xml:space="preserve">    to manage scroll regions containing grid-aligned labels.</w:t>
+        <w:br/>
+        <w:t xml:space="preserve">    </w:t>
+        <w:br/>
+        <w:t xml:space="preserve">    Args:</w:t>
+        <w:br/>
+        <w:t xml:space="preserve">        parent (tk.Widget): Parent tkinter widget.</w:t>
+        <w:br/>
+        <w:t xml:space="preserve">        hdrs (list): List of column header strings.</w:t>
+        <w:br/>
+        <w:t xml:space="preserve">        cwidths (list): List of column widths (in characters).</w:t>
+        <w:br/>
+        <w:t xml:space="preserve">        rows_data (list of lists): The actual data to display in the rows.</w:t>
+        <w:br/>
+        <w:t xml:space="preserve">        row_colors_fn (callable): A function that takes (row_idx, col_idx, value)</w:t>
+        <w:br/>
+        <w:t xml:space="preserve">                                  and returns a hex color string for the text.</w:t>
+        <w:br/>
+        <w:t xml:space="preserve">    """</w:t>
+        <w:br/>
+        <w:t xml:space="preserve">    # Outer frame to hold canvas and scrollbar</w:t>
+        <w:br/>
+        <w:t xml:space="preserve">    fr = tk.Frame(parent, bg=CARD, highlightbackground=ACCENT, highlightthickness=1)</w:t>
+        <w:br/>
+        <w:t xml:space="preserve">    fr.pack(side="left", fill="both", expand=True, padx=(0, 10))</w:t>
+        <w:br/>
+        <w:t xml:space="preserve">    </w:t>
+        <w:br/>
+        <w:t xml:space="preserve">    # The canvas allows for scrolling content that exceeds window bounds</w:t>
+        <w:br/>
+        <w:t xml:space="preserve">    cv = tk.Canvas(fr, bg=CARD, highlightthickness=0)</w:t>
+        <w:br/>
+        <w:t xml:space="preserve">    vs = ttk.Scrollbar(fr, orient="vertical", command=cv.yview)</w:t>
+        <w:br/>
+        <w:t xml:space="preserve">    </w:t>
+        <w:br/>
+        <w:t xml:space="preserve">    vs.pack(side="right", fill="y")</w:t>
+        <w:br/>
+        <w:t xml:space="preserve">    cv.pack(side="left", fill="both", expand=True)</w:t>
+        <w:br/>
+        <w:t xml:space="preserve">    cv.configure(yscrollcommand=vs.set)</w:t>
+        <w:br/>
+        <w:t xml:space="preserve">    </w:t>
+        <w:br/>
+        <w:t xml:space="preserve">    # Inner frame that actually contains the grid of labels</w:t>
+        <w:br/>
+        <w:t xml:space="preserve">    inner = tk.Frame(cv, bg=CARD)</w:t>
+        <w:br/>
+        <w:t xml:space="preserve">    win = cv.create_window((0, 0), window=inner, anchor="nw")</w:t>
+        <w:br/>
+        <w:t xml:space="preserve">    </w:t>
+        <w:br/>
+        <w:t xml:space="preserve">    # Dynamic resizing bindings</w:t>
+        <w:br/>
+        <w:t xml:space="preserve">    inner.bind("&lt;Configure&gt;", lambda e: cv.configure(scrollregion=cv.bbox("all")))</w:t>
+        <w:br/>
+        <w:t xml:space="preserve">    cv.bind("&lt;Configure&gt;", lambda e: cv.itemconfig(win, width=max(e.width, inner.winfo_reqwidth())))</w:t>
+        <w:br/>
+        <w:t xml:space="preserve">    </w:t>
+        <w:br/>
+        <w:t xml:space="preserve">    # Mouse wheel scrolling binding</w:t>
+        <w:br/>
+        <w:t xml:space="preserve">    def _on_mousewheel(event):</w:t>
+        <w:br/>
+        <w:t xml:space="preserve">        # 120 is the standard scroll delta factor on Windows</w:t>
+        <w:br/>
+        <w:t xml:space="preserve">        cv.yview_scroll(int(-1*(event.delta/120)), "units")</w:t>
+        <w:br/>
+        <w:t xml:space="preserve">        </w:t>
+        <w:br/>
+        <w:t xml:space="preserve">    cv.bind_all("&lt;MouseWheel&gt;", _on_mousewheel)</w:t>
+        <w:br/>
+        <w:t xml:space="preserve">    </w:t>
+        <w:br/>
+        <w:t xml:space="preserve">    # ---------------------------------------------------------</w:t>
+        <w:br/>
+        <w:t xml:space="preserve">    # Render Table Headers</w:t>
+        <w:br/>
+        <w:t xml:space="preserve">    # ---------------------------------------------------------</w:t>
+        <w:br/>
+        <w:t xml:space="preserve">    for i, (h, w) in enumerate(zip(hdrs, cwidths)):</w:t>
+        <w:br/>
+        <w:t xml:space="preserve">        lbl = tk.Label(</w:t>
+        <w:br/>
+        <w:t xml:space="preserve">            inner, text=h, bg=BORDER, fg=ACCENT, </w:t>
+        <w:br/>
+        <w:t xml:space="preserve">            font=FONT_THEAD, width=w, anchor="w"</w:t>
+        <w:br/>
+        <w:t xml:space="preserve">        )</w:t>
+        <w:br/>
+        <w:t xml:space="preserve">        lbl.grid(row=0, column=i, padx=8, pady=10, sticky="we")</w:t>
+        <w:br/>
+        <w:t xml:space="preserve">        </w:t>
+        <w:br/>
+        <w:t xml:space="preserve">    # ---------------------------------------------------------</w:t>
+        <w:br/>
+        <w:t xml:space="preserve">    # Render Table Rows Data</w:t>
+        <w:br/>
+        <w:t xml:space="preserve">    # ---------------------------------------------------------</w:t>
+        <w:br/>
+        <w:t xml:space="preserve">    for ridx, vals in enumerate(rows_data, 1):</w:t>
+        <w:br/>
+        <w:t xml:space="preserve">        # Alternating row colors for better readability (zebra striping)</w:t>
+        <w:br/>
+        <w:t xml:space="preserve">        cbg = CARD2 if ridx % 2 == 0 else CARD</w:t>
+        <w:br/>
+        <w:t xml:space="preserve">        </w:t>
+        <w:br/>
+        <w:t xml:space="preserve">        for cidx, (val, w) in enumerate(zip(vals, cwidths)):</w:t>
+        <w:br/>
+        <w:t xml:space="preserve">            col = row_colors_fn(ridx, cidx, val)</w:t>
+        <w:br/>
+        <w:t xml:space="preserve">            lbl = tk.Label(</w:t>
+        <w:br/>
+        <w:t xml:space="preserve">                inner, text=val, bg=cbg, fg=col, </w:t>
+        <w:br/>
+        <w:t xml:space="preserve">                font=FONT_TABLE, width=w, anchor="w"</w:t>
+        <w:br/>
+        <w:t xml:space="preserve">            )</w:t>
+        <w:br/>
+        <w:t xml:space="preserve">            lbl.grid(row=ridx, column=cidx, padx=8, pady=7, sticky="we")</w:t>
+        <w:br/>
+        <w:br/>
+        <w:br/>
+        <w:t># ==============================================================================</w:t>
+        <w:br/>
+        <w:t># DASHBOARD PAGES IMPLEMENTATION</w:t>
+        <w:br/>
+        <w:t># ==============================================================================</w:t>
+        <w:br/>
+        <w:br/>
+        <w:t>def page1(nb, df):</w:t>
+        <w:br/>
+        <w:t xml:space="preserve">    """</w:t>
+        <w:br/>
+        <w:t xml:space="preserve">    Builds the Overview Page (Page 1)</w:t>
+        <w:br/>
+        <w:t xml:space="preserve">    </w:t>
+        <w:br/>
+        <w:t xml:space="preserve">    This page acts as the executive summary of the entire dashboard.</w:t>
+        <w:br/>
+        <w:t xml:space="preserve">    It displays the most critical Key Performance Indicators (KPIs) on the left</w:t>
+        <w:br/>
+        <w:t xml:space="preserve">    and provides a high-level visual breakdown of platform reach, category</w:t>
+        <w:br/>
+        <w:t xml:space="preserve">    distribution, top hashtags, and average engagement rates on the right.</w:t>
+        <w:br/>
+        <w:t xml:space="preserve">    </w:t>
+        <w:br/>
+        <w:t xml:space="preserve">    Args:</w:t>
+        <w:br/>
+        <w:t xml:space="preserve">        nb (ttk.Notebook): The parent notebook to attach this page to.</w:t>
+        <w:br/>
+        <w:t xml:space="preserve">        df (pd.DataFrame): The master dataset.</w:t>
+        <w:br/>
+        <w:t xml:space="preserve">    """</w:t>
+        <w:br/>
+        <w:t xml:space="preserve">    p = tk.Frame(nb, bg=BG)</w:t>
+        <w:br/>
+        <w:t xml:space="preserve">    nb.add(p, text="  Overview  ")</w:t>
+        <w:br/>
+        <w:t xml:space="preserve">    </w:t>
+        <w:br/>
+        <w:t xml:space="preserve">    body = tk.Frame(p, bg=BG)</w:t>
+        <w:br/>
+        <w:t xml:space="preserve">    body.pack(fill="both", expand=True)</w:t>
+        <w:br/>
+        <w:t xml:space="preserve">    </w:t>
+        <w:br/>
+        <w:t xml:space="preserve">    # ---------------------------------------------------------</w:t>
+        <w:br/>
+        <w:t xml:space="preserve">    # Left Panel: KPIs (Key Performance Indicators)</w:t>
+        <w:br/>
+        <w:t xml:space="preserve">    # ---------------------------------------------------------</w:t>
+        <w:br/>
+        <w:t xml:space="preserve">    left = tk.Frame(body, bg=BG, width=300)</w:t>
+        <w:br/>
+        <w:t xml:space="preserve">    left.pack(side="left", fill="y", padx=(8, 6), pady=8)</w:t>
+        <w:br/>
+        <w:t xml:space="preserve">    left.pack_propagate(False) # Prevent frame from shrinking to fit content</w:t>
+        <w:br/>
+        <w:t xml:space="preserve">    </w:t>
+        <w:br/>
+        <w:t xml:space="preserve">    # Safely calculate aggregate metrics</w:t>
+        <w:br/>
         <w:t xml:space="preserve">    try:</w:t>
         <w:br/>
-        <w:t xml:space="preserve">        if not os.path.exists(FILE_PATH):</w:t>
-        <w:br/>
-        <w:t xml:space="preserve">        df = pd.read_csv(FILE_PATH)</w:t>
-        <w:br/>
-        <w:t xml:space="preserve">        # Normalize column names by stripping whitespace and converting to lowercase</w:t>
-        <w:br/>
-        <w:t xml:space="preserve">        df.columns = [c.strip().lower() for c in df.columns]</w:t>
-        <w:br/>
-        <w:t xml:space="preserve">        # Validate dataset structure</w:t>
-        <w:br/>
-        <w:t xml:space="preserve">        validate_dataset(df)</w:t>
-        <w:br/>
-        <w:t xml:space="preserve">        return df</w:t>
+        <w:t xml:space="preserve">        top_platform = df.groupby("platform")["views"].sum().idxmax()</w:t>
+        <w:br/>
+        <w:t xml:space="preserve">    except Exception:</w:t>
+        <w:br/>
+        <w:t xml:space="preserve">        top_platform = "N/A"</w:t>
+        <w:br/>
+        <w:t xml:space="preserve">        </w:t>
+        <w:br/>
+        <w:t xml:space="preserve">    try:</w:t>
+        <w:br/>
+        <w:t xml:space="preserve">        top_category = df.groupby("category")["engagement_rate"].mean().idxmax()</w:t>
+        <w:br/>
+        <w:t xml:space="preserve">    except Exception:</w:t>
+        <w:br/>
+        <w:t xml:space="preserve">        top_category = "N/A"</w:t>
+        <w:br/>
+        <w:t xml:space="preserve">        </w:t>
+        <w:br/>
+        <w:t xml:space="preserve">    avg_eng = df['engagement_rate'].mean() if not df.empty else 0.0</w:t>
+        <w:br/>
+        <w:br/>
+        <w:t xml:space="preserve">    kpis = [</w:t>
+        <w:br/>
+        <w:t xml:space="preserve">        ("Total Posts", fmt_num(df["posts"].sum()), "All platforms combined", ACCENT),</w:t>
+        <w:br/>
+        <w:t xml:space="preserve">        ("Total Views", fmt_num(df["views"].sum()), "Combined reach", ACCENT2),</w:t>
+        <w:br/>
+        <w:t xml:space="preserve">        ("Total Likes", fmt_num(df["likes"].sum()), "User reactions", GOOD),</w:t>
+        <w:br/>
+        <w:t xml:space="preserve">        ("Avg Engagement", f"{avg_eng:.2f}%", "(Likes+Cmts+Shares)/Views", MID),</w:t>
+        <w:br/>
+        <w:t xml:space="preserve">        ("Top Platform", top_platform, "By total views", PLATFORM_COLORS.get(top_platform, FG)),</w:t>
+        <w:br/>
+        <w:t xml:space="preserve">        ("Trending Category", top_category, "Highest avg engagement", WARN),</w:t>
+        <w:br/>
+        <w:t xml:space="preserve">    ]</w:t>
+        <w:br/>
+        <w:t xml:space="preserve">    </w:t>
+        <w:br/>
+        <w:t xml:space="preserve">    # Render KPI Cards</w:t>
+        <w:br/>
+        <w:t xml:space="preserve">    for title, val, sub, c in kpis:</w:t>
+        <w:br/>
+        <w:t xml:space="preserve">        card = tk.Frame(left, bg=CARD, padx=12, pady=8, highlightbackground=BORDER, highlightthickness=1)</w:t>
+        <w:br/>
+        <w:t xml:space="preserve">        card.pack(fill="x", pady=3)</w:t>
+        <w:br/>
+        <w:t xml:space="preserve">        </w:t>
+        <w:br/>
+        <w:t xml:space="preserve">        tk.Label(card, text=title, bg=CARD, fg=MUTED, font=("Segoe UI", 10)).pack(anchor="w")</w:t>
+        <w:br/>
+        <w:t xml:space="preserve">        tk.Label(card, text=val, bg=CARD, fg=c, font=("Segoe UI", 15, "bold")).pack(anchor="w")</w:t>
+        <w:br/>
+        <w:t xml:space="preserve">        </w:t>
+        <w:br/>
+        <w:t xml:space="preserve">        if sub: </w:t>
+        <w:br/>
+        <w:t xml:space="preserve">            tk.Label(card, text=sub, bg=CARD, fg=BORDER, font=("Segoe UI", 8)).pack(anchor="w")</w:t>
+        <w:br/>
+        <w:t xml:space="preserve">            </w:t>
+        <w:br/>
+        <w:t xml:space="preserve">    # ---------------------------------------------------------</w:t>
+        <w:br/>
+        <w:t xml:space="preserve">    # Right Panel: Visualization Grid</w:t>
+        <w:br/>
+        <w:t xml:space="preserve">    # ---------------------------------------------------------</w:t>
+        <w:br/>
+        <w:t xml:space="preserve">    right = tk.Frame(body, bg=BG)</w:t>
+        <w:br/>
+        <w:t xml:space="preserve">    right.pack(side="left", fill="both", expand=True, padx=(8, 18), pady=8)</w:t>
+        <w:br/>
+        <w:t xml:space="preserve">    </w:t>
+        <w:br/>
+        <w:t xml:space="preserve">    # Setup 2x2 Grid using GridSpec</w:t>
+        <w:br/>
+        <w:t xml:space="preserve">    fig = Figure(figsize=(10.5, 5.5), dpi=DPI)</w:t>
+        <w:br/>
+        <w:t xml:space="preserve">    fig.patch.set_facecolor(BG)</w:t>
+        <w:br/>
+        <w:t xml:space="preserve">    gs = GridSpec(2, 2, figure=fig, hspace=0.50, wspace=0.40)</w:t>
+        <w:br/>
+        <w:t xml:space="preserve">    </w:t>
+        <w:br/>
+        <w:t xml:space="preserve">    # --- Chart 1: Platform Reach (Horizontal Bar) ---</w:t>
+        <w:br/>
+        <w:t xml:space="preserve">    ax1 = fig.add_subplot(gs[0, 0])</w:t>
+        <w:br/>
+        <w:t xml:space="preserve">    if not df.empty:</w:t>
+        <w:br/>
+        <w:t xml:space="preserve">        pv = df.groupby("platform")["views"].sum().sort_values()</w:t>
+        <w:br/>
+        <w:t xml:space="preserve">        hbar(ax1, pv.index, pv.values/1e6, [PLATFORM_COLORS.get(p, ACCENT) for p in pv.index], fs=9, bh=0.55, vlabels=False)</w:t>
+        <w:br/>
+        <w:t xml:space="preserve">    style_ax(ax1, "Platform Reach (Million Views)")</w:t>
+        <w:br/>
+        <w:t xml:space="preserve">    </w:t>
+        <w:br/>
+        <w:t xml:space="preserve">    # --- Chart 2: Category Distribution (Donut Pie Chart) ---</w:t>
+        <w:br/>
+        <w:t xml:space="preserve">    ax2 = fig.add_subplot(gs[1, 0])</w:t>
+        <w:br/>
+        <w:t xml:space="preserve">    if not df.empty:</w:t>
+        <w:br/>
+        <w:t xml:space="preserve">        cat_cnt = df["category"].value_counts()</w:t>
+        <w:br/>
+        <w:t xml:space="preserve">        clrs = [CATEGORY_COLORS.get(c, ACCENT) for c in cat_cnt.index]</w:t>
+        <w:br/>
+        <w:t xml:space="preserve">        </w:t>
+        <w:br/>
+        <w:t xml:space="preserve">        wedges, _, autotexts = ax2.pie(</w:t>
+        <w:br/>
+        <w:t xml:space="preserve">            cat_cnt.values, colors=clrs, </w:t>
+        <w:br/>
+        <w:t xml:space="preserve">            autopct=lambda p: f"{p:.0f}%" if p &gt;= 5 else "", </w:t>
+        <w:br/>
+        <w:t xml:space="preserve">            pctdistance=0.75, startangle=90, </w:t>
+        <w:br/>
+        <w:t xml:space="preserve">            wedgeprops=dict(width=0.45, edgecolor=BG, linewidth=2.5), </w:t>
+        <w:br/>
+        <w:t xml:space="preserve">            radius=0.80</w:t>
+        <w:br/>
+        <w:t xml:space="preserve">        )</w:t>
+        <w:br/>
+        <w:t xml:space="preserve">        </w:t>
+        <w:br/>
+        <w:t xml:space="preserve">        # Adjust text color inside pie slices for readability</w:t>
+        <w:br/>
+        <w:t xml:space="preserve">        for at, wdg in zip(autotexts, wedges):</w:t>
+        <w:br/>
+        <w:t xml:space="preserve">            fc = wdg.get_facecolor()</w:t>
+        <w:br/>
+        <w:t xml:space="preserve">            lum = 0.299*fc[0] + 0.587*fc[1] + 0.114*fc[2]</w:t>
+        <w:br/>
+        <w:t xml:space="preserve">            at.set_fontsize(8)</w:t>
+        <w:br/>
+        <w:t xml:space="preserve">            at.set_fontweight("bold")</w:t>
+        <w:br/>
+        <w:t xml:space="preserve">            at.set_color("black" if lum &gt; 0.5 else "white")</w:t>
+        <w:br/>
+        <w:t xml:space="preserve">            </w:t>
+        <w:br/>
+        <w:t xml:space="preserve">        ax2.legend(wedges, [f"{c}({n})" for c, n in cat_cnt.items()], </w:t>
+        <w:br/>
+        <w:t xml:space="preserve">                   loc="upper center", bbox_to_anchor=(0.5, 0.0), ncol=2, </w:t>
+        <w:br/>
+        <w:t xml:space="preserve">                   fontsize=7, labelcolor=FG, facecolor=CARD, edgecolor=BORDER)</w:t>
+        <w:br/>
+        <w:t xml:space="preserve">                   </w:t>
+        <w:br/>
+        <w:t xml:space="preserve">    ax2.set_title("Category Distribution", color=ACCENT2, fontsize=11, fontweight="bold", pad=8)</w:t>
+        <w:br/>
+        <w:t xml:space="preserve">    </w:t>
+        <w:br/>
+        <w:t xml:space="preserve">    # --- Chart 3: Top Hashtags (Horizontal Bar) ---</w:t>
+        <w:br/>
+        <w:t xml:space="preserve">    ax3 = fig.add_subplot(gs[0, 1])</w:t>
+        <w:br/>
+        <w:t xml:space="preserve">    if not df.empty:</w:t>
+        <w:br/>
+        <w:t xml:space="preserve">        ht = df.groupby("hashtag")["views"].sum().nlargest(5).sort_values()</w:t>
+        <w:br/>
+        <w:t xml:space="preserve">        hbar(ax3, ht.index, ht.values/1e6, [ACCENT]*5, fs=9, bh=0.6)</w:t>
+        <w:br/>
+        <w:t xml:space="preserve">    style_ax(ax3, "Top 5 Hashtags (M Views)")</w:t>
+        <w:br/>
+        <w:t xml:space="preserve">    </w:t>
+        <w:br/>
+        <w:t xml:space="preserve">    # --- Chart 4: Average Engagement (Horizontal Bar with Avg Line) ---</w:t>
+        <w:br/>
+        <w:t xml:space="preserve">    ax4 = fig.add_subplot(gs[1, 1])</w:t>
+        <w:br/>
+        <w:t xml:space="preserve">    if not df.empty:</w:t>
+        <w:br/>
+        <w:t xml:space="preserve">        pe = df.groupby("platform")["engagement_rate"].mean().sort_values()</w:t>
+        <w:br/>
+        <w:t xml:space="preserve">        hbar(ax4, pe.index, pe.values, [PLATFORM_COLORS.get(p, ACCENT) for p in pe.index], fs=9, bh=0.55)</w:t>
+        <w:br/>
+        <w:t xml:space="preserve">        </w:t>
+        <w:br/>
+        <w:t xml:space="preserve">        # Add benchmark line at 3% engagement</w:t>
+        <w:br/>
+        <w:t xml:space="preserve">        ax4.axvline(3, color=MID, lw=1.3, ls="--", label="Avg 3%")</w:t>
+        <w:br/>
+        <w:t xml:space="preserve">        ax4.legend(fontsize=8, labelcolor=FG, facecolor=CARD, edgecolor=BORDER)</w:t>
+        <w:br/>
+        <w:t xml:space="preserve">        </w:t>
+        <w:br/>
+        <w:t xml:space="preserve">    style_ax(ax4, "Avg Engagement Rate (%)")</w:t>
+        <w:br/>
+        <w:t xml:space="preserve">    </w:t>
+        <w:br/>
+        <w:t xml:space="preserve">    # Layout adjustment and embedding</w:t>
+        <w:br/>
+        <w:t xml:space="preserve">    try:</w:t>
+        <w:br/>
+        <w:t xml:space="preserve">        fig.tight_layout(pad=1.5)</w:t>
         <w:br/>
         <w:t xml:space="preserve">    except Exception as e:</w:t>
         <w:br/>
-        <w:t xml:space="preserve">        # Return an empty dataframe with expected columns as fallback to prevent UI crashes</w:t>
-        <w:br/>
-        <w:t xml:space="preserve">        return pd.DataFrame(columns=[</w:t>
-        <w:br/>
-        <w:t xml:space="preserve">            'platform', 'category', 'hashtag', 'views', </w:t>
-        <w:br/>
-        <w:t xml:space="preserve">            'likes', 'comments', 'shares', 'posts', 'engagement_rate',</w:t>
-        <w:br/>
-        <w:t xml:space="preserve">            'country', 'date'</w:t>
-        <w:br/>
-        <w:t xml:space="preserve">        ])</w:t>
+        <w:t xml:space="preserve">        pass</w:t>
+        <w:br/>
+        <w:t xml:space="preserve">        </w:t>
+        <w:br/>
+        <w:t xml:space="preserve">    embed(fig, right)</w:t>
+        <w:br/>
+        <w:br/>
+        <w:br/>
+        <w:t>def page2(nb, df):</w:t>
+        <w:br/>
+        <w:t xml:space="preserve">    """</w:t>
+        <w:br/>
+        <w:t xml:space="preserve">    Builds the Platform Analysis Page (Page 2)</w:t>
+        <w:br/>
+        <w:t xml:space="preserve">    </w:t>
+        <w:br/>
+        <w:t xml:space="preserve">    This page isolates platform performance. It provides a detailed data table</w:t>
+        <w:br/>
+        <w:t xml:space="preserve">    containing all base metrics grouped by platform, accompanied by a 2x2 grid</w:t>
+        <w:br/>
+        <w:t xml:space="preserve">    of standard vertical bar charts comparing Likes, Shares, Comments, and Engagement.</w:t>
+        <w:br/>
+        <w:t xml:space="preserve">    </w:t>
+        <w:br/>
+        <w:t xml:space="preserve">    Args:</w:t>
+        <w:br/>
+        <w:t xml:space="preserve">        nb (ttk.Notebook): The parent notebook.</w:t>
+        <w:br/>
+        <w:t xml:space="preserve">        df (pd.DataFrame): The master dataset.</w:t>
+        <w:br/>
+        <w:t xml:space="preserve">    """</w:t>
+        <w:br/>
+        <w:t xml:space="preserve">    p = tk.Frame(nb, bg=BG)</w:t>
+        <w:br/>
+        <w:t xml:space="preserve">    nb.add(p, text="  Platform Analysis  ")</w:t>
+        <w:br/>
+        <w:t xml:space="preserve">    </w:t>
+        <w:br/>
+        <w:t xml:space="preserve">    page_header(p, "Platform-wise Social Media Performance", </w:t>
+        <w:br/>
+        <w:t xml:space="preserve">                "Detailed metrics comparison across all 5 platforms")</w:t>
+        <w:br/>
+        <w:t xml:space="preserve">    </w:t>
+        <w:br/>
+        <w:t xml:space="preserve">    body = tk.Frame(p, bg=BG)</w:t>
+        <w:br/>
+        <w:t xml:space="preserve">    body.pack(fill="both", expand=True, padx=16, pady=6)</w:t>
+        <w:br/>
+        <w:t xml:space="preserve">    </w:t>
+        <w:br/>
+        <w:t xml:space="preserve">    if df.empty:</w:t>
+        <w:br/>
+        <w:t xml:space="preserve">        return</w:t>
+        <w:br/>
+        <w:t xml:space="preserve">        </w:t>
+        <w:br/>
+        <w:t xml:space="preserve">    # Aggregate data by platform</w:t>
+        <w:br/>
+        <w:t xml:space="preserve">    plat_df = df.groupby("platform").agg(</w:t>
+        <w:br/>
+        <w:t xml:space="preserve">        posts=("posts", "sum"),</w:t>
+        <w:br/>
+        <w:t xml:space="preserve">        likes=("likes", "sum"),</w:t>
+        <w:br/>
+        <w:t xml:space="preserve">        views=("views", "sum"),</w:t>
+        <w:br/>
+        <w:t xml:space="preserve">        comments=("comments", "sum"),</w:t>
+        <w:br/>
+        <w:t xml:space="preserve">        shares=("shares", "sum"),</w:t>
+        <w:br/>
+        <w:t xml:space="preserve">        avg_eng=("engagement_rate", "mean")</w:t>
+        <w:br/>
+        <w:t xml:space="preserve">    ).reset_index().sort_values("views", ascending=False)</w:t>
+        <w:br/>
+        <w:t xml:space="preserve">    </w:t>
+        <w:br/>
+        <w:t xml:space="preserve">    # ---------------------------------------------------------</w:t>
+        <w:br/>
+        <w:t xml:space="preserve">    # Left Component: Data Table</w:t>
+        <w:br/>
+        <w:t xml:space="preserve">    # ---------------------------------------------------------</w:t>
+        <w:br/>
+        <w:t xml:space="preserve">    hdrs = ["PLATFORM", "POSTS", "LIKES", "VIEWS", "COMMENTS", "SHARES", "ENG%"]</w:t>
+        <w:br/>
+        <w:t xml:space="preserve">    cw = [14, 11, 11, 12, 11, 11, 9]</w:t>
+        <w:br/>
+        <w:t xml:space="preserve">    </w:t>
+        <w:br/>
+        <w:t xml:space="preserve">    rows = [</w:t>
+        <w:br/>
+        <w:t xml:space="preserve">        [</w:t>
+        <w:br/>
+        <w:t xml:space="preserve">            r["platform"], </w:t>
+        <w:br/>
+        <w:t xml:space="preserve">            fmt_num(r["posts"]), </w:t>
+        <w:br/>
+        <w:t xml:space="preserve">            fmt_num(r["likes"]), </w:t>
+        <w:br/>
+        <w:t xml:space="preserve">            fmt_num(r["views"]), </w:t>
+        <w:br/>
+        <w:t xml:space="preserve">            fmt_num(r["comments"]), </w:t>
+        <w:br/>
+        <w:t xml:space="preserve">            fmt_num(r["shares"]), </w:t>
+        <w:br/>
+        <w:t xml:space="preserve">            f"{r['avg_eng']:.2f}%"</w:t>
+        <w:br/>
+        <w:t xml:space="preserve">        ] </w:t>
+        <w:br/>
+        <w:t xml:space="preserve">        for _, r in plat_df.iterrows()</w:t>
+        <w:br/>
+        <w:t xml:space="preserve">    ]</w:t>
+        <w:br/>
+        <w:t xml:space="preserve">    </w:t>
+        <w:br/>
+        <w:t xml:space="preserve">    # Color logic: Platform names are colored, metrics remain default foreground</w:t>
+        <w:br/>
+        <w:t xml:space="preserve">    def colorfn(ri, ci, val): </w:t>
+        <w:br/>
+        <w:t xml:space="preserve">        return PLATFORM_COLORS.get(str(val), FG) if ci == 0 else FG</w:t>
+        <w:br/>
+        <w:t xml:space="preserve">        </w:t>
+        <w:br/>
+        <w:t xml:space="preserve">    scrollable_table(body, hdrs, cw, rows, colorfn)</w:t>
+        <w:br/>
+        <w:t xml:space="preserve">    </w:t>
+        <w:br/>
+        <w:t xml:space="preserve">    # ---------------------------------------------------------</w:t>
+        <w:br/>
+        <w:t xml:space="preserve">    # Right Component: Multi-metric Bar Charts</w:t>
+        <w:br/>
+        <w:t xml:space="preserve">    # ---------------------------------------------------------</w:t>
+        <w:br/>
+        <w:t xml:space="preserve">    ch = tk.Frame(body, bg=BG)</w:t>
+        <w:br/>
+        <w:t xml:space="preserve">    ch.pack(side="left", fill="both", expand=True)</w:t>
+        <w:br/>
+        <w:t xml:space="preserve">    </w:t>
+        <w:br/>
+        <w:t xml:space="preserve">    fig = Figure(figsize=(8.5, 6.0), dpi=DPI)</w:t>
+        <w:br/>
+        <w:t xml:space="preserve">    fig.patch.set_facecolor(BG)</w:t>
+        <w:br/>
+        <w:t xml:space="preserve">    gs = GridSpec(2, 2, figure=fig, hspace=0.65, wspace=0.46)</w:t>
+        <w:br/>
+        <w:t xml:space="preserve">    </w:t>
+        <w:br/>
+        <w:t xml:space="preserve">    plats = plat_df["platform"]</w:t>
+        <w:br/>
+        <w:t xml:space="preserve">    clrs = [PLATFORM_COLORS.get(p, ACCENT) for p in plats]</w:t>
+        <w:br/>
+        <w:t xml:space="preserve">    </w:t>
+        <w:br/>
+        <w:t xml:space="preserve">    # Define the 4 metrics to plot in the 2x2 grid</w:t>
+        <w:br/>
+        <w:t xml:space="preserve">    metrics = [</w:t>
+        <w:br/>
+        <w:t xml:space="preserve">        ("likes", "Likes (M)"),</w:t>
+        <w:br/>
+        <w:t xml:space="preserve">        ("shares", "Shares (M)"),</w:t>
+        <w:br/>
+        <w:t xml:space="preserve">        ("comments", "Comments (M)"),</w:t>
+        <w:br/>
+        <w:t xml:space="preserve">        ("avg_eng", "Avg Eng %")</w:t>
+        <w:br/>
+        <w:t xml:space="preserve">    ]</w:t>
+        <w:br/>
+        <w:t xml:space="preserve">    </w:t>
+        <w:br/>
+        <w:t xml:space="preserve">    for i, (col, title) in enumerate(metrics):</w:t>
+        <w:br/>
+        <w:t xml:space="preserve">        ax = fig.add_subplot(gs[i//2, i%2])</w:t>
+        <w:br/>
+        <w:t xml:space="preserve">        # Convert absolute metrics to millions for cleaner y-axis</w:t>
+        <w:br/>
+        <w:t xml:space="preserve">        vals = plat_df[col]/1e6 if col != "avg_eng" else plat_df[col]</w:t>
+        <w:br/>
+        <w:t xml:space="preserve">        </w:t>
+        <w:br/>
+        <w:t xml:space="preserve">        ax.bar(plats, vals, color=clrs, edgecolor=BORDER, linewidth=0.5)</w:t>
+        <w:br/>
+        <w:t xml:space="preserve">        style_ax(ax, title)</w:t>
+        <w:br/>
+        <w:t xml:space="preserve">        ax.tick_params(axis="x", rotation=15, colors=FG)</w:t>
+        <w:br/>
+        <w:t xml:space="preserve">        </w:t>
+        <w:br/>
+        <w:t xml:space="preserve">    fig.subplots_adjust(left=0.12, right=0.97, top=0.94, bottom=0.12)</w:t>
+        <w:br/>
+        <w:t xml:space="preserve">    embed(fig, ch)</w:t>
+        <w:br/>
+        <w:br/>
+        <w:br/>
+        <w:t>def page3(nb, df):</w:t>
+        <w:br/>
+        <w:t xml:space="preserve">    """</w:t>
+        <w:br/>
+        <w:t xml:space="preserve">    Builds the Category Trends Page (Page 3)</w:t>
+        <w:br/>
+        <w:t xml:space="preserve">    </w:t>
+        <w:br/>
+        <w:t xml:space="preserve">    This page analyzes data by the content category (e.g., Sports, Entertainment).</w:t>
+        <w:br/>
+        <w:t xml:space="preserve">    It features views vs engagement analysis, top hashtags within categories,</w:t>
+        <w:br/>
+        <w:t xml:space="preserve">    and the distribution of content output.</w:t>
+        <w:br/>
+        <w:t xml:space="preserve">    </w:t>
+        <w:br/>
+        <w:t xml:space="preserve">    Args:</w:t>
+        <w:br/>
+        <w:t xml:space="preserve">        nb (ttk.Notebook): The parent notebook.</w:t>
+        <w:br/>
+        <w:t xml:space="preserve">        df (pd.DataFrame): The master dataset.</w:t>
+        <w:br/>
+        <w:t xml:space="preserve">    """</w:t>
+        <w:br/>
+        <w:t xml:space="preserve">    p = tk.Frame(nb, bg=BG)</w:t>
+        <w:br/>
+        <w:t xml:space="preserve">    nb.add(p, text="  Category Trends  ")</w:t>
+        <w:br/>
+        <w:t xml:space="preserve">    </w:t>
+        <w:br/>
+        <w:t xml:space="preserve">    page_header(p, "Content Category Performance Analysis", </w:t>
+        <w:br/>
+        <w:t xml:space="preserve">                "Engagement and reach metrics by content category")</w:t>
+        <w:br/>
+        <w:t xml:space="preserve">    </w:t>
+        <w:br/>
+        <w:t xml:space="preserve">    if df.empty:</w:t>
+        <w:br/>
+        <w:t xml:space="preserve">        return</w:t>
+        <w:br/>
+        <w:t xml:space="preserve">        </w:t>
+        <w:br/>
+        <w:t xml:space="preserve">    fig = Figure(figsize=(12, 6.5), dpi=DPI)</w:t>
+        <w:br/>
+        <w:t xml:space="preserve">    fig.patch.set_facecolor(BG)</w:t>
+        <w:br/>
+        <w:t xml:space="preserve">    gs = GridSpec(2, 2, figure=fig, hspace=0.50, wspace=0.35)</w:t>
+        <w:br/>
+        <w:t xml:space="preserve">    </w:t>
+        <w:br/>
+        <w:t xml:space="preserve">    # Aggregate by Category</w:t>
+        <w:br/>
+        <w:t xml:space="preserve">    cat_df = df.groupby("category").agg(</w:t>
+        <w:br/>
+        <w:t xml:space="preserve">        views=("views", "sum"), </w:t>
+        <w:br/>
+        <w:t xml:space="preserve">        eng=("engagement_rate", "mean")</w:t>
+        <w:br/>
+        <w:t xml:space="preserve">    ).sort_values("views", ascending=False)</w:t>
+        <w:br/>
+        <w:t xml:space="preserve">    </w:t>
+        <w:br/>
+        <w:t xml:space="preserve">    # --- Top Left: Views by Category ---</w:t>
+        <w:br/>
+        <w:t xml:space="preserve">    ax1 = fig.add_subplot(gs[0, 0])</w:t>
+        <w:br/>
+        <w:t xml:space="preserve">    ax1.barh(</w:t>
+        <w:br/>
+        <w:t xml:space="preserve">        cat_df.index, cat_df["views"]/1e6, </w:t>
+        <w:br/>
+        <w:t xml:space="preserve">        color=[CATEGORY_COLORS.get(c, ACCENT) for c in cat_df.index],</w:t>
+        <w:br/>
+        <w:t xml:space="preserve">        height=0.6, edgecolor=BORDER, linewidth=0.5</w:t>
+        <w:br/>
+        <w:t xml:space="preserve">    )</w:t>
+        <w:br/>
+        <w:t xml:space="preserve">    style_ax(ax1, "Views by Category (M)")</w:t>
+        <w:br/>
+        <w:t xml:space="preserve">    fix_yticks(ax1, 9)</w:t>
+        <w:br/>
+        <w:t xml:space="preserve">    </w:t>
+        <w:br/>
+        <w:t xml:space="preserve">    # --- Top Right: Engagement by Category ---</w:t>
+        <w:br/>
+        <w:t xml:space="preserve">    ax2 = fig.add_subplot(gs[0, 1])</w:t>
+        <w:br/>
+        <w:t xml:space="preserve">    ce = cat_df.sort_values("eng")</w:t>
+        <w:br/>
+        <w:t xml:space="preserve">    ax2.barh(</w:t>
+        <w:br/>
+        <w:t xml:space="preserve">        ce.index, ce["eng"], </w:t>
+        <w:br/>
+        <w:t xml:space="preserve">        color=[CATEGORY_COLORS.get(c, ACCENT) for c in ce.index],</w:t>
+        <w:br/>
+        <w:t xml:space="preserve">        height=0.6, edgecolor=BORDER, linewidth=0.5</w:t>
+        <w:br/>
+        <w:t xml:space="preserve">    )</w:t>
+        <w:br/>
+        <w:t xml:space="preserve">    ax2.axvline(3, color=MID, lw=1.3, ls="--")</w:t>
+        <w:br/>
+        <w:t xml:space="preserve">    style_ax(ax2, "Avg Engagement Rate (%)")</w:t>
+        <w:br/>
+        <w:t xml:space="preserve">    fix_yticks(ax2, 9)</w:t>
+        <w:br/>
+        <w:t xml:space="preserve">    </w:t>
+        <w:br/>
+        <w:t xml:space="preserve">    # --- Bottom Left: Top 10 Hashtags by Engagement ---</w:t>
+        <w:br/>
+        <w:t xml:space="preserve">    ax3 = fig.add_subplot(gs[1, 0])</w:t>
+        <w:br/>
+        <w:t xml:space="preserve">    ht = df.groupby("hashtag")["engagement_rate"].mean().nlargest(10).sort_values()</w:t>
+        <w:br/>
+        <w:t xml:space="preserve">    ax3.barh(</w:t>
+        <w:br/>
+        <w:t xml:space="preserve">        ht.index, ht.values, </w:t>
+        <w:br/>
+        <w:t xml:space="preserve">        color=[ACCENT2]*10, </w:t>
+        <w:br/>
+        <w:t xml:space="preserve">        height=0.6, edgecolor=BORDER, linewidth=0.5</w:t>
+        <w:br/>
+        <w:t xml:space="preserve">    )</w:t>
+        <w:br/>
+        <w:t xml:space="preserve">    style_ax(ax3, "Top 10 Hashtags by Eng Rate")</w:t>
+        <w:br/>
+        <w:t xml:space="preserve">    fix_yticks(ax3, 8)</w:t>
+        <w:br/>
+        <w:t xml:space="preserve">    </w:t>
+        <w:br/>
+        <w:t xml:space="preserve">    # --- Bottom Right: Posts Output per Category (Pie) ---</w:t>
+        <w:br/>
+        <w:t xml:space="preserve">    ax4 = fig.add_subplot(gs[1, 1])</w:t>
+        <w:br/>
+        <w:t xml:space="preserve">    cat_posts = df["category"].value_counts()</w:t>
+        <w:br/>
+        <w:t xml:space="preserve">    clrs = [CATEGORY_COLORS.get(c, ACCENT) for c in cat_posts.index]</w:t>
+        <w:br/>
+        <w:t xml:space="preserve">    </w:t>
+        <w:br/>
+        <w:t xml:space="preserve">    wedges, _, ats = ax4.pie(</w:t>
+        <w:br/>
+        <w:t xml:space="preserve">        cat_posts.values, colors=clrs, </w:t>
+        <w:br/>
+        <w:t xml:space="preserve">        autopct=lambda p: f"{p:.0f}%" if p &gt;= 5 else "", </w:t>
+        <w:br/>
+        <w:t xml:space="preserve">        pctdistance=0.75, startangle=90, </w:t>
+        <w:br/>
+        <w:t xml:space="preserve">        wedgeprops=dict(width=0.45, edgecolor=BG, linewidth=2), </w:t>
+        <w:br/>
+        <w:t xml:space="preserve">        radius=0.80</w:t>
+        <w:br/>
+        <w:t xml:space="preserve">    )</w:t>
+        <w:br/>
+        <w:t xml:space="preserve">    </w:t>
+        <w:br/>
+        <w:t xml:space="preserve">    for at, wdg in zip(ats, wedges):</w:t>
+        <w:br/>
+        <w:t xml:space="preserve">        fc = wdg.get_facecolor()</w:t>
+        <w:br/>
+        <w:t xml:space="preserve">        lum = 0.299*fc[0] + 0.587*fc[1] + 0.114*fc[2]</w:t>
+        <w:br/>
+        <w:t xml:space="preserve">        at.set_fontsize(8)</w:t>
+        <w:br/>
+        <w:t xml:space="preserve">        at.set_fontweight("bold")</w:t>
+        <w:br/>
+        <w:t xml:space="preserve">        at.set_color("black" if lum &gt; 0.5 else "white")</w:t>
+        <w:br/>
+        <w:t xml:space="preserve">        </w:t>
+        <w:br/>
+        <w:t xml:space="preserve">    ax4.set_title("Posts per Category", color=ACCENT2, fontsize=11, fontweight="bold", pad=8)</w:t>
+        <w:br/>
+        <w:t xml:space="preserve">    ax4.legend(</w:t>
+        <w:br/>
+        <w:t xml:space="preserve">        wedges, cat_posts.index, </w:t>
+        <w:br/>
+        <w:t xml:space="preserve">        loc="upper center", bbox_to_anchor=(0.5, 0.0), </w:t>
+        <w:br/>
+        <w:t xml:space="preserve">        ncol=2, fontsize=7, labelcolor=FG, </w:t>
+        <w:br/>
+        <w:t xml:space="preserve">        facecolor=CARD, edgecolor=BORDER</w:t>
+        <w:br/>
+        <w:t xml:space="preserve">    )</w:t>
+        <w:br/>
+        <w:t xml:space="preserve">    </w:t>
+        <w:br/>
+        <w:t xml:space="preserve">    fig.subplots_adjust(left=0.18, right=0.96, top=0.92, bottom=0.08)</w:t>
+        <w:br/>
+        <w:t xml:space="preserve">    embed(fig, p)</w:t>
+        <w:br/>
+        <w:br/>
+        <w:br/>
+        <w:t>def page4(nb, df):</w:t>
+        <w:br/>
+        <w:t xml:space="preserve">    """</w:t>
+        <w:br/>
+        <w:t xml:space="preserve">    Builds the Hashtag Rankings Page (Page 4)</w:t>
+        <w:br/>
+        <w:t xml:space="preserve">    </w:t>
+        <w:br/>
+        <w:t xml:space="preserve">    This page is designed for deep-diving into specific topics (hashtags).</w:t>
+        <w:br/>
+        <w:t xml:space="preserve">    It features a comprehensive scrollable ranking table alongside</w:t>
+        <w:br/>
+        <w:t xml:space="preserve">    two charts highlighting the absolute best and worst performers.</w:t>
+        <w:br/>
+        <w:t xml:space="preserve">    </w:t>
+        <w:br/>
+        <w:t xml:space="preserve">    Args:</w:t>
+        <w:br/>
+        <w:t xml:space="preserve">        nb (ttk.Notebook): The parent notebook.</w:t>
+        <w:br/>
+        <w:t xml:space="preserve">        df (pd.DataFrame): The master dataset.</w:t>
+        <w:br/>
+        <w:t xml:space="preserve">    """</w:t>
+        <w:br/>
+        <w:t xml:space="preserve">    p = tk.Frame(nb, bg=BG)</w:t>
+        <w:br/>
+        <w:t xml:space="preserve">    nb.add(p, text="  Hashtag Rankings  ")</w:t>
+        <w:br/>
+        <w:t xml:space="preserve">    </w:t>
+        <w:br/>
+        <w:t xml:space="preserve">    page_header(p, "Hashtag Performance Rankings", </w:t>
+        <w:br/>
+        <w:t xml:space="preserve">                "Top and bottom performing hashtags by total views")</w:t>
+        <w:br/>
+        <w:t xml:space="preserve">    </w:t>
+        <w:br/>
+        <w:t xml:space="preserve">    outer = tk.Frame(p, bg=BG)</w:t>
+        <w:br/>
+        <w:t xml:space="preserve">    outer.pack(fill="both", expand=True, padx=16, pady=6)</w:t>
+        <w:br/>
+        <w:t xml:space="preserve">    </w:t>
+        <w:br/>
+        <w:t xml:space="preserve">    if df.empty:</w:t>
+        <w:br/>
+        <w:t xml:space="preserve">        return</w:t>
+        <w:br/>
+        <w:t xml:space="preserve">        </w:t>
+        <w:br/>
+        <w:t xml:space="preserve">    # Aggregate data by hashtag, taking the first category (assuming 1-to-1 mapping)</w:t>
+        <w:br/>
+        <w:t xml:space="preserve">    ht_df = df.groupby("hashtag").agg(</w:t>
+        <w:br/>
+        <w:t xml:space="preserve">        category=("category", "first"),</w:t>
+        <w:br/>
+        <w:t xml:space="preserve">        views=("views", "sum"),</w:t>
+        <w:br/>
+        <w:t xml:space="preserve">        likes=("likes", "sum"),</w:t>
+        <w:br/>
+        <w:t xml:space="preserve">        eng=("engagement_rate", "mean"),</w:t>
+        <w:br/>
+        <w:t xml:space="preserve">        posts=("posts", "sum")</w:t>
+        <w:br/>
+        <w:t xml:space="preserve">    ).reset_index().sort_values("views", ascending=False).reset_index(drop=True)</w:t>
+        <w:br/>
+        <w:t xml:space="preserve">    </w:t>
+        <w:br/>
+        <w:t xml:space="preserve">    # ---------------------------------------------------------</w:t>
+        <w:br/>
+        <w:t xml:space="preserve">    # Left Component: Full Rankings Table</w:t>
+        <w:br/>
+        <w:t xml:space="preserve">    # ---------------------------------------------------------</w:t>
+        <w:br/>
+        <w:t xml:space="preserve">    hdrs = ["#", "HASHTAG", "CATEGORY", "VIEWS", "LIKES", "ENG%", "POSTS"]</w:t>
+        <w:br/>
+        <w:t xml:space="preserve">    cw = [4, 16, 14, 11, 11, 9, 11]</w:t>
+        <w:br/>
+        <w:t xml:space="preserve">    </w:t>
+        <w:br/>
+        <w:t xml:space="preserve">    rows = [</w:t>
+        <w:br/>
+        <w:t xml:space="preserve">        [</w:t>
+        <w:br/>
+        <w:t xml:space="preserve">            i+1, </w:t>
+        <w:br/>
+        <w:t xml:space="preserve">            r["hashtag"], </w:t>
+        <w:br/>
+        <w:t xml:space="preserve">            r["category"], </w:t>
+        <w:br/>
+        <w:t xml:space="preserve">            fmt_num(r["views"]), </w:t>
+        <w:br/>
+        <w:t xml:space="preserve">            fmt_num(r["likes"]), </w:t>
+        <w:br/>
+        <w:t xml:space="preserve">            f"{r['eng']:.2f}%", </w:t>
+        <w:br/>
+        <w:t xml:space="preserve">            fmt_num(r["posts"])</w:t>
+        <w:br/>
+        <w:t xml:space="preserve">        ] </w:t>
+        <w:br/>
+        <w:t xml:space="preserve">        for i, (_, r) in enumerate(ht_df.iterrows())</w:t>
+        <w:br/>
+        <w:t xml:space="preserve">    ]</w:t>
+        <w:br/>
+        <w:t xml:space="preserve">    </w:t>
+        <w:br/>
+        <w:t xml:space="preserve">    def colorfn(ri, ci, val):</w:t>
+        <w:br/>
+        <w:t xml:space="preserve">        if ci == 0: return MUTED</w:t>
+        <w:br/>
+        <w:t xml:space="preserve">        if ci == 2: return CATEGORY_COLORS.get(str(val), FG)</w:t>
+        <w:br/>
+        <w:t xml:space="preserve">        return FG</w:t>
+        <w:br/>
+        <w:t xml:space="preserve">        </w:t>
+        <w:br/>
+        <w:t xml:space="preserve">    scrollable_table(outer, hdrs, cw, rows, colorfn)</w:t>
+        <w:br/>
+        <w:t xml:space="preserve">    </w:t>
+        <w:br/>
+        <w:t xml:space="preserve">    # ---------------------------------------------------------</w:t>
+        <w:br/>
+        <w:t xml:space="preserve">    # Right Component: Top &amp; Bottom 10 Visualizations</w:t>
+        <w:br/>
+        <w:t xml:space="preserve">    # ---------------------------------------------------------</w:t>
+        <w:br/>
+        <w:t xml:space="preserve">    frr = tk.Frame(outer, bg=CARD, highlightbackground=ACCENT, highlightthickness=1)</w:t>
+        <w:br/>
+        <w:t xml:space="preserve">    frr.pack(side="left", fill="both", expand=True)</w:t>
+        <w:br/>
+        <w:t xml:space="preserve">    </w:t>
+        <w:br/>
+        <w:t xml:space="preserve">    fig = Figure(figsize=(6.8, 6.0), dpi=DPI)</w:t>
+        <w:br/>
+        <w:t xml:space="preserve">    fig.patch.set_facecolor(CARD)</w:t>
+        <w:br/>
+        <w:t xml:space="preserve">    </w:t>
+        <w:br/>
+        <w:t xml:space="preserve">    # Top 10 Performers</w:t>
+        <w:br/>
+        <w:t xml:space="preserve">    ax1 = fig.add_subplot(211)</w:t>
+        <w:br/>
+        <w:t xml:space="preserve">    ax1.set_facecolor(CARD)</w:t>
+        <w:br/>
+        <w:t xml:space="preserve">    t10 = ht_df.head(10).sort_values("views")</w:t>
+        <w:br/>
+        <w:t xml:space="preserve">    hbar(ax1, t10["hashtag"], t10["views"]/1e6, [WARN]*10, fs=9, bh=0.60, vlabels=False)</w:t>
+        <w:br/>
+        <w:t xml:space="preserve">    ax1.set_title("[HIGH] Top 10 Most Viewed", color=ACCENT2, fontsize=10, fontweight="bold", pad=6)</w:t>
+        <w:br/>
+        <w:t xml:space="preserve">    fix_yticks(ax1, 9)</w:t>
+        <w:br/>
+        <w:t xml:space="preserve">    </w:t>
+        <w:br/>
+        <w:t xml:space="preserve">    # Bottom 10 Performers</w:t>
+        <w:br/>
+        <w:t xml:space="preserve">    ax2 = fig.add_subplot(212)</w:t>
+        <w:br/>
+        <w:t xml:space="preserve">    ax2.set_facecolor(CARD)</w:t>
+        <w:br/>
+        <w:t xml:space="preserve">    b10 = ht_df.tail(10).sort_values("views", ascending=False)</w:t>
+        <w:br/>
+        <w:t xml:space="preserve">    hbar(ax2, b10["hashtag"], b10["views"]/1e6, [GOOD]*10, fs=9, bh=0.60, vlabels=False)</w:t>
+        <w:br/>
+        <w:t xml:space="preserve">    ax2.set_title("[LOW] Bottom 10 Least Viewed", color=ACCENT2, fontsize=10, fontweight="bold", pad=6)</w:t>
+        <w:br/>
+        <w:t xml:space="preserve">    fix_yticks(ax2, 9)</w:t>
+        <w:br/>
+        <w:t xml:space="preserve">    </w:t>
+        <w:br/>
+        <w:t xml:space="preserve">    fig.subplots_adjust(left=0.32, right=0.96, top=0.92, bottom=0.08, hspace=0.60)</w:t>
+        <w:br/>
+        <w:t xml:space="preserve">    embed(fig, frr)</w:t>
+        <w:br/>
+        <w:br/>
+        <w:br/>
+        <w:t>def page5(nb, df):</w:t>
+        <w:br/>
+        <w:t xml:space="preserve">    """</w:t>
+        <w:br/>
+        <w:t xml:space="preserve">    Builds the Heatmap &amp; Correlation Page (Page 5)</w:t>
+        <w:br/>
+        <w:t xml:space="preserve">    </w:t>
+        <w:br/>
+        <w:t xml:space="preserve">    This page focuses on statistical relationships.</w:t>
+        <w:br/>
+        <w:t xml:space="preserve">    1. A Correlation Matrix showing how numerical metrics relate.</w:t>
+        <w:br/>
+        <w:t xml:space="preserve">    2. A 2D Heatmap showing Platform vs Category engagement intensity.</w:t>
+        <w:br/>
+        <w:t xml:space="preserve">    </w:t>
+        <w:br/>
+        <w:t xml:space="preserve">    Args:</w:t>
+        <w:br/>
+        <w:t xml:space="preserve">        nb (ttk.Notebook): The parent notebook.</w:t>
+        <w:br/>
+        <w:t xml:space="preserve">        df (pd.DataFrame): The master dataset.</w:t>
+        <w:br/>
+        <w:t xml:space="preserve">    """</w:t>
+        <w:br/>
+        <w:t xml:space="preserve">    p = tk.Frame(nb, bg=BG)</w:t>
+        <w:br/>
+        <w:t xml:space="preserve">    nb.add(p, text="  Heatmap &amp; Correlation  ")</w:t>
+        <w:br/>
+        <w:t xml:space="preserve">    </w:t>
+        <w:br/>
+        <w:t xml:space="preserve">    page_header(p, "Metric Correlation &amp; Platform x Category Heatmap", </w:t>
+        <w:br/>
+        <w:t xml:space="preserve">                "Left: inter-metric correlation  |  Right: normalised engagement heatmap")</w:t>
+        <w:br/>
+        <w:t xml:space="preserve">                </w:t>
+        <w:br/>
+        <w:t xml:space="preserve">    if df.empty:</w:t>
+        <w:br/>
+        <w:t xml:space="preserve">        return</w:t>
+        <w:br/>
+        <w:t xml:space="preserve">        </w:t>
+        <w:br/>
+        <w:t xml:space="preserve">    fig = Figure(figsize=(12, 5.8), dpi=DPI)</w:t>
+        <w:br/>
+        <w:t xml:space="preserve">    fig.subplots_adjust(left=0.10, right=0.96, top=0.88, bottom=0.18, wspace=0.35)</w:t>
+        <w:br/>
+        <w:t xml:space="preserve">    fig.patch.set_facecolor(BG)</w:t>
+        <w:br/>
+        <w:t xml:space="preserve">    </w:t>
+        <w:br/>
+        <w:t xml:space="preserve">    # --- Left: Metric Correlation Matrix ---</w:t>
+        <w:br/>
+        <w:t xml:space="preserve">    cols = ["posts", "likes", "views", "comments", "shares", "engagement_rate"]</w:t>
+        <w:br/>
+        <w:t xml:space="preserve">    lbls = ["Posts", "Likes", "Views", "Comments", "Shares", "Eng Rate"]</w:t>
+        <w:br/>
+        <w:t xml:space="preserve">    </w:t>
+        <w:br/>
+        <w:t xml:space="preserve">    # Calculate Pearson correlation coefficient</w:t>
+        <w:br/>
+        <w:t xml:space="preserve">    corr = df[cols].corr()</w:t>
+        <w:br/>
+        <w:t xml:space="preserve">    </w:t>
+        <w:br/>
+        <w:t xml:space="preserve">    ax1 = fig.add_subplot(121)</w:t>
+        <w:br/>
+        <w:t xml:space="preserve">    im1 = ax1.imshow(corr.values, cmap="PuOr", vmin=-1, vmax=1, aspect="auto")</w:t>
+        <w:br/>
+        <w:t xml:space="preserve">    </w:t>
+        <w:br/>
+        <w:t xml:space="preserve">    # Set up ticks and labels</w:t>
+        <w:br/>
+        <w:t xml:space="preserve">    ax1.set_xticks(range(len(lbls)))</w:t>
+        <w:br/>
+        <w:t xml:space="preserve">    ax1.set_xticklabels(lbls, rotation=35, ha="right", fontsize=10, color=FG)</w:t>
+        <w:br/>
+        <w:t xml:space="preserve">    ax1.set_yticks(range(len(lbls)))</w:t>
+        <w:br/>
+        <w:t xml:space="preserve">    ax1.set_yticklabels(lbls, fontsize=10, color=FG)</w:t>
+        <w:br/>
+        <w:t xml:space="preserve">    </w:t>
+        <w:br/>
+        <w:t xml:space="preserve">    # Overlay correlation values text onto the matrix cells</w:t>
+        <w:br/>
+        <w:t xml:space="preserve">    cmap1 = plt.get_cmap("PuOr")</w:t>
+        <w:br/>
+        <w:t xml:space="preserve">    for i in range(len(lbls)):</w:t>
+        <w:br/>
+        <w:t xml:space="preserve">        for j in range(len(lbls)):</w:t>
+        <w:br/>
+        <w:t xml:space="preserve">            v = corr.values[i, j]</w:t>
+        <w:br/>
+        <w:t xml:space="preserve">            # Calculate appropriate text color based on cell background</w:t>
+        <w:br/>
+        <w:t xml:space="preserve">            tc = cell_tc(cmap1, (v+1)/2)</w:t>
+        <w:br/>
+        <w:t xml:space="preserve">            ax1.text(j, i, f"{v:.2f}", ha="center", va="center", </w:t>
+        <w:br/>
+        <w:t xml:space="preserve">                     fontsize=10, fontweight="bold", color=tc)</w:t>
+        <w:br/>
+        <w:t xml:space="preserve">                     </w:t>
+        <w:br/>
+        <w:t xml:space="preserve">    cb1 = fig.colorbar(im1, ax=ax1, shrink=0.80)</w:t>
+        <w:br/>
+        <w:t xml:space="preserve">    cb1.ax.yaxis.set_tick_params(color=FG, labelsize=10)</w:t>
+        <w:br/>
+        <w:t xml:space="preserve">    plt.setp(cb1.ax.yaxis.get_ticklabels(), color=FG)</w:t>
+        <w:br/>
+        <w:t xml:space="preserve">    style_ax(ax1, "Metric Correlation Matrix")</w:t>
+        <w:br/>
+        <w:t xml:space="preserve">    </w:t>
+        <w:br/>
+        <w:t xml:space="preserve">    # --- Right: Platform x Category Heatmap ---</w:t>
+        <w:br/>
+        <w:t xml:space="preserve">    # Create pivot table for 2D representation</w:t>
+        <w:br/>
+        <w:t xml:space="preserve">    pivot = df.pivot_table(index="platform", columns="category", values="engagement_rate", aggfunc="mean")</w:t>
+        <w:br/>
+        <w:t xml:space="preserve">    </w:t>
+        <w:br/>
+        <w:t xml:space="preserve">    # Normalize data using Min-Max scaling for visual colormapping</w:t>
+        <w:br/>
+        <w:t xml:space="preserve">    norm = (pivot - pivot.min()) / (pivot.max() - pivot.min())</w:t>
+        <w:br/>
+        <w:t xml:space="preserve">    </w:t>
+        <w:br/>
+        <w:t xml:space="preserve">    ax2 = fig.add_subplot(122)</w:t>
+        <w:br/>
+        <w:t xml:space="preserve">    cmap2 = plt.get_cmap("magma")</w:t>
+        <w:br/>
+        <w:t xml:space="preserve">    im2 = ax2.imshow(norm.values, cmap="magma", aspect="auto", vmin=0, vmax=1)</w:t>
+        <w:br/>
+        <w:t xml:space="preserve">    </w:t>
+        <w:br/>
+        <w:t xml:space="preserve">    # Setup axis ticks</w:t>
+        <w:br/>
+        <w:t xml:space="preserve">    ax2.set_xticks(range(len(pivot.columns)))</w:t>
+        <w:br/>
+        <w:t xml:space="preserve">    ax2.set_xticklabels([trunc(c, 9) for c in pivot.columns], fontsize=9, color=FG, rotation=35, ha="right")</w:t>
+        <w:br/>
+        <w:t xml:space="preserve">    ax2.set_yticks(range(len(pivot.index)))</w:t>
+        <w:br/>
+        <w:t xml:space="preserve">    ax2.set_yticklabels(pivot.index, fontsize=10, color=FG)</w:t>
+        <w:br/>
+        <w:t xml:space="preserve">    </w:t>
+        <w:br/>
+        <w:t xml:space="preserve">    # Overlay engagement rate values text</w:t>
+        <w:br/>
+        <w:t xml:space="preserve">    for i in range(len(pivot.index)):</w:t>
+        <w:br/>
+        <w:t xml:space="preserve">        for j in range(len(pivot.columns)):</w:t>
+        <w:br/>
+        <w:t xml:space="preserve">            rv = pivot.values[i, j]</w:t>
+        <w:br/>
+        <w:t xml:space="preserve">            nv = norm.values[i, j]</w:t>
+        <w:br/>
+        <w:t xml:space="preserve">            </w:t>
+        <w:br/>
+        <w:t xml:space="preserve">            # Handle empty cells (NaN) gracefully</w:t>
+        <w:br/>
+        <w:t xml:space="preserve">            txt = "nan" if (isinstance(rv, float) and np.isnan(rv)) else f"{rv:.1f}"</w:t>
+        <w:br/>
+        <w:t xml:space="preserve">            tc = cell_tc(cmap2, None if (isinstance(nv, float) and np.isnan(nv)) else nv)</w:t>
+        <w:br/>
+        <w:t xml:space="preserve">            </w:t>
+        <w:br/>
+        <w:t xml:space="preserve">            ax2.text(j, i, txt, ha="center", va="center", fontsize=9, color=tc)</w:t>
+        <w:br/>
+        <w:t xml:space="preserve">            </w:t>
+        <w:br/>
+        <w:t xml:space="preserve">    cb2 = fig.colorbar(im2, ax=ax2, shrink=0.80)</w:t>
+        <w:br/>
+        <w:t xml:space="preserve">    cb2.ax.yaxis.set_tick_params(color=FG, labelsize=10)</w:t>
+        <w:br/>
+        <w:t xml:space="preserve">    plt.setp(cb2.ax.yaxis.get_ticklabels(), color=FG)</w:t>
+        <w:br/>
+        <w:t xml:space="preserve">    style_ax(ax2, "Platform x Category Engagement")</w:t>
+        <w:br/>
+        <w:t xml:space="preserve">    </w:t>
+        <w:br/>
+        <w:t xml:space="preserve">    embed(fig, p)</w:t>
+        <w:br/>
+        <w:br/>
         <w:br/>
         <w:t># ==============================================================================</w:t>
         <w:br/>
-        <w:t># FORMATTING UTILITIES</w:t>
+        <w:t># MAIN APPLICATION ASSEMBLY AND LAUNCH</w:t>
         <w:br/>
         <w:t># ==============================================================================</w:t>
         <w:br/>
-        <w:t>def fmt_num(n):</w:t>
+        <w:br/>
+        <w:t>def build_dashboard(root, df):</w:t>
         <w:br/>
         <w:t xml:space="preserve">    """</w:t>
         <w:br/>
-        <w:t xml:space="preserve">    Format a raw number into a human-readable string with K or M suffixes.</w:t>
-        <w:br/>
-        <w:t xml:space="preserve">    This is extremely useful for displaying large social media metrics </w:t>
-        <w:br/>
-        <w:t xml:space="preserve">    like views and likes without cluttering the UI.</w:t>
+        <w:t xml:space="preserve">    Assemble the complete dashboard structure including the main notebook and all pages.</w:t>
+        <w:br/>
+        <w:t xml:space="preserve">    This acts as the orchestrator combining all previous UI functions.</w:t>
+        <w:br/>
+        <w:t xml:space="preserve">    </w:t>
         <w:br/>
         <w:t xml:space="preserve">    Args:</w:t>
         <w:br/>
-        <w:t xml:space="preserve">        n (float/int/str): The numerical value to format.</w:t>
-        <w:br/>
-        <w:t xml:space="preserve">    Returns:</w:t>
-        <w:br/>
-        <w:t xml:space="preserve">        str: The formatted string (e.g., '1.5M', '45.2K', '800')</w:t>
+        <w:t xml:space="preserve">        root (tk.Tk): Main application window.</w:t>
+        <w:br/>
+        <w:t xml:space="preserve">        df (pd.DataFrame): Dataset to visualize.</w:t>
         <w:br/>
         <w:t xml:space="preserve">    """</w:t>
         <w:br/>
+        <w:t xml:space="preserve">    </w:t>
+        <w:br/>
+        <w:t xml:space="preserve">    # --- Top Application Header ---</w:t>
+        <w:br/>
+        <w:t xml:space="preserve">    hdr = tk.Frame(root, bg=CARD, highlightbackground=ACCENT, highlightthickness=2)</w:t>
+        <w:br/>
+        <w:t xml:space="preserve">    hdr.pack(fill="x", padx=16, pady=(10, 4))</w:t>
+        <w:br/>
+        <w:t xml:space="preserve">    </w:t>
+        <w:br/>
+        <w:t xml:space="preserve">    lh = tk.Frame(hdr, bg=CARD)</w:t>
+        <w:br/>
+        <w:t xml:space="preserve">    lh.pack(side="left", padx=14, pady=10)</w:t>
+        <w:br/>
+        <w:t xml:space="preserve">    tk.Label(</w:t>
+        <w:br/>
+        <w:t xml:space="preserve">        lh, text="Social Media Trends Analytics Dashboard", </w:t>
+        <w:br/>
+        <w:t xml:space="preserve">        bg=CARD, fg=FG, font=("Segoe UI", 22, "bold")</w:t>
+        <w:br/>
+        <w:t xml:space="preserve">    ).pack(anchor="w")</w:t>
+        <w:br/>
+        <w:t xml:space="preserve">             </w:t>
+        <w:br/>
+        <w:t xml:space="preserve">    # Prepare dynamic subtext based on dataset dimensions</w:t>
+        <w:br/>
         <w:t xml:space="preserve">    try:</w:t>
         <w:br/>
-        <w:t xml:space="preserve">        n = float(n)</w:t>
-        <w:br/>
-        <w:t xml:space="preserve">        if np.isnan(n):</w:t>
-        <w:br/>
-        <w:t xml:space="preserve">            return "0"</w:t>
-        <w:br/>
-        <w:t xml:space="preserve">        if n &gt;= 1e6: </w:t>
-        <w:br/>
-        <w:t xml:space="preserve">            return f"{n/1e6:.1f}M"</w:t>
-        <w:br/>
-        <w:t xml:space="preserve">        if n &gt;= 1e3: </w:t>
-        <w:br/>
-        <w:t xml:space="preserve">            return f"{n/1e3:.1f}K"</w:t>
-        <w:br/>
-        <w:t xml:space="preserve">        return str(int(n))</w:t>
-        <w:br/>
-        <w:t xml:space="preserve">    except (ValueError, TypeError):</w:t>
-        <w:br/>
-        <w:t xml:space="preserve">        return "0"</w:t>
-        <w:br/>
-        <w:t>def trunc(s, n=14):</w:t>
+        <w:t xml:space="preserve">        stats_str = (</w:t>
+        <w:br/>
+        <w:t xml:space="preserve">            f"{len(df)} Records  |  "</w:t>
+        <w:br/>
+        <w:t xml:space="preserve">            f"{df['platform'].nunique()} Platforms  |  "</w:t>
+        <w:br/>
+        <w:t xml:space="preserve">            f"{df['category'].nunique()} Categories  |  "</w:t>
+        <w:br/>
+        <w:t xml:space="preserve">            f"{df['country'].nunique()} Countries"</w:t>
+        <w:br/>
+        <w:t xml:space="preserve">        )</w:t>
+        <w:br/>
+        <w:t xml:space="preserve">    except Exception:</w:t>
+        <w:br/>
+        <w:t xml:space="preserve">        stats_str = "Data loading error - using default schema"</w:t>
+        <w:br/>
+        <w:t xml:space="preserve">        </w:t>
+        <w:br/>
+        <w:t xml:space="preserve">    tk.Label(lh, bg=CARD, fg=MUTED, font=("Segoe UI", 10), text=stats_str).pack(anchor="w")</w:t>
+        <w:br/>
+        <w:t xml:space="preserve">    </w:t>
+        <w:br/>
+        <w:t xml:space="preserve">    # Right side author block</w:t>
+        <w:br/>
+        <w:t xml:space="preserve">    rh = tk.Frame(hdr, bg=CARD)</w:t>
+        <w:br/>
+        <w:t xml:space="preserve">    rh.pack(side="right", padx=14, pady=10)</w:t>
+        <w:br/>
+        <w:t xml:space="preserve">    </w:t>
+        <w:br/>
+        <w:t xml:space="preserve">    tk.Label(rh, text="DVA Assignment 2", bg=CARD, fg=ACCENT, font=("Segoe UI", 12, "bold")).pack(anchor="e")</w:t>
+        <w:br/>
+        <w:t xml:space="preserve">    tk.Label(rh, text="Akshat Tripathi | 04914202023", bg=CARD, fg=ACCENT2, font=("Segoe UI", 10, "bold")).pack(anchor="e")</w:t>
+        <w:br/>
+        <w:t xml:space="preserve">    tk.Label(rh, text="IPU BCA 6th Semester", bg=CARD, fg=MUTED, font=("Segoe UI", 9)).pack(anchor="e")</w:t>
+        <w:br/>
+        <w:br/>
+        <w:t xml:space="preserve">    # --- Notebook (Tabbed Interface) Setup ---</w:t>
+        <w:br/>
+        <w:t xml:space="preserve">    st = ttk.Style()</w:t>
+        <w:br/>
+        <w:t xml:space="preserve">    st.theme_use("default")</w:t>
+        <w:br/>
+        <w:t xml:space="preserve">    </w:t>
+        <w:br/>
+        <w:t xml:space="preserve">    # Configure colors and fonts for notebook tabs to match the dark theme</w:t>
+        <w:br/>
+        <w:t xml:space="preserve">    st.configure("TNotebook", background=BG, borderwidth=0)</w:t>
+        <w:br/>
+        <w:t xml:space="preserve">    st.configure("TNotebook.Tab", background=CARD, foreground=FG, padding=(28, 11), font=("Segoe UI", 11, "bold"))</w:t>
+        <w:br/>
+        <w:t xml:space="preserve">    st.map("TNotebook.Tab", background=[("selected", "#B983FF")], foreground=[("selected", "#13111C")])</w:t>
+        <w:br/>
+        <w:t xml:space="preserve">    </w:t>
+        <w:br/>
+        <w:t xml:space="preserve">    nb = ttk.Notebook(root, style="TNotebook")</w:t>
+        <w:br/>
+        <w:t xml:space="preserve">    nb.pack(fill="both", expand=True, padx=12, pady=8)</w:t>
+        <w:br/>
+        <w:t xml:space="preserve">    </w:t>
+        <w:br/>
+        <w:t xml:space="preserve">    # Initialize and append all 5 analytical pages</w:t>
+        <w:br/>
+        <w:t xml:space="preserve">    page1(nb, df)</w:t>
+        <w:br/>
+        <w:t xml:space="preserve">    page2(nb, df)</w:t>
+        <w:br/>
+        <w:t xml:space="preserve">    page3(nb, df)</w:t>
+        <w:br/>
+        <w:t xml:space="preserve">    page4(nb, df)</w:t>
+        <w:br/>
+        <w:t xml:space="preserve">    page5(nb, df)</w:t>
+        <w:br/>
+        <w:t xml:space="preserve">    </w:t>
+        <w:br/>
+        <w:br/>
+        <w:br/>
+        <w:t>def main():</w:t>
         <w:br/>
         <w:t xml:space="preserve">    """</w:t>
         <w:br/>
-        <w:t xml:space="preserve">    Truncate a string to a specific maximum length and append an ellipsis.</w:t>
-        <w:br/>
-        <w:t xml:space="preserve">    Used primarily for tick labels in charts to prevent overlapping text.</w:t>
-        <w:br/>
-        <w:t xml:space="preserve">    Args:</w:t>
-        <w:br/>
-        <w:t xml:space="preserve">        s (str): The string to truncate.</w:t>
-        <w:br/>
-        <w:t xml:space="preserve">        n (int): Maximum allowed length before truncation.</w:t>
-        <w:br/>
-        <w:t xml:space="preserve">    Returns:</w:t>
-        <w:br/>
-        <w:t xml:space="preserve">        str: The potentially truncated string.</w:t>
+        <w:t xml:space="preserve">    Application entry point.</w:t>
+        <w:br/>
+        <w:t xml:space="preserve">    Initializes the Tkinter main loop, configures the base window,</w:t>
+        <w:br/>
+        <w:t xml:space="preserve">    loads the data, and triggers the dashboard build process.</w:t>
         <w:br/>
         <w:t xml:space="preserve">    """</w:t>
         <w:br/>
-        <w:t xml:space="preserve">    s = str(s)</w:t>
-        <w:br/>
-        <w:t xml:space="preserve">    if len(s) &lt;= n:</w:t>
-        <w:br/>
-        <w:t xml:space="preserve">        return s</w:t>
-        <w:br/>
-        <w:t xml:space="preserve">    return s[:n-1] + "..."</w:t>
-        <w:br/>
-        <w:br/>
-        <w:br/>
-        <w:t># ==============================================================================</w:t>
-        <w:br/>
-        <w:t># MATPLOTLIB UI INTEGRATION HELPER FUNCTIONS</w:t>
-        <w:br/>
-        <w:t># ==============================================================================</w:t>
-        <w:br/>
-        <w:t>def style_ax(ax, title="", xlabel="", ylabel=""):</w:t>
-        <w:br/>
-        <w:t xml:space="preserve">    """</w:t>
-        <w:br/>
-        <w:t xml:space="preserve">    Apply standard theming and styling to a matplotlib axes object.</w:t>
-        <w:br/>
         <w:t xml:space="preserve">    </w:t>
         <w:br/>
-        <w:t xml:space="preserve">    Args:</w:t>
-        <w:br/>
-        <w:t xml:space="preserve">        ax (matplotlib.axes.Axes): The axes object to style.</w:t>
-        <w:br/>
-        <w:t xml:space="preserve">        title (str): Optional title to display above the axes.</w:t>
-        <w:br/>
-        <w:t xml:space="preserve">        xlabel (str): Optional x-axis label.</w:t>
-        <w:br/>
-        <w:t xml:space="preserve">        ylabel (str): Optional y-axis label.</w:t>
-        <w:br/>
-        <w:t xml:space="preserve">    """</w:t>
-        <w:br/>
-        <w:t xml:space="preserve">    ax.set_facecolor(CARD)</w:t>
+        <w:t xml:space="preserve">    # Initialize main window</w:t>
+        <w:br/>
+        <w:t xml:space="preserve">    root = tk.Tk()</w:t>
+        <w:br/>
+        <w:t xml:space="preserve">    root.title("Social Media Trends Dashboard - Akshat Tripathi | 04914202023")</w:t>
+        <w:br/>
+        <w:t xml:space="preserve">    root.configure(bg=BG)</w:t>
         <w:br/>
         <w:t xml:space="preserve">    </w:t>
         <w:br/>
-        <w:t xml:space="preserve">    # Style the bounding box (spines)</w:t>
-        <w:br/>
-        <w:t xml:space="preserve">    for sp in ax.spines.values(): </w:t>
-        <w:br/>
-        <w:t xml:space="preserve">        sp.set_color(BORDER)</w:t>
-        <w:br/>
-        <w:t xml:space="preserve">        </w:t>
-        <w:br/>
-        <w:t xml:space="preserve">    # Style the ticks</w:t>
-        <w:br/>
-        <w:t xml:space="preserve">    ax.tick_params(axis="x", colors=FG) </w:t>
-        <w:br/>
-        <w:t xml:space="preserve">    ax.tick_params(axis="y", colors=FG)</w:t>
+        <w:t xml:space="preserve">    # Attempt to maximize window based on OS capabilities</w:t>
+        <w:br/>
+        <w:t xml:space="preserve">    try:</w:t>
+        <w:br/>
+        <w:t xml:space="preserve">        root.state("zoomed") # Works on Windows</w:t>
+        <w:br/>
+        <w:t xml:space="preserve">    except tk.TclError:</w:t>
+        <w:br/>
+        <w:t xml:space="preserve">        try:</w:t>
+        <w:br/>
+        <w:t xml:space="preserve">            root.attributes('-zoomed', True) # Works on some Linux environments</w:t>
+        <w:br/>
+        <w:t xml:space="preserve">        except Exception as e:</w:t>
+        <w:br/>
+        <w:t xml:space="preserve">            pass  # Window will open in default size if maximize fails</w:t>
         <w:br/>
         <w:t xml:space="preserve">    </w:t>
-        <w:br/>
-        <w:t xml:space="preserve">    # Set titles and labels with specific thematic colors</w:t>
-        <w:br/>
-        <w:t xml:space="preserve">    if title: </w:t>
-        <w:br/>
-        <w:t xml:space="preserve">        ax.set_title(title, color=ACCENT2, fontsize=12, fontweight="bold", pad=8)</w:t>
-        <w:br/>
-        <w:t xml:space="preserve">    if xlabel: </w:t>
-        <w:br/>
-        <w:t xml:space="preserve">        ax.set_xlabel(xlabel, color=MUTED)</w:t>
-        <w:br/>
-        <w:t xml:space="preserve">    if ylabel: </w:t>
-        <w:br/>
-        <w:t xml:space="preserve">        ax.set_ylabel(ylabel, color=MUTED)</w:t>
-        <w:br/>
-        <w:br/>
-        <w:t>def fix_yticks(ax, fs=10):</w:t>
-        <w:br/>
-        <w:t xml:space="preserve">    """</w:t>
-        <w:br/>
-        <w:t xml:space="preserve">    Standardize the y-ticks on a horizontal bar chart.</w:t>
-        <w:br/>
-        <w:t xml:space="preserve">    Ensures that labels are horizontal (not rotated) and sized correctly.</w:t>
-        <w:br/>
-        <w:t xml:space="preserve">    """</w:t>
-        <w:br/>
-        <w:t xml:space="preserve">    ax.tick_params(axis="y", labelrotation=0, labelsize=fs, colors=FG)</w:t>
-        <w:br/>
-        <w:br/>
-        <w:t>def hbar(ax, labels, values, colors, fs=10, bh=0.65, vlabels=True):</w:t>
-        <w:br/>
-        <w:t xml:space="preserve">    """</w:t>
-        <w:br/>
-        <w:t xml:space="preserve">    Create a styled horizontal bar chart with optional value annotations.</w:t>
-        <w:br/>
-        <w:t xml:space="preserve">    </w:t>
-        <w:br/>
-        <w:t xml:space="preserve">    Args:</w:t>
-        <w:br/>
-        <w:t xml:space="preserve">        ax (matplotlib.axes.Axes): Matplotlib axes object.</w:t>
-        <w:br/>
-        <w:t xml:space="preserve">        labels (list): The categorical y-axis labels.</w:t>
-        <w:br/>
-        <w:t xml:space="preserve">        values (list): The numerical values determining bar length.</w:t>
-        <w:br/>
-        <w:t xml:space="preserve">        colors (list/str): Colors mapping to the bars.</w:t>
-        <w:br/>
-        <w:t xml:space="preserve">        fs (int): Font size for annotations and ticks.</w:t>
-        <w:br/>
-        <w:t xml:space="preserve">        bh (float): Height/thickness of the bars (0.0 to 1.0).</w:t>
-        <w:br/>
-        <w:t xml:space="preserve">        vlabels (bool): Whether to auto-annotate the bars with their values.</w:t>
-        <w:br/>
-        <w:t xml:space="preserve">        </w:t>
-        <w:br/>
-        <w:t xml:space="preserve">    Returns:</w:t>
-        <w:br/>
-        <w:t xml:space="preserve">        matplotlib.container.BarContainer: The created bar plot object.</w:t>
-        <w:br/>
-        <w:t xml:space="preserve">    """</w:t>
-        <w:br/>
-        <w:t xml:space="preserve">    bars = ax.barh(labels, values, color=colors, height=bh, edgecolor=BORDER, linewidth=0.5)</w:t>
-        <w:br/>
-        <w:t xml:space="preserve">    </w:t>
-        <w:br/>
-        <w:t xml:space="preserve">    if vlabels: </w:t>
-        <w:br/>
-        <w:t xml:space="preserve">        # Add numeric labels at the end of each bar</w:t>
-        <w:br/>
-        <w:t xml:space="preserve">        ax.bar_label(bars, fmt="%.1f", color=FG, fontsize=fs-1, padding=3)</w:t>
-        <w:br/>
-        <w:t xml:space="preserve">        </w:t>
-        <w:br/>
-        <w:t xml:space="preserve">    fix_yticks(ax, fs)</w:t>
-        <w:br/>
-        <w:t xml:space="preserve">    return bars</w:t>
-        <w:br/>
-        <w:br/>
-        <w:t>def embed(fig, parent):</w:t>
-        <w:br/>
-        <w:t xml:space="preserve">    """</w:t>
-        <w:br/>
-        <w:t xml:space="preserve">    Embed a matplotlib figure into a Tkinter parent frame container.</w:t>
-        <w:br/>
-        <w:t xml:space="preserve">    This links the matplotlib rendering engine with the Tkinter GUI.</w:t>
-        <w:br/>
-        <w:t xml:space="preserve">    </w:t>
-        <w:br/>
-        <w:t xml:space="preserve">    Args:</w:t>
-        <w:br/>
-        <w:t xml:space="preserve">        fig (matplotlib.figure.Figure): The figure to render.</w:t>
-        <w:br/>
-        <w:t xml:space="preserve">        parent (tk.Widget): The tkinter frame/widget to host the canvas.</w:t>
-        <w:br/>
-        <w:t xml:space="preserve">    """</w:t>
-        <w:br/>
-        <w:t xml:space="preserve">    c = FigureCanvasTkAgg(fig, master=parent)</w:t>
-        <w:br/>
-        <w:t xml:space="preserve">    c.draw()</w:t>
-        <w:br/>
-        <w:t xml:space="preserve">    # Pack the canvas widget to fill the entire parent container</w:t>
-        <w:br/>
-        <w:t xml:space="preserve">    c.get_tk_widget().pack(fill="both", expand=True)</w:t>
-        <w:br/>
-        <w:br/>
-        <w:t>def cell_tc(cmap, nv):</w:t>
-        <w:br/>
-        <w:t xml:space="preserve">    """</w:t>
-        <w:br/>
-        <w:t xml:space="preserve">    Calculate the appropriate text color (black or white) based on the </w:t>
-        <w:br/>
-        <w:t xml:space="preserve">    luminance of the background color generated by a colormap.</w:t>
-        <w:br/>
-        <w:t xml:space="preserve">    This ensures that text placed over a heatmap remains legible regardless</w:t>
-        <w:br/>
-        <w:t xml:space="preserve">    of how dark or light the heatmap cell is.</w:t>
-        <w:br/>
-        <w:t xml:space="preserve">    </w:t>
-        <w:br/>
-        <w:t xml:space="preserve">    Args:</w:t>
-        <w:br/>
-        <w:t xml:space="preserve">        cmap: A matplotlib colormap object.</w:t>
-        <w:br/>
-        <w:t xml:space="preserve">        nv (float): The normalized value (0.0 to 1.0) determining the color.</w:t>
-        <w:br/>
-        <w:t xml:space="preserve">        </w:t>
-        <w:br/>
-        <w:t xml:space="preserve">    Returns:</w:t>
-        <w:br/>
-        <w:t xml:space="preserve">        str: "black" or "white"</w:t>
-        <w:br/>
-        <w:t xml:space="preserve">    """</w:t>
-        <w:br/>
-        <w:t xml:space="preserve">    if nv is None or (isinstance(nv, float) and np.isnan(nv)): </w:t>
-        <w:br/>
-        <w:t xml:space="preserve">        return FG</w:t>
-        <w:br/>
-        <w:t xml:space="preserve">        </w:t>
-        <w:br/>
-        <w:t xml:space="preserve">    rgba = cmap(float(nv))</w:t>
-        <w:br/>
-        <w:t xml:space="preserve">    # Standard relative luminance formula</w:t>
-        <w:br/>
-        <w:t xml:space="preserve">    lum = 0.299 * rgba[0] + 0.587 * rgba[1] + 0.114 * rgba[2]</w:t>
-        <w:br/>
-        <w:t xml:space="preserve">    </w:t>
-        <w:br/>
-        <w:t xml:space="preserve">    return "black" if lum &gt; 0.50 else "white"</w:t>
-        <w:br/>
-        <w:br/>
-        <w:br/>
-        <w:t># ==============================================================================</w:t>
-        <w:br/>
-        <w:t># REUSABLE UI WIDGET COMPONENTS</w:t>
-        <w:br/>
-        <w:t># ==============================================================================</w:t>
-        <w:br/>
-        <w:br/>
-        <w:t>def page_header(p, title, sub=""):</w:t>
-        <w:br/>
-        <w:t xml:space="preserve">    """</w:t>
-        <w:br/>
-        <w:t xml:space="preserve">    Create a standardized, highly styled header block for a dashboard page.</w:t>
-        <w:br/>
-        <w:t xml:space="preserve">    This maintains visual consistency across all notebook tabs.</w:t>
-        <w:br/>
-        <w:t xml:space="preserve">    </w:t>
-        <w:br/>
-        <w:t xml:space="preserve">    Args:</w:t>
-        <w:br/>
-        <w:t xml:space="preserve">        p (tk.Widget): Parent widget.</w:t>
-        <w:br/>
-        <w:t xml:space="preserve">        title (str): Main page title (large, bold).</w:t>
-        <w:br/>
-        <w:t xml:space="preserve">        sub (str): Optional subtitle/description (smaller, muted).</w:t>
-        <w:br/>
-        <w:t xml:space="preserve">    """</w:t>
-        <w:br/>
-        <w:t xml:space="preserve">    hf = tk.Frame(p, bg=CARD, highlightbackground=ACCENT, highlightthickness=2)</w:t>
-        <w:br/>
-        <w:t xml:space="preserve">    hf.pack(fill="x", padx=18, pady=(12, 6))</w:t>
-        <w:br/>
-        <w:t xml:space="preserve">    </w:t>
-        <w:br/>
-        <w:t xml:space="preserve">    tk.Label(</w:t>
-        <w:br/>
-        <w:t xml:space="preserve">        hf, text=title, bg=CARD, fg=ACCENT2, font=("Segoe UI", 18, "bold")</w:t>
-        <w:br/>
-        <w:t xml:space="preserve">    ).pack(anchor="w", padx=16, pady=(10, 2))</w:t>
-        <w:br/>
-        <w:t xml:space="preserve">    </w:t>
-        <w:br/>
-        <w:t xml:space="preserve">    if sub: </w:t>
-        <w:br/>
-        <w:t xml:space="preserve">        tk.Label(</w:t>
-        <w:br/>
-        <w:t xml:space="preserve">            hf, text=sub, bg=CARD, fg=MUTED, font=("Segoe UI", 10)</w:t>
-        <w:br/>
-        <w:t xml:space="preserve">        ).pack(anchor="w", padx=16, pady=(0, 8))</w:t>
-        <w:br/>
-        <w:br/>
-        <w:t>def scrollable_table(parent, hdrs, cwidths, rows_data, row_colors_fn):</w:t>
-        <w:br/>
-        <w:t xml:space="preserve">    """</w:t>
-        <w:br/>
-        <w:t xml:space="preserve">    Constructs a fully custom scrollable data table utilizing a Canvas </w:t>
-        <w:br/>
-        <w:t xml:space="preserve">    to manage scroll regions containing grid-aligned labels.</w:t>
-        <w:br/>
-        <w:t xml:space="preserve">    </w:t>
-        <w:br/>
-        <w:t xml:space="preserve">    Args:</w:t>
-        <w:br/>
-        <w:t xml:space="preserve">        parent (tk.Widget): Parent tkinter widget.</w:t>
-        <w:br/>
-        <w:t xml:space="preserve">        hdrs (list): List of column header strings.</w:t>
-        <w:br/>
-        <w:t xml:space="preserve">        cwidths (list): List of column widths (in characters).</w:t>
-        <w:br/>
-        <w:t xml:space="preserve">        rows_data (list of lists): The actual data to display in the rows.</w:t>
-        <w:br/>
-        <w:t xml:space="preserve">        row_colors_fn (callable): A function that takes (row_idx, col_idx, value)</w:t>
-        <w:br/>
-        <w:t xml:space="preserve">                                  and returns a hex color string for the text.</w:t>
-        <w:br/>
-        <w:t xml:space="preserve">    """</w:t>
-        <w:br/>
-        <w:t xml:space="preserve">    # Outer frame to hold canvas and scrollbar</w:t>
-        <w:br/>
-        <w:t xml:space="preserve">    fr = tk.Frame(parent, bg=CARD, highlightbackground=ACCENT, highlightthickness=1)</w:t>
-        <w:br/>
-        <w:t xml:space="preserve">    fr.pack(side="left", fill="both", expand=True, padx=(0, 10))</w:t>
-        <w:br/>
-        <w:t xml:space="preserve">    </w:t>
-        <w:br/>
-        <w:t xml:space="preserve">    # The canvas allows for scrolling content that exceeds window bounds</w:t>
-        <w:br/>
-        <w:t xml:space="preserve">    cv = tk.Canvas(fr, bg=CARD, highlightthickness=0)</w:t>
-        <w:br/>
-        <w:t xml:space="preserve">    vs = ttk.Scrollbar(fr, orient="vertical", command=cv.yview)</w:t>
-        <w:br/>
-        <w:t xml:space="preserve">    </w:t>
-        <w:br/>
-        <w:t xml:space="preserve">    vs.pack(side="right", fill="y")</w:t>
-        <w:br/>
-        <w:t xml:space="preserve">    cv.pack(side="left", fill="both", expand=True)</w:t>
-        <w:br/>
-        <w:t xml:space="preserve">    cv.configure(yscrollcommand=vs.set)</w:t>
-        <w:br/>
-        <w:t xml:space="preserve">    </w:t>
-        <w:br/>
-        <w:t xml:space="preserve">    # Inner frame that actually contains the grid of labels</w:t>
-        <w:br/>
-        <w:t xml:space="preserve">    inner = tk.Frame(cv, bg=CARD)</w:t>
-        <w:br/>
-        <w:t xml:space="preserve">    win = cv.create_window((0, 0), window=inner, anchor="nw")</w:t>
-        <w:br/>
-        <w:t xml:space="preserve">    </w:t>
-        <w:br/>
-        <w:t xml:space="preserve">    # Dynamic resizing bindings</w:t>
-        <w:br/>
-        <w:t xml:space="preserve">    inner.bind("&lt;Configure&gt;", lambda e: cv.configure(scrollregion=cv.bbox("all")))</w:t>
-        <w:br/>
-        <w:t xml:space="preserve">    cv.bind("&lt;Configure&gt;", lambda e: cv.itemconfig(win, width=max(e.width, inner.winfo_reqwidth())))</w:t>
-        <w:br/>
-        <w:t xml:space="preserve">    </w:t>
-        <w:br/>
-        <w:t xml:space="preserve">    # Mouse wheel scrolling binding</w:t>
-        <w:br/>
-        <w:t xml:space="preserve">    def _on_mousewheel(event):</w:t>
-        <w:br/>
-        <w:t xml:space="preserve">        # 120 is the standard scroll delta factor on Windows</w:t>
-        <w:br/>
-        <w:t xml:space="preserve">        cv.yview_scroll(int(-1*(event.delta/120)), "units")</w:t>
-        <w:br/>
-        <w:t xml:space="preserve">        </w:t>
-        <w:br/>
-        <w:t xml:space="preserve">    cv.bind_all("&lt;MouseWheel&gt;", _on_mousewheel)</w:t>
-        <w:br/>
-        <w:t xml:space="preserve">    </w:t>
-        <w:br/>
-        <w:t xml:space="preserve">    # ---------------------------------------------------------</w:t>
-        <w:br/>
-        <w:t xml:space="preserve">    # Render Table Headers</w:t>
-        <w:br/>
-        <w:t xml:space="preserve">    # ---------------------------------------------------------</w:t>
-        <w:br/>
-        <w:t xml:space="preserve">    for i, (h, w) in enumerate(zip(hdrs, cwidths)):</w:t>
-        <w:br/>
-        <w:t xml:space="preserve">        lbl = tk.Label(</w:t>
-        <w:br/>
-        <w:t xml:space="preserve">            inner, text=h, bg=BORDER, fg=ACCENT, </w:t>
-        <w:br/>
-        <w:t xml:space="preserve">            font=FONT_THEAD, width=w, anchor="w"</w:t>
-        <w:br/>
-        <w:t xml:space="preserve">        )</w:t>
-        <w:br/>
-        <w:t xml:space="preserve">        lbl.grid(row=0, column=i, padx=8, pady=10, sticky="we")</w:t>
-        <w:br/>
-        <w:t xml:space="preserve">        </w:t>
-        <w:br/>
-        <w:t xml:space="preserve">    # ---------------------------------------------------------</w:t>
-        <w:br/>
-        <w:t xml:space="preserve">    # Render Table Rows Data</w:t>
-        <w:br/>
-        <w:t xml:space="preserve">    # ---------------------------------------------------------</w:t>
-        <w:br/>
-        <w:t xml:space="preserve">    for ridx, vals in enumerate(rows_data, 1):</w:t>
-        <w:br/>
-        <w:t xml:space="preserve">        # Alternating row colors for better readability (zebra striping)</w:t>
-        <w:br/>
-        <w:t xml:space="preserve">        cbg = CARD2 if ridx % 2 == 0 else CARD</w:t>
-        <w:br/>
-        <w:t xml:space="preserve">        </w:t>
-        <w:br/>
-        <w:t xml:space="preserve">        for cidx, (val, w) in enumerate(zip(vals, cwidths)):</w:t>
-        <w:br/>
-        <w:t xml:space="preserve">            col = row_colors_fn(ridx, cidx, val)</w:t>
-        <w:br/>
-        <w:t xml:space="preserve">            lbl = tk.Label(</w:t>
-        <w:br/>
-        <w:t xml:space="preserve">                inner, text=val, bg=cbg, fg=col, </w:t>
-        <w:br/>
-        <w:t xml:space="preserve">                font=FONT_TABLE, width=w, anchor="w"</w:t>
-        <w:br/>
-        <w:t xml:space="preserve">            )</w:t>
-        <w:br/>
-        <w:t xml:space="preserve">            lbl.grid(row=ridx, column=cidx, padx=8, pady=7, sticky="we")</w:t>
-        <w:br/>
-        <w:br/>
-        <w:br/>
-        <w:t># ==============================================================================</w:t>
-        <w:br/>
-        <w:t># DASHBOARD PAGES IMPLEMENTATION</w:t>
-        <w:br/>
-        <w:t># ==============================================================================</w:t>
-        <w:br/>
-        <w:t xml:space="preserve">    """</w:t>
-        <w:br/>
-        <w:t xml:space="preserve">    Builds the Overview Page (Page 1)</w:t>
-        <w:br/>
-        <w:t xml:space="preserve">    </w:t>
-        <w:br/>
-        <w:t xml:space="preserve">    This page acts as the executive summary of the entire dashboard.</w:t>
-        <w:br/>
-        <w:t xml:space="preserve">    It displays the most critical Key Performance Indicators (KPIs) on the left</w:t>
-        <w:br/>
-        <w:t xml:space="preserve">    and provides a high-level visual breakdown of platform reach, category</w:t>
-        <w:br/>
-        <w:t xml:space="preserve">    distribution, top hashtags, and average engagement rates on the right.</w:t>
-        <w:br/>
-        <w:t xml:space="preserve">    </w:t>
-        <w:br/>
-        <w:t xml:space="preserve">    Args:</w:t>
-        <w:br/>
-        <w:t xml:space="preserve">        nb (ttk.Notebook): The parent notebook to attach this page to.</w:t>
-        <w:br/>
-        <w:t xml:space="preserve">        df (pd.DataFrame): The master dataset.</w:t>
-        <w:br/>
-        <w:t xml:space="preserve">    """</w:t>
-        <w:br/>
-        <w:t xml:space="preserve">    p = tk.Frame(nb, bg=BG)</w:t>
-        <w:br/>
-        <w:t xml:space="preserve">    nb.add(p, text="  Overview  ")</w:t>
-        <w:br/>
-        <w:t xml:space="preserve">    </w:t>
-        <w:br/>
-        <w:t xml:space="preserve">    body = tk.Frame(p, bg=BG)</w:t>
-        <w:br/>
-        <w:t xml:space="preserve">    body.pack(fill="both", expand=True)</w:t>
-        <w:br/>
-        <w:t xml:space="preserve">    </w:t>
-        <w:br/>
-        <w:t xml:space="preserve">    # ---------------------------------------------------------</w:t>
-        <w:br/>
-        <w:t xml:space="preserve">    # Left Panel: KPIs (Key Performance Indicators)</w:t>
-        <w:br/>
-        <w:t xml:space="preserve">    # ---------------------------------------------------------</w:t>
-        <w:br/>
-        <w:t xml:space="preserve">    left = tk.Frame(body, bg=BG, width=300)</w:t>
-        <w:br/>
-        <w:t xml:space="preserve">    left.pack(side="left", fill="y", padx=(8, 6), pady=8)</w:t>
-        <w:br/>
-        <w:t xml:space="preserve">    left.pack_propagate(False) # Prevent frame from shrinking to fit content</w:t>
-        <w:br/>
-        <w:t xml:space="preserve">    </w:t>
-        <w:br/>
-        <w:t xml:space="preserve">    # Safely calculate aggregate metrics</w:t>
-        <w:br/>
-        <w:t xml:space="preserve">    try:</w:t>
-        <w:br/>
-        <w:t xml:space="preserve">        top_platform = df.groupby("platform")["views"].sum().idxmax()</w:t>
-        <w:br/>
-        <w:t xml:space="preserve">    except Exception:</w:t>
-        <w:br/>
-        <w:t xml:space="preserve">        top_platform = "N/A"</w:t>
-        <w:br/>
-        <w:t xml:space="preserve">        </w:t>
-        <w:br/>
-        <w:t xml:space="preserve">    try:</w:t>
-        <w:br/>
-        <w:t xml:space="preserve">        top_category = df.groupby("category")["engagement_rate"].mean().idxmax()</w:t>
-        <w:br/>
-        <w:t xml:space="preserve">    except Exception:</w:t>
-        <w:br/>
-        <w:t xml:space="preserve">        top_category = "N/A"</w:t>
-        <w:br/>
-        <w:t xml:space="preserve">        </w:t>
-        <w:br/>
-        <w:t xml:space="preserve">    avg_eng = df['engagement_rate'].mean() if not df.empty else 0.0</w:t>
-        <w:br/>
-        <w:br/>
-        <w:t xml:space="preserve">    kpis = [</w:t>
-        <w:br/>
-        <w:t xml:space="preserve">        ("Total Posts", fmt_num(df["posts"].sum()), "All platforms combined", ACCENT),</w:t>
-        <w:br/>
-        <w:t xml:space="preserve">        ("Total Views", fmt_num(df["views"].sum()), "Combined reach", ACCENT2),</w:t>
-        <w:br/>
-        <w:t xml:space="preserve">        ("Total Likes", fmt_num(df["likes"].sum()), "User reactions", GOOD),</w:t>
-        <w:br/>
-        <w:t xml:space="preserve">        ("Avg Engagement", f"{avg_eng:.2f}%", "(Likes+Cmts+Shares)/Views", MID),</w:t>
-        <w:br/>
-        <w:t xml:space="preserve">        ("Top Platform", top_platform, "By total views", PLATFORM_COLORS.get(top_platform, FG)),</w:t>
-        <w:br/>
-        <w:t xml:space="preserve">        ("Trending Category", top_category, "Highest avg engagement", WARN),</w:t>
-        <w:br/>
-        <w:t xml:space="preserve">    ]</w:t>
-        <w:br/>
-        <w:t xml:space="preserve">    </w:t>
-        <w:br/>
-        <w:t xml:space="preserve">    # Render KPI Cards</w:t>
-        <w:br/>
-        <w:t xml:space="preserve">    for title, val, sub, c in kpis:</w:t>
-        <w:br/>
-        <w:t xml:space="preserve">        card = tk.Frame(left, bg=CARD, padx=12, pady=8, highlightbackground=BORDER, highlightthickness=1)</w:t>
-        <w:br/>
-        <w:t xml:space="preserve">        card.pack(fill="x", pady=3)</w:t>
-        <w:br/>
-        <w:t xml:space="preserve">        </w:t>
-        <w:br/>
-        <w:t xml:space="preserve">        tk.Label(card, text=title, bg=CARD, fg=MUTED, font=("Segoe UI", 10)).pack(anchor="w")</w:t>
-        <w:br/>
-        <w:t xml:space="preserve">        tk.Label(card, text=val, bg=CARD, fg=c, font=("Segoe UI", 15, "bold")).pack(anchor="w")</w:t>
-        <w:br/>
-        <w:t xml:space="preserve">        </w:t>
-        <w:br/>
-        <w:t xml:space="preserve">        if sub: </w:t>
-        <w:br/>
-        <w:t xml:space="preserve">            tk.Label(card, text=sub, bg=CARD, fg=BORDER, font=("Segoe UI", 8)).pack(anchor="w")</w:t>
-        <w:br/>
-        <w:t xml:space="preserve">            </w:t>
-        <w:br/>
-        <w:t xml:space="preserve">    # ---------------------------------------------------------</w:t>
-        <w:br/>
-        <w:t xml:space="preserve">    # Right Panel: Visualization Grid</w:t>
-        <w:br/>
-        <w:t xml:space="preserve">    # ---------------------------------------------------------</w:t>
-        <w:br/>
-        <w:t xml:space="preserve">    right = tk.Frame(body, bg=BG)</w:t>
-        <w:br/>
-        <w:t xml:space="preserve">    right.pack(side="left", fill="both", expand=True, padx=(8, 18), pady=8)</w:t>
-        <w:br/>
-        <w:t xml:space="preserve">    </w:t>
-        <w:br/>
-        <w:t xml:space="preserve">    # Setup 2x2 Grid using GridSpec</w:t>
-        <w:br/>
-        <w:t xml:space="preserve">    fig = Figure(figsize=(10.5, 5.5), dpi=DPI)</w:t>
-        <w:br/>
-        <w:t xml:space="preserve">    fig.patch.set_facecolor(BG)</w:t>
-        <w:br/>
-        <w:t xml:space="preserve">    gs = GridSpec(2, 2, figure=fig, hspace=0.50, wspace=0.40)</w:t>
-        <w:br/>
-        <w:t xml:space="preserve">    </w:t>
-        <w:br/>
-        <w:t xml:space="preserve">    # --- Chart 1: Platform Reach (Horizontal Bar) ---</w:t>
-        <w:br/>
-        <w:t xml:space="preserve">    ax1 = fig.add_subplot(gs[0, 0])</w:t>
-        <w:br/>
-        <w:t xml:space="preserve">    if not df.empty:</w:t>
-        <w:br/>
-        <w:t xml:space="preserve">        pv = df.groupby("platform")["views"].sum().sort_values()</w:t>
-        <w:br/>
-        <w:t xml:space="preserve">        hbar(ax1, pv.index, pv.values/1e6, [PLATFORM_COLORS.get(p, ACCENT) for p in pv.index], fs=9, bh=0.55, vlabels=False)</w:t>
-        <w:br/>
-        <w:t xml:space="preserve">    style_ax(ax1, "Platform Reach (Million Views)")</w:t>
-        <w:br/>
-        <w:t xml:space="preserve">    </w:t>
-        <w:br/>
-        <w:t xml:space="preserve">    # --- Chart 2: Category Distribution (Donut Pie Chart) ---</w:t>
-        <w:br/>
-        <w:t xml:space="preserve">    ax2 = fig.add_subplot(gs[1, 0])</w:t>
-        <w:br/>
-        <w:t xml:space="preserve">    if not df.empty:</w:t>
-        <w:br/>
-        <w:t xml:space="preserve">        cat_cnt = df["category"].value_counts()</w:t>
-        <w:br/>
-        <w:t xml:space="preserve">        clrs = [CATEGORY_COLORS.get(c, ACCENT) for c in cat_cnt.index]</w:t>
-        <w:br/>
-        <w:t xml:space="preserve">        </w:t>
-        <w:br/>
-        <w:t xml:space="preserve">        wedges, _, autotexts = ax2.pie(</w:t>
-        <w:br/>
-        <w:t xml:space="preserve">            cat_cnt.values, colors=clrs, </w:t>
-        <w:br/>
-        <w:t xml:space="preserve">            autopct=lambda p: f"{p:.0f}%" if p &gt;= 5 else "", </w:t>
-        <w:br/>
-        <w:t xml:space="preserve">            pctdistance=0.75, startangle=90, </w:t>
-        <w:br/>
-        <w:t xml:space="preserve">            wedgeprops=dict(width=0.45, edgecolor=BG, linewidth=2.5), </w:t>
-        <w:br/>
-        <w:t xml:space="preserve">            radius=0.80</w:t>
-        <w:br/>
-        <w:t xml:space="preserve">        )</w:t>
-        <w:br/>
-        <w:t xml:space="preserve">        </w:t>
-        <w:br/>
-        <w:t xml:space="preserve">        # Adjust text color inside pie slices for readability</w:t>
-        <w:br/>
-        <w:t xml:space="preserve">        for at, wdg in zip(autotexts, wedges):</w:t>
-        <w:br/>
-        <w:t xml:space="preserve">            fc = wdg.get_facecolor()</w:t>
-        <w:br/>
-        <w:t xml:space="preserve">            lum = 0.299*fc[0] + 0.587*fc[1] + 0.114*fc[2]</w:t>
-        <w:br/>
-        <w:t xml:space="preserve">            at.set_fontsize(8)</w:t>
-        <w:br/>
-        <w:t xml:space="preserve">            at.set_fontweight("bold")</w:t>
-        <w:br/>
-        <w:t xml:space="preserve">            at.set_color("black" if lum &gt; 0.5 else "white")</w:t>
-        <w:br/>
-        <w:t xml:space="preserve">            </w:t>
-        <w:br/>
-        <w:t xml:space="preserve">        ax2.legend(wedges, [f"{c}({n})" for c, n in cat_cnt.items()], </w:t>
-        <w:br/>
-        <w:t xml:space="preserve">                   loc="upper center", bbox_to_anchor=(0.5, 0.0), ncol=2, </w:t>
-        <w:br/>
-        <w:t xml:space="preserve">                   fontsize=7, labelcolor=FG, facecolor=CARD, edgecolor=BORDER)</w:t>
-        <w:br/>
-        <w:t xml:space="preserve">                   </w:t>
-        <w:br/>
-        <w:t xml:space="preserve">    ax2.set_title("Category Distribution", color=ACCENT2, fontsize=11, fontweight="bold", pad=8)</w:t>
-        <w:br/>
-        <w:t xml:space="preserve">    </w:t>
-        <w:br/>
-        <w:t xml:space="preserve">    # --- Chart 3: Top Hashtags (Horizontal Bar) ---</w:t>
-        <w:br/>
-        <w:t xml:space="preserve">    ax3 = fig.add_subplot(gs[0, 1])</w:t>
-        <w:br/>
-        <w:t xml:space="preserve">    if not df.empty:</w:t>
-        <w:br/>
-        <w:t xml:space="preserve">        ht = df.groupby("hashtag")["views"].sum().nlargest(5).sort_values()</w:t>
-        <w:br/>
-        <w:t xml:space="preserve">        hbar(ax3, ht.index, ht.values/1e6, [ACCENT]*5, fs=9, bh=0.6)</w:t>
-        <w:br/>
-        <w:t xml:space="preserve">    style_ax(ax3, "Top 5 Hashtags (M Views)")</w:t>
-        <w:br/>
-        <w:t xml:space="preserve">    </w:t>
-        <w:br/>
-        <w:t xml:space="preserve">    # --- Chart 4: Average Engagement (Horizontal Bar with Avg Line) ---</w:t>
-        <w:br/>
-        <w:t xml:space="preserve">    ax4 = fig.add_subplot(gs[1, 1])</w:t>
-        <w:br/>
-        <w:t xml:space="preserve">    if not df.empty:</w:t>
-        <w:br/>
-        <w:t xml:space="preserve">        pe = df.groupby("platform")["engagement_rate"].mean().sort_values()</w:t>
-        <w:br/>
-        <w:t xml:space="preserve">        hbar(ax4, pe.index, pe.values, [PLATFORM_COLORS.get(p, ACCENT) for p in pe.index], fs=9, bh=0.55)</w:t>
-        <w:br/>
-        <w:t xml:space="preserve">        </w:t>
-        <w:br/>
-        <w:t xml:space="preserve">        # Add benchmark line at 3% engagement</w:t>
-        <w:br/>
-        <w:t xml:space="preserve">        ax4.axvline(3, color=MID, lw=1.3, ls="--", label="Avg 3%")</w:t>
-        <w:br/>
-        <w:t xml:space="preserve">        ax4.legend(fontsize=8, labelcolor=FG, facecolor=CARD, edgecolor=BORDER)</w:t>
-        <w:br/>
-        <w:t xml:space="preserve">        </w:t>
-        <w:br/>
-        <w:t xml:space="preserve">    style_ax(ax4, "Avg Engagement Rate (%)")</w:t>
-        <w:br/>
-        <w:t xml:space="preserve">    </w:t>
-        <w:br/>
-        <w:t xml:space="preserve">    # Layout adjustment and embedding</w:t>
-        <w:br/>
-        <w:t xml:space="preserve">    try:</w:t>
-        <w:br/>
-        <w:t xml:space="preserve">        fig.tight_layout(pad=1.5)</w:t>
-        <w:br/>
-        <w:t xml:space="preserve">    except Exception as e:</w:t>
-        <w:br/>
-        <w:t xml:space="preserve">        pass</w:t>
-        <w:br/>
-        <w:t xml:space="preserve">        </w:t>
-        <w:br/>
-        <w:t xml:space="preserve">    embed(fig, right)</w:t>
-        <w:br/>
-        <w:br/>
-        <w:br/>
-        <w:t>def page2(nb, df):</w:t>
-        <w:br/>
-        <w:t xml:space="preserve">    """</w:t>
-        <w:br/>
-        <w:t xml:space="preserve">    Builds the Platform Analysis Page (Page 2)</w:t>
-        <w:br/>
-        <w:t xml:space="preserve">    </w:t>
-        <w:br/>
-        <w:t xml:space="preserve">    This page isolates platform performance. It provides a detailed data table</w:t>
-        <w:br/>
-        <w:t xml:space="preserve">    containing all base metrics grouped by platform, accompanied by a 2x2 grid</w:t>
-        <w:br/>
-        <w:t xml:space="preserve">    of standard vertical bar charts comparing Likes, Shares, Comments, and Engagement.</w:t>
-        <w:br/>
-        <w:t xml:space="preserve">    </w:t>
-        <w:br/>
-        <w:t xml:space="preserve">    Args:</w:t>
-        <w:br/>
-        <w:t xml:space="preserve">        nb (ttk.Notebook): The parent notebook.</w:t>
-        <w:br/>
-        <w:t xml:space="preserve">        df (pd.DataFrame): The master dataset.</w:t>
-        <w:br/>
-        <w:t xml:space="preserve">    """</w:t>
-        <w:br/>
-        <w:t xml:space="preserve">    p = tk.Frame(nb, bg=BG)</w:t>
-        <w:br/>
-        <w:t xml:space="preserve">    nb.add(p, text="  Platform Analysis  ")</w:t>
-        <w:br/>
-        <w:t xml:space="preserve">    </w:t>
-        <w:br/>
-        <w:t xml:space="preserve">    page_header(p, "Platform-wise Social Media Performance", </w:t>
-        <w:br/>
-        <w:t xml:space="preserve">                "Detailed metrics comparison across all 5 platforms")</w:t>
-        <w:br/>
-        <w:t xml:space="preserve">    </w:t>
-        <w:br/>
-        <w:t xml:space="preserve">    body = tk.Frame(p, bg=BG)</w:t>
-        <w:br/>
-        <w:t xml:space="preserve">    body.pack(fill="both", expand=True, padx=16, pady=6)</w:t>
-        <w:br/>
-        <w:t xml:space="preserve">    </w:t>
-        <w:br/>
-        <w:t xml:space="preserve">    if df.empty:</w:t>
-        <w:br/>
-        <w:t xml:space="preserve">        return</w:t>
-        <w:br/>
-        <w:t xml:space="preserve">        </w:t>
-        <w:br/>
-        <w:t xml:space="preserve">    # Aggregate data by platform</w:t>
-        <w:br/>
-        <w:t xml:space="preserve">    plat_df = df.groupby("platform").agg(</w:t>
-        <w:br/>
-        <w:t xml:space="preserve">        posts=("posts", "sum"),</w:t>
-        <w:br/>
-        <w:t xml:space="preserve">        likes=("likes", "sum"),</w:t>
-        <w:br/>
-        <w:t xml:space="preserve">        views=("views", "sum"),</w:t>
-        <w:br/>
-        <w:t xml:space="preserve">        comments=("comments", "sum"),</w:t>
-        <w:br/>
-        <w:t xml:space="preserve">        shares=("shares", "sum"),</w:t>
-        <w:br/>
-        <w:t xml:space="preserve">        avg_eng=("engagement_rate", "mean")</w:t>
-        <w:br/>
-        <w:t xml:space="preserve">    ).reset_index().sort_values("views", ascending=False)</w:t>
-        <w:br/>
-        <w:t xml:space="preserve">    </w:t>
-        <w:br/>
-        <w:t xml:space="preserve">    # ---------------------------------------------------------</w:t>
-        <w:br/>
-        <w:t xml:space="preserve">    # Left Component: Data Table</w:t>
-        <w:br/>
-        <w:t xml:space="preserve">    # ---------------------------------------------------------</w:t>
-        <w:br/>
-        <w:t xml:space="preserve">    hdrs = ["PLATFORM", "POSTS", "LIKES", "VIEWS", "COMMENTS", "SHARES", "ENG%"]</w:t>
-        <w:br/>
-        <w:t xml:space="preserve">    cw = [14, 11, 11, 12, 11, 11, 9]</w:t>
-        <w:br/>
-        <w:t xml:space="preserve">    </w:t>
-        <w:br/>
-        <w:t xml:space="preserve">    rows = [</w:t>
-        <w:br/>
-        <w:t xml:space="preserve">        [</w:t>
-        <w:br/>
-        <w:t xml:space="preserve">            r["platform"], </w:t>
-        <w:br/>
-        <w:t xml:space="preserve">            fmt_num(r["posts"]), </w:t>
-        <w:br/>
-        <w:t xml:space="preserve">            fmt_num(r["likes"]), </w:t>
-        <w:br/>
-        <w:t xml:space="preserve">            fmt_num(r["views"]), </w:t>
-        <w:br/>
-        <w:t xml:space="preserve">            fmt_num(r["comments"]), </w:t>
-        <w:br/>
-        <w:t xml:space="preserve">            fmt_num(r["shares"]), </w:t>
-        <w:br/>
-        <w:t xml:space="preserve">            f"{r['avg_eng']:.2f}%"</w:t>
-        <w:br/>
-        <w:t xml:space="preserve">        ] </w:t>
-        <w:br/>
-        <w:t xml:space="preserve">        for _, r in plat_df.iterrows()</w:t>
-        <w:br/>
-        <w:t xml:space="preserve">    ]</w:t>
-        <w:br/>
-        <w:t xml:space="preserve">    </w:t>
-        <w:br/>
-        <w:t xml:space="preserve">    # Color logic: Platform names are colored, metrics remain default foreground</w:t>
-        <w:br/>
-        <w:t xml:space="preserve">    def colorfn(ri, ci, val): </w:t>
-        <w:br/>
-        <w:t xml:space="preserve">        return PLATFORM_COLORS.get(str(val), FG) if ci == 0 else FG</w:t>
-        <w:br/>
-        <w:t xml:space="preserve">        </w:t>
-        <w:br/>
-        <w:t xml:space="preserve">    scrollable_table(body, hdrs, cw, rows, colorfn)</w:t>
-        <w:br/>
-        <w:t xml:space="preserve">    </w:t>
-        <w:br/>
-        <w:t xml:space="preserve">    # ---------------------------------------------------------</w:t>
-        <w:br/>
-        <w:t xml:space="preserve">    # Right Component: Multi-metric Bar Charts</w:t>
-        <w:br/>
-        <w:t xml:space="preserve">    # ---------------------------------------------------------</w:t>
-        <w:br/>
-        <w:t xml:space="preserve">    ch = tk.Frame(body, bg=BG)</w:t>
-        <w:br/>
-        <w:t xml:space="preserve">    ch.pack(side="left", fill="both", expand=True)</w:t>
-        <w:br/>
-        <w:t xml:space="preserve">    </w:t>
-        <w:br/>
-        <w:t xml:space="preserve">    fig = Figure(figsize=(8.5, 6.0), dpi=DPI)</w:t>
-        <w:br/>
-        <w:t xml:space="preserve">    fig.patch.set_facecolor(BG)</w:t>
-        <w:br/>
-        <w:t xml:space="preserve">    gs = GridSpec(2, 2, figure=fig, hspace=0.65, wspace=0.46)</w:t>
-        <w:br/>
-        <w:t xml:space="preserve">    </w:t>
-        <w:br/>
-        <w:t xml:space="preserve">    plats = plat_df["platform"]</w:t>
-        <w:br/>
-        <w:t xml:space="preserve">    clrs = [PLATFORM_COLORS.get(p, ACCENT) for p in plats]</w:t>
-        <w:br/>
-        <w:t xml:space="preserve">    </w:t>
-        <w:br/>
-        <w:t xml:space="preserve">    # Define the 4 metrics to plot in the 2x2 grid</w:t>
-        <w:br/>
-        <w:t xml:space="preserve">    metrics = [</w:t>
-        <w:br/>
-        <w:t xml:space="preserve">        ("likes", "Likes (M)"),</w:t>
-        <w:br/>
-        <w:t xml:space="preserve">        ("shares", "Shares (M)"),</w:t>
-        <w:br/>
-        <w:t xml:space="preserve">        ("comments", "Comments (M)"),</w:t>
-        <w:br/>
-        <w:t xml:space="preserve">        ("avg_eng", "Avg Eng %")</w:t>
-        <w:br/>
-        <w:t xml:space="preserve">    ]</w:t>
-        <w:br/>
-        <w:t xml:space="preserve">    </w:t>
-        <w:br/>
-        <w:t xml:space="preserve">    for i, (col, title) in enumerate(metrics):</w:t>
-        <w:br/>
-        <w:t xml:space="preserve">        ax = fig.add_subplot(gs[i//2, i%2])</w:t>
-        <w:br/>
-        <w:t xml:space="preserve">        # Convert absolute metrics to millions for cleaner y-axis</w:t>
-        <w:br/>
-        <w:t xml:space="preserve">        vals = plat_df[col]/1e6 if col != "avg_eng" else plat_df[col]</w:t>
-        <w:br/>
-        <w:t xml:space="preserve">        </w:t>
-        <w:br/>
-        <w:t xml:space="preserve">        ax.bar(plats, vals, color=clrs, edgecolor=BORDER, linewidth=0.5)</w:t>
-        <w:br/>
-        <w:t xml:space="preserve">        style_ax(ax, title)</w:t>
-        <w:br/>
-        <w:t xml:space="preserve">        ax.tick_params(axis="x", rotation=15, colors=FG)</w:t>
-        <w:br/>
-        <w:t xml:space="preserve">        </w:t>
-        <w:br/>
-        <w:t xml:space="preserve">    fig.subplots_adjust(left=0.12, right=0.97, top=0.94, bottom=0.12)</w:t>
-        <w:br/>
-        <w:t xml:space="preserve">    embed(fig, ch)</w:t>
-        <w:br/>
-        <w:br/>
-        <w:br/>
-        <w:t>def page3(nb, df):</w:t>
-        <w:br/>
-        <w:t xml:space="preserve">    """</w:t>
-        <w:br/>
-        <w:t xml:space="preserve">    Builds the Category Trends Page (Page 3)</w:t>
-        <w:br/>
-        <w:t xml:space="preserve">    </w:t>
-        <w:br/>
-        <w:t xml:space="preserve">    This page analyzes data by the content category (e.g., Sports, Entertainment).</w:t>
-        <w:br/>
-        <w:t xml:space="preserve">    It features views vs engagement analysis, top hashtags within categories,</w:t>
-        <w:br/>
-        <w:t xml:space="preserve">    and the distribution of content output.</w:t>
-        <w:br/>
-        <w:t xml:space="preserve">    </w:t>
-        <w:br/>
-        <w:t xml:space="preserve">    Args:</w:t>
-        <w:br/>
-        <w:t xml:space="preserve">        nb (ttk.Notebook): The parent notebook.</w:t>
-        <w:br/>
-        <w:t xml:space="preserve">        df (pd.DataFrame): The master dataset.</w:t>
-        <w:br/>
-        <w:t xml:space="preserve">    """</w:t>
-        <w:br/>
-        <w:t xml:space="preserve">    p = tk.Frame(nb, bg=BG)</w:t>
-        <w:br/>
-        <w:t xml:space="preserve">    nb.add(p, text="  Category Trends  ")</w:t>
-        <w:br/>
-        <w:t xml:space="preserve">    </w:t>
-        <w:br/>
-        <w:t xml:space="preserve">    page_header(p, "Content Category Performance Analysis", </w:t>
-        <w:br/>
-        <w:t xml:space="preserve">                "Engagement and reach metrics by content category")</w:t>
-        <w:br/>
-        <w:t xml:space="preserve">    </w:t>
-        <w:br/>
-        <w:t xml:space="preserve">    if df.empty:</w:t>
-        <w:br/>
-        <w:t xml:space="preserve">        return</w:t>
-        <w:br/>
-        <w:t xml:space="preserve">        </w:t>
-        <w:br/>
-        <w:t xml:space="preserve">    fig = Figure(figsize=(12, 6.5), dpi=DPI)</w:t>
-        <w:br/>
-        <w:t xml:space="preserve">    fig.patch.set_facecolor(BG)</w:t>
-        <w:br/>
-        <w:t xml:space="preserve">    gs = GridSpec(2, 2, figure=fig, hspace=0.50, wspace=0.35)</w:t>
-        <w:br/>
-        <w:t xml:space="preserve">    </w:t>
-        <w:br/>
-        <w:t xml:space="preserve">    # Aggregate by Category</w:t>
-        <w:br/>
-        <w:t xml:space="preserve">    cat_df = df.groupby("category").agg(</w:t>
-        <w:br/>
-        <w:t xml:space="preserve">        views=("views", "sum"), </w:t>
-        <w:br/>
-        <w:t xml:space="preserve">        eng=("engagement_rate", "mean")</w:t>
-        <w:br/>
-        <w:t xml:space="preserve">    ).sort_values("views", ascending=False)</w:t>
-        <w:br/>
-        <w:t xml:space="preserve">    </w:t>
-        <w:br/>
-        <w:t xml:space="preserve">    # --- Top Left: Views by Category ---</w:t>
-        <w:br/>
-        <w:t xml:space="preserve">    ax1 = fig.add_subplot(gs[0, 0])</w:t>
-        <w:br/>
-        <w:t xml:space="preserve">    ax1.barh(</w:t>
-        <w:br/>
-        <w:t xml:space="preserve">        cat_df.index, cat_df["views"]/1e6, </w:t>
-        <w:br/>
-        <w:t xml:space="preserve">        color=[CATEGORY_COLORS.get(c, ACCENT) for c in cat_df.index],</w:t>
-        <w:br/>
-        <w:t xml:space="preserve">        height=0.6, edgecolor=BORDER, linewidth=0.5</w:t>
-        <w:br/>
-        <w:t xml:space="preserve">    )</w:t>
-        <w:br/>
-        <w:t xml:space="preserve">    style_ax(ax1, "Views by Category (M)")</w:t>
-        <w:br/>
-        <w:t xml:space="preserve">    fix_yticks(ax1, 9)</w:t>
-        <w:br/>
-        <w:t xml:space="preserve">    </w:t>
-        <w:br/>
-        <w:t xml:space="preserve">    # --- Top Right: Engagement by Category ---</w:t>
-        <w:br/>
-        <w:t xml:space="preserve">    ax2 = fig.add_subplot(gs[0, 1])</w:t>
-        <w:br/>
-        <w:t xml:space="preserve">    ce = cat_df.sort_values("eng")</w:t>
-        <w:br/>
-        <w:t xml:space="preserve">    ax2.barh(</w:t>
-        <w:br/>
-        <w:t xml:space="preserve">        ce.index, ce["eng"], </w:t>
-        <w:br/>
-        <w:t xml:space="preserve">        color=[CATEGORY_COLORS.get(c, ACCENT) for c in ce.index],</w:t>
-        <w:br/>
-        <w:t xml:space="preserve">        height=0.6, edgecolor=BORDER, linewidth=0.5</w:t>
-        <w:br/>
-        <w:t xml:space="preserve">    )</w:t>
-        <w:br/>
-        <w:t xml:space="preserve">    ax2.axvline(3, color=MID, lw=1.3, ls="--")</w:t>
-        <w:br/>
-        <w:t xml:space="preserve">    style_ax(ax2, "Avg Engagement Rate (%)")</w:t>
-        <w:br/>
-        <w:t xml:space="preserve">    fix_yticks(ax2, 9)</w:t>
-        <w:br/>
-        <w:t xml:space="preserve">    </w:t>
-        <w:br/>
-        <w:t xml:space="preserve">    # --- Bottom Left: Top 10 Hashtags by Engagement ---</w:t>
-        <w:br/>
-        <w:t xml:space="preserve">    ax3 = fig.add_subplot(gs[1, 0])</w:t>
-        <w:br/>
-        <w:t xml:space="preserve">    ht = df.groupby("hashtag")["engagement_rate"].mean().nlargest(10).sort_values()</w:t>
-        <w:br/>
-        <w:t xml:space="preserve">    ax3.barh(</w:t>
-        <w:br/>
-        <w:t xml:space="preserve">        ht.index, ht.values, </w:t>
-        <w:br/>
-        <w:t xml:space="preserve">        color=[ACCENT2]*10, </w:t>
-        <w:br/>
-        <w:t xml:space="preserve">        height=0.6, edgecolor=BORDER, linewidth=0.5</w:t>
-        <w:br/>
-        <w:t xml:space="preserve">    )</w:t>
-        <w:br/>
-        <w:t xml:space="preserve">    style_ax(ax3, "Top 10 Hashtags by Eng Rate")</w:t>
-        <w:br/>
-        <w:t xml:space="preserve">    fix_yticks(ax3, 8)</w:t>
-        <w:br/>
-        <w:t xml:space="preserve">    </w:t>
-        <w:br/>
-        <w:t xml:space="preserve">    # --- Bottom Right: Posts Output per Category (Pie) ---</w:t>
-        <w:br/>
-        <w:t xml:space="preserve">    ax4 = fig.add_subplot(gs[1, 1])</w:t>
-        <w:br/>
-        <w:t xml:space="preserve">    cat_posts = df["category"].value_counts()</w:t>
-        <w:br/>
-        <w:t xml:space="preserve">    clrs = [CATEGORY_COLORS.get(c, ACCENT) for c in cat_posts.index]</w:t>
-        <w:br/>
-        <w:t xml:space="preserve">    </w:t>
-        <w:br/>
-        <w:t xml:space="preserve">    wedges, _, ats = ax4.pie(</w:t>
-        <w:br/>
-        <w:t xml:space="preserve">        cat_posts.values, colors=clrs, </w:t>
-        <w:br/>
-        <w:t xml:space="preserve">        autopct=lambda p: f"{p:.0f}%" if p &gt;= 5 else "", </w:t>
-        <w:br/>
-        <w:t xml:space="preserve">        pctdistance=0.75, startangle=90, </w:t>
-        <w:br/>
-        <w:t xml:space="preserve">        wedgeprops=dict(width=0.45, edgecolor=BG, linewidth=2), </w:t>
-        <w:br/>
-        <w:t xml:space="preserve">        radius=0.80</w:t>
-        <w:br/>
-        <w:t xml:space="preserve">    )</w:t>
-        <w:br/>
-        <w:t xml:space="preserve">    </w:t>
-        <w:br/>
-        <w:t xml:space="preserve">    for at, wdg in zip(ats, wedges):</w:t>
-        <w:br/>
-        <w:t xml:space="preserve">        fc = wdg.get_facecolor()</w:t>
-        <w:br/>
-        <w:t xml:space="preserve">        lum = 0.299*fc[0] + 0.587*fc[1] + 0.114*fc[2]</w:t>
-        <w:br/>
-        <w:t xml:space="preserve">        at.set_fontsize(8)</w:t>
-        <w:br/>
-        <w:t xml:space="preserve">        at.set_fontweight("bold")</w:t>
-        <w:br/>
-        <w:t xml:space="preserve">        at.set_color("black" if lum &gt; 0.5 else "white")</w:t>
-        <w:br/>
-        <w:t xml:space="preserve">        </w:t>
-        <w:br/>
-        <w:t xml:space="preserve">    ax4.set_title("Posts per Category", color=ACCENT2, fontsize=11, fontweight="bold", pad=8)</w:t>
-        <w:br/>
-        <w:t xml:space="preserve">    ax4.legend(</w:t>
-        <w:br/>
-        <w:t xml:space="preserve">        wedges, cat_posts.index, </w:t>
-        <w:br/>
-        <w:t xml:space="preserve">        loc="upper center", bbox_to_anchor=(0.5, 0.0), </w:t>
-        <w:br/>
-        <w:t xml:space="preserve">        ncol=2, fontsize=7, labelcolor=FG, </w:t>
-        <w:br/>
-        <w:t xml:space="preserve">        facecolor=CARD, edgecolor=BORDER</w:t>
-        <w:br/>
-        <w:t xml:space="preserve">    )</w:t>
-        <w:br/>
-        <w:t xml:space="preserve">    </w:t>
-        <w:br/>
-        <w:t xml:space="preserve">    fig.subplots_adjust(left=0.18, right=0.96, top=0.92, bottom=0.08)</w:t>
-        <w:br/>
-        <w:t xml:space="preserve">    embed(fig, p)</w:t>
-        <w:br/>
-        <w:br/>
-        <w:br/>
-        <w:t>def page4(nb, df):</w:t>
-        <w:br/>
-        <w:t xml:space="preserve">    """</w:t>
-        <w:br/>
-        <w:t xml:space="preserve">    Builds the Hashtag Rankings Page (Page 4)</w:t>
-        <w:br/>
-        <w:t xml:space="preserve">    </w:t>
-        <w:br/>
-        <w:t xml:space="preserve">    This page is designed for deep-diving into specific topics (hashtags).</w:t>
-        <w:br/>
-        <w:t xml:space="preserve">    It features a comprehensive scrollable ranking table alongside</w:t>
-        <w:br/>
-        <w:t xml:space="preserve">    two charts highlighting the absolute best and worst performers.</w:t>
-        <w:br/>
-        <w:t xml:space="preserve">    </w:t>
-        <w:br/>
-        <w:t xml:space="preserve">    Args:</w:t>
-        <w:br/>
-        <w:t xml:space="preserve">        nb (ttk.Notebook): The parent notebook.</w:t>
-        <w:br/>
-        <w:t xml:space="preserve">        df (pd.DataFrame): The master dataset.</w:t>
-        <w:br/>
-        <w:t xml:space="preserve">    """</w:t>
-        <w:br/>
-        <w:t xml:space="preserve">    p = tk.Frame(nb, bg=BG)</w:t>
-        <w:br/>
-        <w:t xml:space="preserve">    nb.add(p, text="  Hashtag Rankings  ")</w:t>
-        <w:br/>
-        <w:t xml:space="preserve">    </w:t>
-        <w:br/>
-        <w:t xml:space="preserve">    page_header(p, "Hashtag Performance Rankings", </w:t>
-        <w:br/>
-        <w:t xml:space="preserve">                "Top and bottom performing hashtags by total views")</w:t>
-        <w:br/>
-        <w:t xml:space="preserve">    </w:t>
-        <w:br/>
-        <w:t xml:space="preserve">    outer = tk.Frame(p, bg=BG)</w:t>
-        <w:br/>
-        <w:t xml:space="preserve">    outer.pack(fill="both", expand=True, padx=16, pady=6)</w:t>
-        <w:br/>
-        <w:t xml:space="preserve">    </w:t>
-        <w:br/>
-        <w:t xml:space="preserve">    if df.empty:</w:t>
-        <w:br/>
-        <w:t xml:space="preserve">        return</w:t>
-        <w:br/>
-        <w:t xml:space="preserve">        </w:t>
-        <w:br/>
-        <w:t xml:space="preserve">    # Aggregate data by hashtag, taking the first category (assuming 1-to-1 mapping)</w:t>
-        <w:br/>
-        <w:t xml:space="preserve">    ht_df = df.groupby("hashtag").agg(</w:t>
-        <w:br/>
-        <w:t xml:space="preserve">        category=("category", "first"),</w:t>
-        <w:br/>
-        <w:t xml:space="preserve">        views=("views", "sum"),</w:t>
-        <w:br/>
-        <w:t xml:space="preserve">        likes=("likes", "sum"),</w:t>
-        <w:br/>
-        <w:t xml:space="preserve">        eng=("engagement_rate", "mean"),</w:t>
-        <w:br/>
-        <w:t xml:space="preserve">        posts=("posts", "sum")</w:t>
-        <w:br/>
-        <w:t xml:space="preserve">    ).reset_index().sort_values("views", ascending=False).reset_index(drop=True)</w:t>
-        <w:br/>
-        <w:t xml:space="preserve">    </w:t>
-        <w:br/>
-        <w:t xml:space="preserve">    # ---------------------------------------------------------</w:t>
-        <w:br/>
-        <w:t xml:space="preserve">    # Left Component: Full Rankings Table</w:t>
-        <w:br/>
-        <w:t xml:space="preserve">    # ---------------------------------------------------------</w:t>
-        <w:br/>
-        <w:t xml:space="preserve">    hdrs = ["#", "HASHTAG", "CATEGORY", "VIEWS", "LIKES", "ENG%", "POSTS"]</w:t>
-        <w:br/>
-        <w:t xml:space="preserve">    cw = [4, 16, 14, 11, 11, 9, 11]</w:t>
-        <w:br/>
-        <w:t xml:space="preserve">    </w:t>
-        <w:br/>
-        <w:t xml:space="preserve">    rows = [</w:t>
-        <w:br/>
-        <w:t xml:space="preserve">        [</w:t>
-        <w:br/>
-        <w:t xml:space="preserve">            i+1, </w:t>
-        <w:br/>
-        <w:t xml:space="preserve">            r["hashtag"], </w:t>
-        <w:br/>
-        <w:t xml:space="preserve">            r["category"], </w:t>
-        <w:br/>
-        <w:t xml:space="preserve">            fmt_num(r["views"]), </w:t>
-        <w:br/>
-        <w:t xml:space="preserve">            fmt_num(r["likes"]), </w:t>
-        <w:br/>
-        <w:t xml:space="preserve">            f"{r['eng']:.2f}%", </w:t>
-        <w:br/>
-        <w:t xml:space="preserve">            fmt_num(r["posts"])</w:t>
-        <w:br/>
-        <w:t xml:space="preserve">        ] </w:t>
-        <w:br/>
-        <w:t xml:space="preserve">        for i, (_, r) in enumerate(ht_df.iterrows())</w:t>
-        <w:br/>
-        <w:t xml:space="preserve">    ]</w:t>
-        <w:br/>
-        <w:t xml:space="preserve">    </w:t>
-        <w:br/>
-        <w:t xml:space="preserve">    def colorfn(ri, ci, val):</w:t>
-        <w:br/>
-        <w:t xml:space="preserve">        if ci == 0: return MUTED</w:t>
-        <w:br/>
-        <w:t xml:space="preserve">        if ci == 2: return CATEGORY_COLORS.get(str(val), FG)</w:t>
-        <w:br/>
-        <w:t xml:space="preserve">        return FG</w:t>
-        <w:br/>
-        <w:t xml:space="preserve">        </w:t>
-        <w:br/>
-        <w:t xml:space="preserve">    scrollable_table(outer, hdrs, cw, rows, colorfn)</w:t>
-        <w:br/>
-        <w:t xml:space="preserve">    </w:t>
-        <w:br/>
-        <w:t xml:space="preserve">    # ---------------------------------------------------------</w:t>
-        <w:br/>
-        <w:t xml:space="preserve">    # Right Component: Top &amp; Bottom 10 Visualizations</w:t>
-        <w:br/>
-        <w:t xml:space="preserve">    # ---------------------------------------------------------</w:t>
-        <w:br/>
-        <w:t xml:space="preserve">    frr = tk.Frame(outer, bg=CARD, highlightbackground=ACCENT, highlightthickness=1)</w:t>
-        <w:br/>
-        <w:t xml:space="preserve">    frr.pack(side="left", fill="both", expand=True)</w:t>
-        <w:br/>
-        <w:t xml:space="preserve">    </w:t>
-        <w:br/>
-        <w:t xml:space="preserve">    fig = Figure(figsize=(6.8, 6.0), dpi=DPI)</w:t>
-        <w:br/>
-        <w:t xml:space="preserve">    fig.patch.set_facecolor(CARD)</w:t>
-        <w:br/>
-        <w:t xml:space="preserve">    </w:t>
-        <w:br/>
-        <w:t xml:space="preserve">    # Top 10 Performers</w:t>
-        <w:br/>
-        <w:t xml:space="preserve">    ax1 = fig.add_subplot(211)</w:t>
-        <w:br/>
-        <w:t xml:space="preserve">    ax1.set_facecolor(CARD)</w:t>
-        <w:br/>
-        <w:t xml:space="preserve">    t10 = ht_df.head(10).sort_values("views")</w:t>
-        <w:br/>
-        <w:t xml:space="preserve">    hbar(ax1, t10["hashtag"], t10["views"]/1e6, [WARN]*10, fs=9, bh=0.60, vlabels=False)</w:t>
-        <w:br/>
-        <w:t xml:space="preserve">    ax1.set_title("[HIGH] Top 10 Most Viewed", color=ACCENT2, fontsize=10, fontweight="bold", pad=6)</w:t>
-        <w:br/>
-        <w:t xml:space="preserve">    fix_yticks(ax1, 9)</w:t>
-        <w:br/>
-        <w:t xml:space="preserve">    </w:t>
-        <w:br/>
-        <w:t xml:space="preserve">    # Bottom 10 Performers</w:t>
-        <w:br/>
-        <w:t xml:space="preserve">    ax2 = fig.add_subplot(212)</w:t>
-        <w:br/>
-        <w:t xml:space="preserve">    ax2.set_facecolor(CARD)</w:t>
-        <w:br/>
-        <w:t xml:space="preserve">    b10 = ht_df.tail(10).sort_values("views", ascending=False)</w:t>
-        <w:br/>
-        <w:t xml:space="preserve">    hbar(ax2, b10["hashtag"], b10["views"]/1e6, [GOOD]*10, fs=9, bh=0.60, vlabels=False)</w:t>
-        <w:br/>
-        <w:t xml:space="preserve">    ax2.set_title("[LOW] Bottom 10 Least Viewed", color=ACCENT2, fontsize=10, fontweight="bold", pad=6)</w:t>
-        <w:br/>
-        <w:t xml:space="preserve">    fix_yticks(ax2, 9)</w:t>
-        <w:br/>
-        <w:t xml:space="preserve">    </w:t>
-        <w:br/>
-        <w:t xml:space="preserve">    fig.subplots_adjust(left=0.32, right=0.96, top=0.92, bottom=0.08, hspace=0.60)</w:t>
-        <w:br/>
-        <w:t xml:space="preserve">    embed(fig, frr)</w:t>
-        <w:br/>
-        <w:br/>
-        <w:br/>
-        <w:t>def page5(nb, df):</w:t>
-        <w:br/>
-        <w:t xml:space="preserve">    """</w:t>
-        <w:br/>
-        <w:t xml:space="preserve">    Builds the Heatmap &amp; Correlation Page (Page 5)</w:t>
-        <w:br/>
-        <w:t xml:space="preserve">    </w:t>
-        <w:br/>
-        <w:t xml:space="preserve">    This page focuses on statistical relationships.</w:t>
-        <w:br/>
-        <w:t xml:space="preserve">    1. A Correlation Matrix showing how numerical metrics relate.</w:t>
-        <w:br/>
-        <w:t xml:space="preserve">    2. A 2D Heatmap showing Platform vs Category engagement intensity.</w:t>
-        <w:br/>
-        <w:t xml:space="preserve">    </w:t>
-        <w:br/>
-        <w:t xml:space="preserve">    Args:</w:t>
-        <w:br/>
-        <w:t xml:space="preserve">        nb (ttk.Notebook): The parent notebook.</w:t>
-        <w:br/>
-        <w:t xml:space="preserve">        df (pd.DataFrame): The master dataset.</w:t>
-        <w:br/>
-        <w:t xml:space="preserve">    """</w:t>
-        <w:br/>
-        <w:t xml:space="preserve">    p = tk.Frame(nb, bg=BG)</w:t>
-        <w:br/>
-        <w:t xml:space="preserve">    nb.add(p, text="  Heatmap &amp; Correlation  ")</w:t>
-        <w:br/>
-        <w:t xml:space="preserve">    </w:t>
-        <w:br/>
-        <w:t xml:space="preserve">    page_header(p, "Metric Correlation &amp; Platform x Category Heatmap", </w:t>
-        <w:br/>
-        <w:t xml:space="preserve">                "Left: inter-metric correlation  |  Right: normalised engagement heatmap")</w:t>
-        <w:br/>
-        <w:t xml:space="preserve">                </w:t>
-        <w:br/>
-        <w:t xml:space="preserve">    if df.empty:</w:t>
-        <w:br/>
-        <w:t xml:space="preserve">        return</w:t>
-        <w:br/>
-        <w:t xml:space="preserve">        </w:t>
-        <w:br/>
-        <w:t xml:space="preserve">    fig = Figure(figsize=(12, 5.8), dpi=DPI)</w:t>
-        <w:br/>
-        <w:t xml:space="preserve">    fig.subplots_adjust(left=0.10, right=0.96, top=0.88, bottom=0.18, wspace=0.35)</w:t>
-        <w:br/>
-        <w:t xml:space="preserve">    fig.patch.set_facecolor(BG)</w:t>
-        <w:br/>
-        <w:t xml:space="preserve">    </w:t>
-        <w:br/>
-        <w:t xml:space="preserve">    # --- Left: Metric Correlation Matrix ---</w:t>
-        <w:br/>
-        <w:t xml:space="preserve">    cols = ["posts", "likes", "views", "comments", "shares", "engagement_rate"]</w:t>
-        <w:br/>
-        <w:t xml:space="preserve">    lbls = ["Posts", "Likes", "Views", "Comments", "Shares", "Eng Rate"]</w:t>
-        <w:br/>
-        <w:t xml:space="preserve">    </w:t>
-        <w:br/>
-        <w:t xml:space="preserve">    # Calculate Pearson correlation coefficient</w:t>
-        <w:br/>
-        <w:t xml:space="preserve">    corr = df[cols].corr()</w:t>
-        <w:br/>
-        <w:t xml:space="preserve">    </w:t>
-        <w:br/>
-        <w:t xml:space="preserve">    ax1 = fig.add_subplot(121)</w:t>
-        <w:br/>
-        <w:t xml:space="preserve">    im1 = ax1.imshow(corr.values, cmap="PuOr", vmin=-1, vmax=1, aspect="auto")</w:t>
-        <w:br/>
-        <w:t xml:space="preserve">    </w:t>
-        <w:br/>
-        <w:t xml:space="preserve">    # Set up ticks and labels</w:t>
-        <w:br/>
-        <w:t xml:space="preserve">    ax1.set_xticks(range(len(lbls)))</w:t>
-        <w:br/>
-        <w:t xml:space="preserve">    ax1.set_xticklabels(lbls, rotation=35, ha="right", fontsize=10, color=FG)</w:t>
-        <w:br/>
-        <w:t xml:space="preserve">    ax1.set_yticks(range(len(lbls)))</w:t>
-        <w:br/>
-        <w:t xml:space="preserve">    ax1.set_yticklabels(lbls, fontsize=10, color=FG)</w:t>
-        <w:br/>
-        <w:t xml:space="preserve">    </w:t>
-        <w:br/>
-        <w:t xml:space="preserve">    # Overlay correlation values text onto the matrix cells</w:t>
-        <w:br/>
-        <w:t xml:space="preserve">    cmap1 = plt.get_cmap("PuOr")</w:t>
-        <w:br/>
-        <w:t xml:space="preserve">    for i in range(len(lbls)):</w:t>
-        <w:br/>
-        <w:t xml:space="preserve">        for j in range(len(lbls)):</w:t>
-        <w:br/>
-        <w:t xml:space="preserve">            v = corr.values[i, j]</w:t>
-        <w:br/>
-        <w:t xml:space="preserve">            # Calculate appropriate text color based on cell background</w:t>
-        <w:br/>
-        <w:t xml:space="preserve">            tc = cell_tc(cmap1, (v+1)/2)</w:t>
-        <w:br/>
-        <w:t xml:space="preserve">            ax1.text(j, i, f"{v:.2f}", ha="center", va="center", </w:t>
-        <w:br/>
-        <w:t xml:space="preserve">                     fontsize=10, fontweight="bold", color=tc)</w:t>
-        <w:br/>
-        <w:t xml:space="preserve">                     </w:t>
-        <w:br/>
-        <w:t xml:space="preserve">    cb1 = fig.colorbar(im1, ax=ax1, shrink=0.80)</w:t>
-        <w:br/>
-        <w:t xml:space="preserve">    cb1.ax.yaxis.set_tick_params(color=FG, labelsize=10)</w:t>
-        <w:br/>
-        <w:t xml:space="preserve">    plt.setp(cb1.ax.yaxis.get_ticklabels(), color=FG)</w:t>
-        <w:br/>
-        <w:t xml:space="preserve">    style_ax(ax1, "Metric Correlation Matrix")</w:t>
-        <w:br/>
-        <w:t xml:space="preserve">    </w:t>
-        <w:br/>
-        <w:t xml:space="preserve">    # --- Right: Platform x Category Heatmap ---</w:t>
-        <w:br/>
-        <w:t xml:space="preserve">    # Create pivot table for 2D representation</w:t>
-        <w:br/>
-        <w:t xml:space="preserve">    pivot = df.pivot_table(index="platform", columns="category", values="engagement_rate", aggfunc="mean")</w:t>
-        <w:br/>
-        <w:t xml:space="preserve">    </w:t>
-        <w:br/>
-        <w:t xml:space="preserve">    # Normalize data using Min-Max scaling for visual colormapping</w:t>
-        <w:br/>
-        <w:t xml:space="preserve">    norm = (pivot - pivot.min()) / (pivot.max() - pivot.min())</w:t>
-        <w:br/>
-        <w:t xml:space="preserve">    </w:t>
-        <w:br/>
-        <w:t xml:space="preserve">    ax2 = fig.add_subplot(122)</w:t>
-        <w:br/>
-        <w:t xml:space="preserve">    cmap2 = plt.get_cmap("magma")</w:t>
-        <w:br/>
-        <w:t xml:space="preserve">    im2 = ax2.imshow(norm.values, cmap="magma", aspect="auto", vmin=0, vmax=1)</w:t>
-        <w:br/>
-        <w:t xml:space="preserve">    </w:t>
-        <w:br/>
-        <w:t xml:space="preserve">    # Setup axis ticks</w:t>
-        <w:br/>
-        <w:t xml:space="preserve">    ax2.set_xticks(range(len(pivot.columns)))</w:t>
-        <w:br/>
-        <w:t xml:space="preserve">    ax2.set_xticklabels([trunc(c, 9) for c in pivot.columns], fontsize=9, color=FG, rotation=35, ha="right")</w:t>
-        <w:br/>
-        <w:t xml:space="preserve">    ax2.set_yticks(range(len(pivot.index)))</w:t>
-        <w:br/>
-        <w:t xml:space="preserve">    ax2.set_yticklabels(pivot.index, fontsize=10, color=FG)</w:t>
-        <w:br/>
-        <w:t xml:space="preserve">    </w:t>
-        <w:br/>
-        <w:t xml:space="preserve">    # Overlay engagement rate values text</w:t>
-        <w:br/>
-        <w:t xml:space="preserve">    for i in range(len(pivot.index)):</w:t>
-        <w:br/>
-        <w:t xml:space="preserve">        for j in range(len(pivot.columns)):</w:t>
-        <w:br/>
-        <w:t xml:space="preserve">            rv = pivot.values[i, j]</w:t>
-        <w:br/>
-        <w:t xml:space="preserve">            nv = norm.values[i, j]</w:t>
-        <w:br/>
-        <w:t xml:space="preserve">            </w:t>
-        <w:br/>
-        <w:t xml:space="preserve">            # Handle empty cells (NaN) gracefully</w:t>
-        <w:br/>
-        <w:t xml:space="preserve">            txt = "nan" if (isinstance(rv, float) and np.isnan(rv)) else f"{rv:.1f}"</w:t>
-        <w:br/>
-        <w:t xml:space="preserve">            tc = cell_tc(cmap2, None if (isinstance(nv, float) and np.isnan(nv)) else nv)</w:t>
-        <w:br/>
-        <w:t xml:space="preserve">            </w:t>
-        <w:br/>
-        <w:t xml:space="preserve">            ax2.text(j, i, txt, ha="center", va="center", fontsize=9, color=tc)</w:t>
-        <w:br/>
-        <w:t xml:space="preserve">            </w:t>
-        <w:br/>
-        <w:t xml:space="preserve">    cb2 = fig.colorbar(im2, ax=ax2, shrink=0.80)</w:t>
-        <w:br/>
-        <w:t xml:space="preserve">    cb2.ax.yaxis.set_tick_params(color=FG, labelsize=10)</w:t>
-        <w:br/>
-        <w:t xml:space="preserve">    plt.setp(cb2.ax.yaxis.get_ticklabels(), color=FG)</w:t>
-        <w:br/>
-        <w:t xml:space="preserve">    style_ax(ax2, "Platform x Category Engagement")</w:t>
-        <w:br/>
-        <w:t xml:space="preserve">    </w:t>
-        <w:br/>
-        <w:t xml:space="preserve">    embed(fig, p)</w:t>
-        <w:br/>
-        <w:br/>
-        <w:br/>
-        <w:t># ==============================================================================</w:t>
-        <w:br/>
-        <w:t># MAIN APPLICATION ASSEMBLY AND LAUNCH</w:t>
-        <w:br/>
-        <w:t># ==============================================================================</w:t>
-        <w:br/>
-        <w:br/>
-        <w:t>def build_dashboard(root, df):</w:t>
-        <w:br/>
-        <w:t xml:space="preserve">    """</w:t>
-        <w:br/>
-        <w:t xml:space="preserve">    Assemble the complete dashboard structure including the main notebook and all pages.</w:t>
-        <w:br/>
-        <w:t xml:space="preserve">    This acts as the orchestrator combining all previous UI functions.</w:t>
-        <w:br/>
-        <w:t xml:space="preserve">    </w:t>
-        <w:br/>
-        <w:t xml:space="preserve">    Args:</w:t>
-        <w:br/>
-        <w:t xml:space="preserve">        root (tk.Tk): Main application window.</w:t>
-        <w:br/>
-        <w:t xml:space="preserve">        df (pd.DataFrame): Dataset to visualize.</w:t>
-        <w:br/>
-        <w:t xml:space="preserve">    """</w:t>
-        <w:br/>
-        <w:t xml:space="preserve">    </w:t>
-        <w:br/>
-        <w:t xml:space="preserve">    # --- Top Application Header ---</w:t>
-        <w:br/>
-        <w:t xml:space="preserve">    hdr = tk.Frame(root, bg=CARD, highlightbackground=ACCENT, highlightthickness=2)</w:t>
-        <w:br/>
-        <w:t xml:space="preserve">    hdr.pack(fill="x", padx=16, pady=(10, 4))</w:t>
-        <w:br/>
-        <w:t xml:space="preserve">    </w:t>
-        <w:br/>
-        <w:t xml:space="preserve">    lh = tk.Frame(hdr, bg=CARD)</w:t>
-        <w:br/>
-        <w:t xml:space="preserve">    lh.pack(side="left", padx=14, pady=10)</w:t>
-        <w:br/>
-        <w:t xml:space="preserve">    tk.Label(</w:t>
-        <w:br/>
-        <w:t xml:space="preserve">        lh, text="Social Media Trends Analytics Dashboard", </w:t>
-        <w:br/>
-        <w:t xml:space="preserve">        bg=CARD, fg=FG, font=("Segoe UI", 22, "bold")</w:t>
-        <w:br/>
-        <w:t xml:space="preserve">    ).pack(anchor="w")</w:t>
-        <w:br/>
-        <w:t xml:space="preserve">             </w:t>
-        <w:br/>
-        <w:t xml:space="preserve">    # Prepare dynamic subtext based on dataset dimensions</w:t>
-        <w:br/>
-        <w:t xml:space="preserve">    try:</w:t>
-        <w:br/>
-        <w:t xml:space="preserve">        stats_str = (</w:t>
-        <w:br/>
-        <w:t xml:space="preserve">            f"{len(df)} Records  |  "</w:t>
-        <w:br/>
-        <w:t xml:space="preserve">            f"{df['platform'].nunique()} Platforms  |  "</w:t>
-        <w:br/>
-        <w:t xml:space="preserve">            f"{df['category'].nunique()} Categories  |  "</w:t>
-        <w:br/>
-        <w:t xml:space="preserve">            f"{df['country'].nunique()} Countries"</w:t>
-        <w:br/>
-        <w:t xml:space="preserve">        )</w:t>
-        <w:br/>
-        <w:t xml:space="preserve">    except Exception:</w:t>
-        <w:br/>
-        <w:t xml:space="preserve">        stats_str = "Data loading error - using default schema"</w:t>
-        <w:br/>
-        <w:t xml:space="preserve">        </w:t>
-        <w:br/>
-        <w:t xml:space="preserve">    tk.Label(lh, bg=CARD, fg=MUTED, font=("Segoe UI", 10), text=stats_str).pack(anchor="w")</w:t>
-        <w:br/>
-        <w:t xml:space="preserve">    </w:t>
-        <w:br/>
-        <w:t xml:space="preserve">    # Right side author block</w:t>
-        <w:br/>
-        <w:t xml:space="preserve">    rh = tk.Frame(hdr, bg=CARD)</w:t>
-        <w:br/>
-        <w:t xml:space="preserve">    rh.pack(side="right", padx=14, pady=10)</w:t>
-        <w:br/>
-        <w:t xml:space="preserve">    </w:t>
-        <w:br/>
-        <w:t xml:space="preserve">    tk.Label(rh, text="DVA Assignment 2", bg=CARD, fg=ACCENT, font=("Segoe UI", 12, "bold")).pack(anchor="e")</w:t>
-        <w:br/>
-        <w:t xml:space="preserve">    tk.Label(rh, text="Akshat Tripathi | 04914202023", bg=CARD, fg=ACCENT2, font=("Segoe UI", 10, "bold")).pack(anchor="e")</w:t>
-        <w:br/>
-        <w:t xml:space="preserve">    tk.Label(rh, text="IPU BCA 6th Semester", bg=CARD, fg=MUTED, font=("Segoe UI", 9)).pack(anchor="e")</w:t>
-        <w:br/>
-        <w:br/>
-        <w:t xml:space="preserve">    # --- Notebook (Tabbed Interface) Setup ---</w:t>
-        <w:br/>
-        <w:t xml:space="preserve">    st = ttk.Style()</w:t>
-        <w:br/>
-        <w:t xml:space="preserve">    st.theme_use("default")</w:t>
-        <w:br/>
-        <w:t xml:space="preserve">    </w:t>
-        <w:br/>
-        <w:t xml:space="preserve">    # Configure colors and fonts for notebook tabs to match the dark theme</w:t>
-        <w:br/>
-        <w:t xml:space="preserve">    st.configure("TNotebook", background=BG, borderwidth=0)</w:t>
-        <w:br/>
-        <w:t xml:space="preserve">    st.configure("TNotebook.Tab", background=CARD, foreground=FG, padding=(28, 11), font=("Segoe UI", 11, "bold"))</w:t>
-        <w:br/>
-        <w:t xml:space="preserve">    st.map("TNotebook.Tab", background=[("selected", "#B983FF")], foreground=[("selected", "#13111C")])</w:t>
-        <w:br/>
-        <w:t xml:space="preserve">    </w:t>
-        <w:br/>
-        <w:t xml:space="preserve">    nb = ttk.Notebook(root, style="TNotebook")</w:t>
-        <w:br/>
-        <w:t xml:space="preserve">    nb.pack(fill="both", expand=True, padx=12, pady=8)</w:t>
-        <w:br/>
-        <w:t xml:space="preserve">    </w:t>
-        <w:br/>
-        <w:t xml:space="preserve">    # Initialize and append all 5 analytical pages</w:t>
-        <w:br/>
-        <w:t xml:space="preserve">    page1(nb, df)</w:t>
-        <w:br/>
-        <w:t xml:space="preserve">    page2(nb, df)</w:t>
-        <w:br/>
-        <w:t xml:space="preserve">    page3(nb, df)</w:t>
-        <w:br/>
-        <w:t xml:space="preserve">    page4(nb, df)</w:t>
-        <w:br/>
-        <w:t xml:space="preserve">    page5(nb, df)</w:t>
-        <w:br/>
-        <w:t xml:space="preserve">    </w:t>
-        <w:br/>
-        <w:br/>
-        <w:br/>
-        <w:t>def main():</w:t>
-        <w:br/>
-        <w:t xml:space="preserve">    """</w:t>
-        <w:br/>
-        <w:t xml:space="preserve">    Application entry point.</w:t>
-        <w:br/>
-        <w:t xml:space="preserve">    Initializes the Tkinter main loop, configures the base window,</w:t>
-        <w:br/>
-        <w:t xml:space="preserve">    loads the data, and triggers the dashboard build process.</w:t>
-        <w:br/>
-        <w:t xml:space="preserve">    """</w:t>
-        <w:br/>
-        <w:t xml:space="preserve">    </w:t>
-        <w:br/>
-        <w:t xml:space="preserve">    # Initialize main window</w:t>
-        <w:br/>
-        <w:t xml:space="preserve">    root = tk.Tk()</w:t>
-        <w:br/>
-        <w:t xml:space="preserve">    root.title("Social Media Trends Dashboard - Akshat Tripathi | 04914202023")</w:t>
-        <w:br/>
-        <w:t xml:space="preserve">    root.configure(bg=BG)</w:t>
-        <w:br/>
-        <w:t xml:space="preserve">    </w:t>
-        <w:br/>
-        <w:t xml:space="preserve">    # Attempt to maximize window based on OS capabilities</w:t>
-        <w:br/>
-        <w:t xml:space="preserve">    try:</w:t>
-        <w:br/>
-        <w:t xml:space="preserve">        root.state("zoomed") # Works on Windows</w:t>
-        <w:br/>
-        <w:t xml:space="preserve">    except tk.TclError:</w:t>
-        <w:br/>
-        <w:t xml:space="preserve">        try:</w:t>
-        <w:br/>
-        <w:t xml:space="preserve">            root.attributes('-zoomed', True) # Works on some Linux environments</w:t>
-        <w:br/>
-        <w:t xml:space="preserve">        except Exception as e:</w:t>
-        <w:br/>
-        <w:t xml:space="preserve">        </w:t>
         <w:br/>
         <w:t xml:space="preserve">    # Load dataset</w:t>
         <w:br/>

</xml_diff>